<commit_message>
Alcuni aggiustamenti nei casi d'uso e nel RAD
</commit_message>
<xml_diff>
--- a/Documents/02_NovaBiblioteca_RAD.docx
+++ b/Documents/02_NovaBiblioteca_RAD.docx
@@ -426,7 +426,7 @@
         <w:rPr>
           <w:sz w:val="32"/>
         </w:rPr>
-        <w:t>5</w:t>
+        <w:t>6</w:t>
       </w:r>
       <w:r>
         <w:rPr>
@@ -1432,7 +1432,14 @@
                 <w:rFonts w:asciiTheme="minorHAnsi" w:hAnsiTheme="minorHAnsi"/>
                 <w:sz w:val="20"/>
               </w:rPr>
-              <w:t>23</w:t>
+              <w:t>2</w:t>
+            </w:r>
+            <w:r>
+              <w:rPr>
+                <w:rFonts w:asciiTheme="minorHAnsi" w:hAnsiTheme="minorHAnsi"/>
+                <w:sz w:val="20"/>
+              </w:rPr>
+              <w:t>6</w:t>
             </w:r>
             <w:r>
               <w:rPr>
@@ -2059,7 +2066,6 @@
     </w:tbl>
     <w:p>
       <w:pPr>
-        <w:jc w:val="center"/>
         <w:rPr>
           <w:rFonts w:asciiTheme="minorHAnsi" w:hAnsiTheme="minorHAnsi"/>
           <w:b/>
@@ -2086,27 +2092,9 @@
         <w:pStyle w:val="Intestazioneindice"/>
         <w:rPr>
           <w:rFonts w:asciiTheme="minorHAnsi" w:hAnsiTheme="minorHAnsi"/>
-        </w:rPr>
-      </w:pPr>
-    </w:p>
-    <w:p>
-      <w:pPr>
-        <w:pStyle w:val="Intestazioneindice"/>
-        <w:rPr>
-          <w:rFonts w:asciiTheme="minorHAnsi" w:hAnsiTheme="minorHAnsi"/>
-        </w:rPr>
-      </w:pPr>
-    </w:p>
-    <w:p>
-      <w:pPr>
-        <w:pStyle w:val="Intestazioneindice"/>
-        <w:rPr>
-          <w:rFonts w:asciiTheme="minorHAnsi" w:hAnsiTheme="minorHAnsi"/>
-        </w:rPr>
-      </w:pPr>
-      <w:r>
-        <w:br w:type="page"/>
-      </w:r>
+          <w:lang w:val="en-US"/>
+        </w:rPr>
+      </w:pPr>
       <w:proofErr w:type="spellStart"/>
       <w:r>
         <w:rPr>
@@ -2137,6 +2125,7 @@
           <w:rFonts w:asciiTheme="minorHAnsi" w:eastAsiaTheme="minorEastAsia" w:hAnsiTheme="minorHAnsi" w:cstheme="minorBidi"/>
           <w:noProof/>
           <w:kern w:val="2"/>
+          <w:lang w:val="en-US"/>
           <w14:ligatures w14:val="standardContextual"/>
         </w:rPr>
       </w:pPr>
@@ -2163,6 +2152,7 @@
         <w:rPr>
           <w:rFonts w:asciiTheme="minorHAnsi" w:hAnsiTheme="minorHAnsi"/>
           <w:noProof/>
+          <w:lang w:val="en-US"/>
         </w:rPr>
         <w:t>1.</w:t>
       </w:r>
@@ -2171,6 +2161,7 @@
           <w:rFonts w:asciiTheme="minorHAnsi" w:eastAsiaTheme="minorEastAsia" w:hAnsiTheme="minorHAnsi" w:cstheme="minorBidi"/>
           <w:noProof/>
           <w:kern w:val="2"/>
+          <w:lang w:val="en-US"/>
           <w14:ligatures w14:val="standardContextual"/>
         </w:rPr>
         <w:tab/>
@@ -2179,12 +2170,14 @@
         <w:rPr>
           <w:rFonts w:asciiTheme="minorHAnsi" w:hAnsiTheme="minorHAnsi"/>
           <w:noProof/>
+          <w:lang w:val="en-US"/>
         </w:rPr>
         <w:t>Introduzione</w:t>
       </w:r>
       <w:r>
         <w:rPr>
           <w:noProof/>
+          <w:lang w:val="en-US"/>
         </w:rPr>
         <w:tab/>
       </w:r>
@@ -2197,6 +2190,7 @@
       <w:r>
         <w:rPr>
           <w:noProof/>
+          <w:lang w:val="en-US"/>
         </w:rPr>
         <w:instrText xml:space="preserve"> PAGEREF _Toc243846646 \h </w:instrText>
       </w:r>
@@ -2214,6 +2208,7 @@
       <w:r>
         <w:rPr>
           <w:noProof/>
+          <w:lang w:val="en-US"/>
         </w:rPr>
         <w:t>5</w:t>
       </w:r>
@@ -2234,6 +2229,7 @@
           <w:rFonts w:asciiTheme="minorHAnsi" w:eastAsiaTheme="minorEastAsia" w:hAnsiTheme="minorHAnsi" w:cstheme="minorBidi"/>
           <w:noProof/>
           <w:kern w:val="2"/>
+          <w:lang w:val="en-US"/>
           <w14:ligatures w14:val="standardContextual"/>
         </w:rPr>
       </w:pPr>
@@ -2241,6 +2237,7 @@
         <w:rPr>
           <w:rFonts w:ascii="Aptos" w:hAnsi="Aptos"/>
           <w:noProof/>
+          <w:lang w:val="en-US"/>
         </w:rPr>
         <w:t>1.1.</w:t>
       </w:r>
@@ -2249,6 +2246,7 @@
           <w:rFonts w:asciiTheme="minorHAnsi" w:eastAsiaTheme="minorEastAsia" w:hAnsiTheme="minorHAnsi" w:cstheme="minorBidi"/>
           <w:noProof/>
           <w:kern w:val="2"/>
+          <w:lang w:val="en-US"/>
           <w14:ligatures w14:val="standardContextual"/>
         </w:rPr>
         <w:tab/>
@@ -2257,12 +2255,14 @@
         <w:rPr>
           <w:rFonts w:ascii="Aptos" w:hAnsi="Aptos"/>
           <w:noProof/>
+          <w:lang w:val="en-US"/>
         </w:rPr>
         <w:t>Purpose of the system</w:t>
       </w:r>
       <w:r>
         <w:rPr>
           <w:noProof/>
+          <w:lang w:val="en-US"/>
         </w:rPr>
         <w:tab/>
       </w:r>
@@ -2275,6 +2275,7 @@
       <w:r>
         <w:rPr>
           <w:noProof/>
+          <w:lang w:val="en-US"/>
         </w:rPr>
         <w:instrText xml:space="preserve"> PAGEREF _Toc243846647 \h </w:instrText>
       </w:r>
@@ -2292,6 +2293,7 @@
       <w:r>
         <w:rPr>
           <w:noProof/>
+          <w:lang w:val="en-US"/>
         </w:rPr>
         <w:t>5</w:t>
       </w:r>
@@ -2312,6 +2314,7 @@
           <w:rFonts w:asciiTheme="minorHAnsi" w:eastAsiaTheme="minorEastAsia" w:hAnsiTheme="minorHAnsi" w:cstheme="minorBidi"/>
           <w:noProof/>
           <w:kern w:val="2"/>
+          <w:lang w:val="en-US"/>
           <w14:ligatures w14:val="standardContextual"/>
         </w:rPr>
       </w:pPr>
@@ -2319,6 +2322,7 @@
         <w:rPr>
           <w:rFonts w:asciiTheme="minorHAnsi" w:hAnsiTheme="minorHAnsi"/>
           <w:noProof/>
+          <w:lang w:val="en-US"/>
         </w:rPr>
         <w:t>1.2.</w:t>
       </w:r>
@@ -2327,6 +2331,7 @@
           <w:rFonts w:asciiTheme="minorHAnsi" w:eastAsiaTheme="minorEastAsia" w:hAnsiTheme="minorHAnsi" w:cstheme="minorBidi"/>
           <w:noProof/>
           <w:kern w:val="2"/>
+          <w:lang w:val="en-US"/>
           <w14:ligatures w14:val="standardContextual"/>
         </w:rPr>
         <w:tab/>
@@ -2335,12 +2340,14 @@
         <w:rPr>
           <w:rFonts w:asciiTheme="minorHAnsi" w:hAnsiTheme="minorHAnsi"/>
           <w:noProof/>
+          <w:lang w:val="en-US"/>
         </w:rPr>
         <w:t>Scope of the system</w:t>
       </w:r>
       <w:r>
         <w:rPr>
           <w:noProof/>
+          <w:lang w:val="en-US"/>
         </w:rPr>
         <w:tab/>
       </w:r>
@@ -2353,6 +2360,7 @@
       <w:r>
         <w:rPr>
           <w:noProof/>
+          <w:lang w:val="en-US"/>
         </w:rPr>
         <w:instrText xml:space="preserve"> PAGEREF _Toc243846648 \h </w:instrText>
       </w:r>
@@ -2370,6 +2378,7 @@
       <w:r>
         <w:rPr>
           <w:noProof/>
+          <w:lang w:val="en-US"/>
         </w:rPr>
         <w:t>5</w:t>
       </w:r>
@@ -5521,7 +5530,19 @@
         <w:rPr>
           <w:rFonts w:asciiTheme="minorHAnsi" w:hAnsiTheme="minorHAnsi"/>
         </w:rPr>
-        <w:t xml:space="preserve"> per lettore, impededno prenotazioni e prestiti durante una sospensione e segnalando all’operatore le restituzioni in ritardo.</w:t>
+        <w:t xml:space="preserve"> per lettore, impeden</w:t>
+      </w:r>
+      <w:r>
+        <w:rPr>
+          <w:rFonts w:asciiTheme="minorHAnsi" w:hAnsiTheme="minorHAnsi"/>
+        </w:rPr>
+        <w:t>d</w:t>
+      </w:r>
+      <w:r>
+        <w:rPr>
+          <w:rFonts w:asciiTheme="minorHAnsi" w:hAnsiTheme="minorHAnsi"/>
+        </w:rPr>
+        <w:t>o prenotazioni e prestiti durante una sospensione e segnalando all’operatore le restituzioni in ritardo.</w:t>
       </w:r>
       <w:r>
         <w:rPr>
@@ -5758,7 +5779,23 @@
           <w:i w:val="0"/>
           <w:iCs w:val="0"/>
         </w:rPr>
-        <w:t>Defintions, acronyms, and abbreviations</w:t>
+        <w:t>Defin</w:t>
+      </w:r>
+      <w:r>
+        <w:rPr>
+          <w:rFonts w:asciiTheme="minorHAnsi" w:hAnsiTheme="minorHAnsi"/>
+          <w:i w:val="0"/>
+          <w:iCs w:val="0"/>
+        </w:rPr>
+        <w:t>i</w:t>
+      </w:r>
+      <w:r>
+        <w:rPr>
+          <w:rFonts w:asciiTheme="minorHAnsi" w:hAnsiTheme="minorHAnsi"/>
+          <w:i w:val="0"/>
+          <w:iCs w:val="0"/>
+        </w:rPr>
+        <w:t>tions, acronyms, and abbreviations</w:t>
       </w:r>
       <w:bookmarkEnd w:id="4"/>
     </w:p>
@@ -6405,7 +6442,19 @@
               <w:rPr>
                 <w:rFonts w:asciiTheme="minorHAnsi" w:hAnsiTheme="minorHAnsi"/>
               </w:rPr>
-              <w:t>, è un numero standard internazione che identifica in modo unico e duraturo un libro o prodotto editoriale.</w:t>
+              <w:t>, è un numero standard internazion</w:t>
+            </w:r>
+            <w:r>
+              <w:rPr>
+                <w:rFonts w:asciiTheme="minorHAnsi" w:hAnsiTheme="minorHAnsi"/>
+              </w:rPr>
+              <w:t>al</w:t>
+            </w:r>
+            <w:r>
+              <w:rPr>
+                <w:rFonts w:asciiTheme="minorHAnsi" w:hAnsiTheme="minorHAnsi"/>
+              </w:rPr>
+              <w:t>e che identifica in modo unico e duraturo un libro o prodotto editoriale.</w:t>
             </w:r>
           </w:p>
         </w:tc>
@@ -6513,7 +6562,7 @@
               <w:rPr>
                 <w:rFonts w:asciiTheme="minorHAnsi" w:hAnsiTheme="minorHAnsi"/>
               </w:rPr>
-              <w:t>, che è una sequenza di caratteri che identifica univocamente l’indirizzo di una risorsa su una rete di computer, tipicamente presente su un host server e resa accessibile a un client.</w:t>
+              <w:t>, è una sequenza di caratteri che identifica univocamente l’indirizzo di una risorsa su una rete di computer, tipicamente presente su un host server e resa accessibile a un client.</w:t>
             </w:r>
           </w:p>
         </w:tc>
@@ -6557,7 +6606,19 @@
         <w:rPr>
           <w:rFonts w:asciiTheme="minorHAnsi" w:hAnsiTheme="minorHAnsi"/>
         </w:rPr>
-        <w:t>[1] Regolamento (UE) 2016/679 del Parlamento europeo e del Consiglio, del aprile 2016 (GDPR).</w:t>
+        <w:t>[1] Regolamento (UE) 2016/679 del Parlamento europeo e del Consiglio, del</w:t>
+      </w:r>
+      <w:r>
+        <w:rPr>
+          <w:rFonts w:asciiTheme="minorHAnsi" w:hAnsiTheme="minorHAnsi"/>
+        </w:rPr>
+        <w:t>l’</w:t>
+      </w:r>
+      <w:r>
+        <w:rPr>
+          <w:rFonts w:asciiTheme="minorHAnsi" w:hAnsiTheme="minorHAnsi"/>
+        </w:rPr>
+        <w:t>aprile 2016 (GDPR).</w:t>
       </w:r>
     </w:p>
     <w:p>
@@ -7621,7 +7682,7 @@
         <w:rPr>
           <w:rFonts w:asciiTheme="minorHAnsi" w:hAnsiTheme="minorHAnsi"/>
         </w:rPr>
-        <w:t>Un operatore può registrare un lettore inserendo codice fiscale, nome, cognome ed e-mail. Il sistema deve creare l’account del lettore dopo la validazione dei dati, generare una password temporanea e richiedere al primo accesso di impostarne una nuova.</w:t>
+        <w:t>Un operatore può registrare un lettore inserendo codice fiscale, nome, cognome ed e-mail. Il sistema deve creare l’account del lettore dopo la validazione dei dati, generare una password temporanea.</w:t>
       </w:r>
     </w:p>
     <w:p>
@@ -7669,7 +7730,13 @@
         <w:rPr>
           <w:rFonts w:asciiTheme="minorHAnsi" w:hAnsiTheme="minorHAnsi"/>
         </w:rPr>
-        <w:t>I lettori registrati e gli operatori devono poter accedere mediante e-mail e password e terminare la propria sessione tramite una funzionalità di logout.</w:t>
+        <w:t>I lettori registrati e gli operatori devono poter accedere mediante e-mail e password.</w:t>
+      </w:r>
+      <w:r>
+        <w:rPr>
+          <w:rFonts w:asciiTheme="minorHAnsi" w:hAnsiTheme="minorHAnsi"/>
+        </w:rPr>
+        <w:t xml:space="preserve"> Al primo accesso, o in seguito ad una richiesta di reset della password, sarà richiesto a lettore di inserire una nuova password.</w:t>
       </w:r>
     </w:p>
     <w:p>
@@ -7695,6 +7762,58 @@
           <w:b/>
           <w:bCs/>
         </w:rPr>
+        <w:t>FR3 – Logout</w:t>
+      </w:r>
+    </w:p>
+    <w:p>
+      <w:pPr>
+        <w:jc w:val="both"/>
+        <w:rPr>
+          <w:rFonts w:asciiTheme="minorHAnsi" w:hAnsiTheme="minorHAnsi"/>
+        </w:rPr>
+      </w:pPr>
+      <w:r>
+        <w:rPr>
+          <w:rFonts w:asciiTheme="minorHAnsi" w:hAnsiTheme="minorHAnsi"/>
+        </w:rPr>
+        <w:t>I lettori registrati e gli operatori devono poter</w:t>
+      </w:r>
+      <w:r>
+        <w:rPr>
+          <w:rFonts w:asciiTheme="minorHAnsi" w:hAnsiTheme="minorHAnsi"/>
+        </w:rPr>
+        <w:t xml:space="preserve"> terminare la propria sessione tramite una funzionalità di logout</w:t>
+      </w:r>
+      <w:r>
+        <w:rPr>
+          <w:rFonts w:asciiTheme="minorHAnsi" w:hAnsiTheme="minorHAnsi"/>
+        </w:rPr>
+        <w:t>.</w:t>
+      </w:r>
+    </w:p>
+    <w:p>
+      <w:pPr>
+        <w:jc w:val="both"/>
+        <w:rPr>
+          <w:rFonts w:asciiTheme="minorHAnsi" w:hAnsiTheme="minorHAnsi"/>
+        </w:rPr>
+      </w:pPr>
+    </w:p>
+    <w:p>
+      <w:pPr>
+        <w:jc w:val="both"/>
+        <w:rPr>
+          <w:rFonts w:asciiTheme="minorHAnsi" w:hAnsiTheme="minorHAnsi"/>
+          <w:b/>
+          <w:bCs/>
+        </w:rPr>
+      </w:pPr>
+      <w:r>
+        <w:rPr>
+          <w:rFonts w:asciiTheme="minorHAnsi" w:hAnsiTheme="minorHAnsi"/>
+          <w:b/>
+          <w:bCs/>
+        </w:rPr>
         <w:t>FR</w:t>
       </w:r>
       <w:r>
@@ -7703,7 +7822,15 @@
           <w:b/>
           <w:bCs/>
         </w:rPr>
-        <w:t>3 – Consultazione del catalogo</w:t>
+        <w:t>4</w:t>
+      </w:r>
+      <w:r>
+        <w:rPr>
+          <w:rFonts w:asciiTheme="minorHAnsi" w:hAnsiTheme="minorHAnsi"/>
+          <w:b/>
+          <w:bCs/>
+        </w:rPr>
+        <w:t xml:space="preserve"> – Consultazione del catalogo</w:t>
       </w:r>
     </w:p>
     <w:p>
@@ -7751,7 +7878,15 @@
           <w:b/>
           <w:bCs/>
         </w:rPr>
-        <w:t>4 – Visualizzazione dei dettagli dell’edizione</w:t>
+        <w:t>5</w:t>
+      </w:r>
+      <w:r>
+        <w:rPr>
+          <w:rFonts w:asciiTheme="minorHAnsi" w:hAnsiTheme="minorHAnsi"/>
+          <w:b/>
+          <w:bCs/>
+        </w:rPr>
+        <w:t xml:space="preserve"> – Visualizzazione dei dettagli dell’edizione</w:t>
       </w:r>
     </w:p>
     <w:p>
@@ -7799,7 +7934,15 @@
           <w:b/>
           <w:bCs/>
         </w:rPr>
-        <w:t>5 – Prenotazione di una copia</w:t>
+        <w:t>6</w:t>
+      </w:r>
+      <w:r>
+        <w:rPr>
+          <w:rFonts w:asciiTheme="minorHAnsi" w:hAnsiTheme="minorHAnsi"/>
+          <w:b/>
+          <w:bCs/>
+        </w:rPr>
+        <w:t xml:space="preserve"> – Prenotazione di una copia</w:t>
       </w:r>
     </w:p>
     <w:p>
@@ -7859,7 +8002,15 @@
           <w:b/>
           <w:bCs/>
         </w:rPr>
-        <w:t>6 – Visualizzazione e gestione delle prenotazioni</w:t>
+        <w:t>7</w:t>
+      </w:r>
+      <w:r>
+        <w:rPr>
+          <w:rFonts w:asciiTheme="minorHAnsi" w:hAnsiTheme="minorHAnsi"/>
+          <w:b/>
+          <w:bCs/>
+        </w:rPr>
+        <w:t xml:space="preserve"> – Visualizzazione e gestione delle prenotazioni</w:t>
       </w:r>
     </w:p>
     <w:p>
@@ -7907,7 +8058,15 @@
           <w:b/>
           <w:bCs/>
         </w:rPr>
-        <w:t>7 – Ricerca delle informazioni di un lettore</w:t>
+        <w:t>8</w:t>
+      </w:r>
+      <w:r>
+        <w:rPr>
+          <w:rFonts w:asciiTheme="minorHAnsi" w:hAnsiTheme="minorHAnsi"/>
+          <w:b/>
+          <w:bCs/>
+        </w:rPr>
+        <w:t xml:space="preserve"> – Ricerca delle informazioni di un lettore</w:t>
       </w:r>
     </w:p>
     <w:p>
@@ -7955,7 +8114,15 @@
           <w:b/>
           <w:bCs/>
         </w:rPr>
-        <w:t>8 – Registrazione del prestito</w:t>
+        <w:t>9</w:t>
+      </w:r>
+      <w:r>
+        <w:rPr>
+          <w:rFonts w:asciiTheme="minorHAnsi" w:hAnsiTheme="minorHAnsi"/>
+          <w:b/>
+          <w:bCs/>
+        </w:rPr>
+        <w:t xml:space="preserve"> – Registrazione del prestito</w:t>
       </w:r>
     </w:p>
     <w:p>
@@ -7995,7 +8162,14 @@
         <w:rPr>
           <w:rFonts w:asciiTheme="minorHAnsi" w:hAnsiTheme="minorHAnsi"/>
         </w:rPr>
-        <w:t>In caso di prenotazione online, il sistema deve verificare che la prenotazione sia attiva e associata al lettore e alla copia da consegnare.</w:t>
+        <w:t xml:space="preserve">In caso di prenotazione online, il sistema deve verificare che la prenotazione sia attiva e </w:t>
+      </w:r>
+      <w:r>
+        <w:rPr>
+          <w:rFonts w:asciiTheme="minorHAnsi" w:hAnsiTheme="minorHAnsi"/>
+        </w:rPr>
+        <w:lastRenderedPageBreak/>
+        <w:t>associata al lettore e alla copia da consegnare.</w:t>
       </w:r>
     </w:p>
     <w:p>
@@ -8046,7 +8220,6 @@
           <w:b/>
           <w:bCs/>
         </w:rPr>
-        <w:lastRenderedPageBreak/>
         <w:t>FR</w:t>
       </w:r>
       <w:r>
@@ -8055,7 +8228,15 @@
           <w:b/>
           <w:bCs/>
         </w:rPr>
-        <w:t>9 – Registrazione della restituzione</w:t>
+        <w:t>10</w:t>
+      </w:r>
+      <w:r>
+        <w:rPr>
+          <w:rFonts w:asciiTheme="minorHAnsi" w:hAnsiTheme="minorHAnsi"/>
+          <w:b/>
+          <w:bCs/>
+        </w:rPr>
+        <w:t xml:space="preserve"> – Registrazione della restituzione</w:t>
       </w:r>
     </w:p>
     <w:p>
@@ -8103,7 +8284,31 @@
           <w:b/>
           <w:bCs/>
         </w:rPr>
-        <w:t>10 – Modifica del catalogo</w:t>
+        <w:t>1</w:t>
+      </w:r>
+      <w:r>
+        <w:rPr>
+          <w:rFonts w:asciiTheme="minorHAnsi" w:hAnsiTheme="minorHAnsi"/>
+          <w:b/>
+          <w:bCs/>
+        </w:rPr>
+        <w:t>1</w:t>
+      </w:r>
+      <w:r>
+        <w:rPr>
+          <w:rFonts w:asciiTheme="minorHAnsi" w:hAnsiTheme="minorHAnsi"/>
+          <w:b/>
+          <w:bCs/>
+        </w:rPr>
+        <w:t xml:space="preserve"> – </w:t>
+      </w:r>
+      <w:r>
+        <w:rPr>
+          <w:rFonts w:asciiTheme="minorHAnsi" w:hAnsiTheme="minorHAnsi"/>
+          <w:b/>
+          <w:bCs/>
+        </w:rPr>
+        <w:t>Aggiunta e rimozione edizioni</w:t>
       </w:r>
     </w:p>
     <w:p>
@@ -8117,19 +8322,25 @@
         <w:rPr>
           <w:rFonts w:asciiTheme="minorHAnsi" w:hAnsiTheme="minorHAnsi"/>
         </w:rPr>
-        <w:t>Un operatore deve poter modificare il catalogo, aggiungendo o rimuovendo copie</w:t>
-      </w:r>
-      <w:r>
-        <w:rPr>
-          <w:rFonts w:asciiTheme="minorHAnsi" w:hAnsiTheme="minorHAnsi"/>
-        </w:rPr>
-        <w:t xml:space="preserve"> e aggiungendo o modificando edizioni,</w:t>
-      </w:r>
-      <w:r>
-        <w:rPr>
-          <w:rFonts w:asciiTheme="minorHAnsi" w:hAnsiTheme="minorHAnsi"/>
-        </w:rPr>
-        <w:t xml:space="preserve"> mantenendo aggiornate le informazioni consultabili.</w:t>
+        <w:t xml:space="preserve">Un operatore deve poter </w:t>
+      </w:r>
+      <w:r>
+        <w:rPr>
+          <w:rFonts w:asciiTheme="minorHAnsi" w:hAnsiTheme="minorHAnsi"/>
+        </w:rPr>
+        <w:t>aggiungere e rimuovere edizioni, mantene</w:t>
+      </w:r>
+      <w:r>
+        <w:rPr>
+          <w:rFonts w:asciiTheme="minorHAnsi" w:hAnsiTheme="minorHAnsi"/>
+        </w:rPr>
+        <w:t>n</w:t>
+      </w:r>
+      <w:r>
+        <w:rPr>
+          <w:rFonts w:asciiTheme="minorHAnsi" w:hAnsiTheme="minorHAnsi"/>
+        </w:rPr>
+        <w:t>do aggiornate le informazioni consultabili dal catalogo.</w:t>
       </w:r>
     </w:p>
     <w:p>
@@ -8155,6 +8366,92 @@
           <w:b/>
           <w:bCs/>
         </w:rPr>
+        <w:t>FR1</w:t>
+      </w:r>
+      <w:r>
+        <w:rPr>
+          <w:rFonts w:asciiTheme="minorHAnsi" w:hAnsiTheme="minorHAnsi"/>
+          <w:b/>
+          <w:bCs/>
+        </w:rPr>
+        <w:t>2</w:t>
+      </w:r>
+      <w:r>
+        <w:rPr>
+          <w:rFonts w:asciiTheme="minorHAnsi" w:hAnsiTheme="minorHAnsi"/>
+          <w:b/>
+          <w:bCs/>
+        </w:rPr>
+        <w:t xml:space="preserve"> – Aggiunta e resa inattiva delle copie</w:t>
+      </w:r>
+    </w:p>
+    <w:p>
+      <w:pPr>
+        <w:jc w:val="both"/>
+        <w:rPr>
+          <w:rFonts w:asciiTheme="minorHAnsi" w:hAnsiTheme="minorHAnsi"/>
+        </w:rPr>
+      </w:pPr>
+      <w:r>
+        <w:rPr>
+          <w:rFonts w:asciiTheme="minorHAnsi" w:hAnsiTheme="minorHAnsi"/>
+        </w:rPr>
+        <w:t xml:space="preserve">Un operatore deve poter </w:t>
+      </w:r>
+      <w:r>
+        <w:rPr>
+          <w:rFonts w:asciiTheme="minorHAnsi" w:hAnsiTheme="minorHAnsi"/>
+        </w:rPr>
+        <w:t>aggiungere e</w:t>
+      </w:r>
+      <w:r>
+        <w:rPr>
+          <w:rFonts w:asciiTheme="minorHAnsi" w:hAnsiTheme="minorHAnsi"/>
+        </w:rPr>
+        <w:t xml:space="preserve"> rendere inattive</w:t>
+      </w:r>
+      <w:r>
+        <w:rPr>
+          <w:rFonts w:asciiTheme="minorHAnsi" w:hAnsiTheme="minorHAnsi"/>
+        </w:rPr>
+        <w:t xml:space="preserve"> copie</w:t>
+      </w:r>
+      <w:r>
+        <w:rPr>
+          <w:rFonts w:asciiTheme="minorHAnsi" w:hAnsiTheme="minorHAnsi"/>
+        </w:rPr>
+        <w:t xml:space="preserve">, </w:t>
+      </w:r>
+      <w:r>
+        <w:rPr>
+          <w:rFonts w:asciiTheme="minorHAnsi" w:hAnsiTheme="minorHAnsi"/>
+        </w:rPr>
+        <w:t>mantenendo aggiornate le informazioni per ciascuna edizione.</w:t>
+      </w:r>
+    </w:p>
+    <w:p>
+      <w:pPr>
+        <w:jc w:val="both"/>
+        <w:rPr>
+          <w:rFonts w:asciiTheme="minorHAnsi" w:hAnsiTheme="minorHAnsi"/>
+        </w:rPr>
+      </w:pPr>
+    </w:p>
+    <w:p>
+      <w:pPr>
+        <w:jc w:val="both"/>
+        <w:rPr>
+          <w:rFonts w:asciiTheme="minorHAnsi" w:hAnsiTheme="minorHAnsi"/>
+          <w:b/>
+          <w:bCs/>
+        </w:rPr>
+      </w:pPr>
+      <w:r>
+        <w:rPr>
+          <w:rFonts w:asciiTheme="minorHAnsi" w:hAnsiTheme="minorHAnsi"/>
+          <w:b/>
+          <w:bCs/>
+        </w:rPr>
         <w:t>FR</w:t>
       </w:r>
       <w:r>
@@ -8163,7 +8460,23 @@
           <w:b/>
           <w:bCs/>
         </w:rPr>
-        <w:t>11 – Registrazione d</w:t>
+        <w:t>1</w:t>
+      </w:r>
+      <w:r>
+        <w:rPr>
+          <w:rFonts w:asciiTheme="minorHAnsi" w:hAnsiTheme="minorHAnsi"/>
+          <w:b/>
+          <w:bCs/>
+        </w:rPr>
+        <w:t>3</w:t>
+      </w:r>
+      <w:r>
+        <w:rPr>
+          <w:rFonts w:asciiTheme="minorHAnsi" w:hAnsiTheme="minorHAnsi"/>
+          <w:b/>
+          <w:bCs/>
+        </w:rPr>
+        <w:t xml:space="preserve"> – Registrazione d</w:t>
       </w:r>
       <w:r>
         <w:rPr>
@@ -8275,7 +8588,23 @@
           <w:b/>
           <w:bCs/>
         </w:rPr>
-        <w:t>12 – Annullamento di una sospensione</w:t>
+        <w:t>1</w:t>
+      </w:r>
+      <w:r>
+        <w:rPr>
+          <w:rFonts w:asciiTheme="minorHAnsi" w:hAnsiTheme="minorHAnsi"/>
+          <w:b/>
+          <w:bCs/>
+        </w:rPr>
+        <w:t>4</w:t>
+      </w:r>
+      <w:r>
+        <w:rPr>
+          <w:rFonts w:asciiTheme="minorHAnsi" w:hAnsiTheme="minorHAnsi"/>
+          <w:b/>
+          <w:bCs/>
+        </w:rPr>
+        <w:t xml:space="preserve"> – Annullamento di una sospensione</w:t>
       </w:r>
     </w:p>
     <w:p>
@@ -8289,7 +8618,19 @@
         <w:rPr>
           <w:rFonts w:asciiTheme="minorHAnsi" w:hAnsiTheme="minorHAnsi"/>
         </w:rPr>
-        <w:t>Un operatore deve poter annullare una sospesione a un lettore assegnata in precedenza.</w:t>
+        <w:t>Un operatore deve poter annullare una sospe</w:t>
+      </w:r>
+      <w:r>
+        <w:rPr>
+          <w:rFonts w:asciiTheme="minorHAnsi" w:hAnsiTheme="minorHAnsi"/>
+        </w:rPr>
+        <w:t>n</w:t>
+      </w:r>
+      <w:r>
+        <w:rPr>
+          <w:rFonts w:asciiTheme="minorHAnsi" w:hAnsiTheme="minorHAnsi"/>
+        </w:rPr>
+        <w:t>sione a un lettore assegnata in precedenza.</w:t>
       </w:r>
     </w:p>
     <w:p>
@@ -8333,7 +8674,7 @@
           <w:b/>
           <w:bCs/>
         </w:rPr>
-        <w:t>3</w:t>
+        <w:t>5</w:t>
       </w:r>
       <w:r>
         <w:rPr>
@@ -8397,7 +8738,15 @@
           <w:b/>
           <w:bCs/>
         </w:rPr>
-        <w:t xml:space="preserve">4 </w:t>
+        <w:t>6</w:t>
+      </w:r>
+      <w:r>
+        <w:rPr>
+          <w:rFonts w:asciiTheme="minorHAnsi" w:hAnsiTheme="minorHAnsi"/>
+          <w:b/>
+          <w:bCs/>
+        </w:rPr>
+        <w:t xml:space="preserve"> </w:t>
       </w:r>
       <w:r>
         <w:rPr>
@@ -8419,7 +8768,19 @@
         <w:rPr>
           <w:rFonts w:asciiTheme="minorHAnsi" w:hAnsiTheme="minorHAnsi"/>
         </w:rPr>
-        <w:t>Il sistema deve consentire ad un operatore di resettare la password dell’account di un lettore registrato. Assegnando una nuova password temporanea.</w:t>
+        <w:t>Il sistema deve consentire ad un operatore di resettare la password dell’account di un lettore registrato</w:t>
+      </w:r>
+      <w:r>
+        <w:rPr>
+          <w:rFonts w:asciiTheme="minorHAnsi" w:hAnsiTheme="minorHAnsi"/>
+        </w:rPr>
+        <w:t>, a</w:t>
+      </w:r>
+      <w:r>
+        <w:rPr>
+          <w:rFonts w:asciiTheme="minorHAnsi" w:hAnsiTheme="minorHAnsi"/>
+        </w:rPr>
+        <w:t>ssegnando una nuova password temporanea.</w:t>
       </w:r>
     </w:p>
     <w:p>
@@ -8453,7 +8814,23 @@
           <w:b/>
           <w:bCs/>
         </w:rPr>
-        <w:t>15 – Cancellazione automatica delle prenotazioni</w:t>
+        <w:t>1</w:t>
+      </w:r>
+      <w:r>
+        <w:rPr>
+          <w:rFonts w:asciiTheme="minorHAnsi" w:hAnsiTheme="minorHAnsi"/>
+          <w:b/>
+          <w:bCs/>
+        </w:rPr>
+        <w:t>7</w:t>
+      </w:r>
+      <w:r>
+        <w:rPr>
+          <w:rFonts w:asciiTheme="minorHAnsi" w:hAnsiTheme="minorHAnsi"/>
+          <w:b/>
+          <w:bCs/>
+        </w:rPr>
+        <w:t xml:space="preserve"> – Cancellazione automatica delle prenotazioni</w:t>
       </w:r>
       <w:r>
         <w:rPr>
@@ -8476,6 +8853,92 @@
           <w:rFonts w:asciiTheme="minorHAnsi" w:hAnsiTheme="minorHAnsi"/>
         </w:rPr>
         <w:t>Il sistema deve controllare periodicamente che le prenotazioni non siano scadute. Nel caso in cui lo siano deve eliminarle.</w:t>
+      </w:r>
+    </w:p>
+    <w:p>
+      <w:pPr>
+        <w:jc w:val="both"/>
+        <w:rPr>
+          <w:rFonts w:asciiTheme="minorHAnsi" w:hAnsiTheme="minorHAnsi"/>
+        </w:rPr>
+      </w:pPr>
+    </w:p>
+    <w:p>
+      <w:pPr>
+        <w:jc w:val="both"/>
+        <w:rPr>
+          <w:rFonts w:asciiTheme="minorHAnsi" w:hAnsiTheme="minorHAnsi"/>
+          <w:b/>
+          <w:bCs/>
+        </w:rPr>
+      </w:pPr>
+      <w:r>
+        <w:rPr>
+          <w:rFonts w:asciiTheme="minorHAnsi" w:hAnsiTheme="minorHAnsi"/>
+          <w:b/>
+          <w:bCs/>
+        </w:rPr>
+        <w:t>FR1</w:t>
+      </w:r>
+      <w:r>
+        <w:rPr>
+          <w:rFonts w:asciiTheme="minorHAnsi" w:hAnsiTheme="minorHAnsi"/>
+          <w:b/>
+          <w:bCs/>
+        </w:rPr>
+        <w:t>8</w:t>
+      </w:r>
+      <w:r>
+        <w:rPr>
+          <w:rFonts w:asciiTheme="minorHAnsi" w:hAnsiTheme="minorHAnsi"/>
+          <w:b/>
+          <w:bCs/>
+        </w:rPr>
+        <w:t xml:space="preserve"> – Specializzazione delle pagine</w:t>
+      </w:r>
+    </w:p>
+    <w:p>
+      <w:pPr>
+        <w:jc w:val="both"/>
+        <w:rPr>
+          <w:rFonts w:asciiTheme="minorHAnsi" w:hAnsiTheme="minorHAnsi"/>
+        </w:rPr>
+      </w:pPr>
+      <w:r>
+        <w:rPr>
+          <w:rFonts w:asciiTheme="minorHAnsi" w:hAnsiTheme="minorHAnsi"/>
+        </w:rPr>
+        <w:t xml:space="preserve">Pagine come l’home page devono </w:t>
+      </w:r>
+      <w:r>
+        <w:rPr>
+          <w:rFonts w:asciiTheme="minorHAnsi" w:hAnsiTheme="minorHAnsi"/>
+        </w:rPr>
+        <w:t>mostra</w:t>
+      </w:r>
+      <w:r>
+        <w:rPr>
+          <w:rFonts w:asciiTheme="minorHAnsi" w:hAnsiTheme="minorHAnsi"/>
+        </w:rPr>
+        <w:t>re</w:t>
+      </w:r>
+      <w:r>
+        <w:rPr>
+          <w:rFonts w:asciiTheme="minorHAnsi" w:hAnsiTheme="minorHAnsi"/>
+        </w:rPr>
+        <w:t xml:space="preserve"> contenuti diversi in base al ruolo</w:t>
+      </w:r>
+      <w:r>
+        <w:rPr>
+          <w:rFonts w:asciiTheme="minorHAnsi" w:hAnsiTheme="minorHAnsi"/>
+        </w:rPr>
+        <w:t xml:space="preserve"> dell’utente che accede ad esse</w:t>
+      </w:r>
+      <w:r>
+        <w:rPr>
+          <w:rFonts w:asciiTheme="minorHAnsi" w:hAnsiTheme="minorHAnsi"/>
+        </w:rPr>
+        <w:t>.</w:t>
       </w:r>
     </w:p>
     <w:p/>
@@ -8497,6 +8960,7 @@
           <w:i w:val="0"/>
           <w:iCs w:val="0"/>
         </w:rPr>
+        <w:lastRenderedPageBreak/>
         <w:t>Nonfunctional requirements</w:t>
       </w:r>
       <w:bookmarkEnd w:id="11"/>
@@ -8875,7 +9339,6 @@
           <w:sz w:val="28"/>
           <w:szCs w:val="28"/>
         </w:rPr>
-        <w:lastRenderedPageBreak/>
         <w:t>Reliability</w:t>
       </w:r>
       <w:bookmarkEnd w:id="13"/>
@@ -9455,6 +9918,7 @@
           <w:sz w:val="28"/>
           <w:szCs w:val="28"/>
         </w:rPr>
+        <w:lastRenderedPageBreak/>
         <w:t>I</w:t>
       </w:r>
       <w:r>
@@ -9636,7 +10100,6 @@
           <w:sz w:val="28"/>
           <w:szCs w:val="28"/>
         </w:rPr>
-        <w:lastRenderedPageBreak/>
         <w:t>Legal</w:t>
       </w:r>
       <w:bookmarkEnd w:id="19"/>
@@ -9988,6 +10451,7 @@
         <w:rPr>
           <w:rFonts w:asciiTheme="minorHAnsi" w:hAnsiTheme="minorHAnsi"/>
         </w:rPr>
+        <w:lastRenderedPageBreak/>
         <w:t>Quando Giacomo accede al sistema tramite e-mail e password temporanea, il sistema gli chiede di scegliere una nuova password.</w:t>
       </w:r>
     </w:p>
@@ -10326,6 +10790,7 @@
         <w:rPr>
           <w:rFonts w:asciiTheme="minorHAnsi" w:hAnsiTheme="minorHAnsi"/>
         </w:rPr>
+        <w:lastRenderedPageBreak/>
         <w:t>Emma accede al sistema, si reca nella pagina di gestione delle prenotazioni, e annulla la prenotazione per la copia. Il sistema annulla la prenotazione e la copia riservata torna disponibile agli altri lettori.</w:t>
       </w:r>
     </w:p>
@@ -10430,7 +10895,6 @@
           <w:b/>
           <w:bCs/>
         </w:rPr>
-        <w:lastRenderedPageBreak/>
         <w:t>Scenario 7 – Registrazione di un prestito con prenotazione</w:t>
       </w:r>
       <w:bookmarkEnd w:id="28"/>
@@ -10707,7 +11171,6 @@
           <w:b/>
           <w:bCs/>
         </w:rPr>
-        <w:lastRenderedPageBreak/>
         <w:t>Scenario 11 – Aggiunta nel catalogo di una nuova edizione</w:t>
       </w:r>
       <w:bookmarkEnd w:id="32"/>
@@ -10999,7 +11462,14 @@
         <w:rPr>
           <w:rFonts w:asciiTheme="minorHAnsi" w:hAnsiTheme="minorHAnsi"/>
         </w:rPr>
-        <w:t>Grazia, operatrice della biblioteca, deve modificare delle informazioni di un’edizione già presente nel catalogo. Grazia accede al sistema, seleziona l’edizione e ne modifica le informazioni. Il sistema registra le modifiche, aggiornando anche le informazioni mostrate nel catalogo.</w:t>
+        <w:t xml:space="preserve">Grazia, operatrice della biblioteca, deve modificare delle informazioni di un’edizione già </w:t>
+      </w:r>
+      <w:r>
+        <w:rPr>
+          <w:rFonts w:asciiTheme="minorHAnsi" w:hAnsiTheme="minorHAnsi"/>
+        </w:rPr>
+        <w:lastRenderedPageBreak/>
+        <w:t>presente nel catalogo. Grazia accede al sistema, seleziona l’edizione e ne modifica le informazioni. Il sistema registra le modifiche, aggiornando anche le informazioni mostrate nel catalogo.</w:t>
       </w:r>
     </w:p>
     <w:p>
@@ -11487,7 +11957,6 @@
               <w:rPr>
                 <w:rFonts w:asciiTheme="minorHAnsi" w:hAnsiTheme="minorHAnsi"/>
               </w:rPr>
-              <w:lastRenderedPageBreak/>
               <w:t>Nome</w:t>
             </w:r>
           </w:p>
@@ -12300,7 +12769,7 @@
               <w:rFonts w:asciiTheme="minorHAnsi" w:hAnsiTheme="minorHAnsi"/>
               <w:sz w:val="20"/>
             </w:rPr>
-            <w:t>5</w:t>
+            <w:t>6</w:t>
           </w:r>
           <w:r>
             <w:rPr>

</xml_diff>

<commit_message>
Modifica diagrammi casi d'uso con aggiunta dei rispettivi nel file RAD
</commit_message>
<xml_diff>
--- a/Documents/02_NovaBiblioteca_RAD.docx
+++ b/Documents/02_NovaBiblioteca_RAD.docx
@@ -2210,7 +2210,7 @@
           <w:noProof/>
           <w:lang w:val="en-US"/>
         </w:rPr>
-        <w:t>5</w:t>
+        <w:t>4</w:t>
       </w:r>
       <w:r>
         <w:rPr>
@@ -2295,7 +2295,7 @@
           <w:noProof/>
           <w:lang w:val="en-US"/>
         </w:rPr>
-        <w:t>5</w:t>
+        <w:t>4</w:t>
       </w:r>
       <w:r>
         <w:rPr>
@@ -2380,7 +2380,7 @@
           <w:noProof/>
           <w:lang w:val="en-US"/>
         </w:rPr>
-        <w:t>5</w:t>
+        <w:t>4</w:t>
       </w:r>
       <w:r>
         <w:rPr>
@@ -2465,7 +2465,7 @@
           <w:noProof/>
           <w:lang w:val="en-US"/>
         </w:rPr>
-        <w:t>6</w:t>
+        <w:t>5</w:t>
       </w:r>
       <w:r>
         <w:rPr>
@@ -2550,7 +2550,7 @@
           <w:noProof/>
           <w:lang w:val="en-US"/>
         </w:rPr>
-        <w:t>7</w:t>
+        <w:t>6</w:t>
       </w:r>
       <w:r>
         <w:rPr>
@@ -2635,7 +2635,7 @@
           <w:noProof/>
           <w:lang w:val="en-US"/>
         </w:rPr>
-        <w:t>8</w:t>
+        <w:t>7</w:t>
       </w:r>
       <w:r>
         <w:rPr>
@@ -2720,7 +2720,7 @@
           <w:noProof/>
           <w:lang w:val="en-US"/>
         </w:rPr>
-        <w:t>8</w:t>
+        <w:t>7</w:t>
       </w:r>
       <w:r>
         <w:rPr>
@@ -2805,7 +2805,7 @@
           <w:noProof/>
           <w:lang w:val="en-US"/>
         </w:rPr>
-        <w:t>8</w:t>
+        <w:t>7</w:t>
       </w:r>
       <w:r>
         <w:rPr>
@@ -2890,7 +2890,7 @@
           <w:noProof/>
           <w:lang w:val="en-US"/>
         </w:rPr>
-        <w:t>9</w:t>
+        <w:t>8</w:t>
       </w:r>
       <w:r>
         <w:rPr>
@@ -2975,7 +2975,7 @@
           <w:noProof/>
           <w:lang w:val="en-US"/>
         </w:rPr>
-        <w:t>9</w:t>
+        <w:t>8</w:t>
       </w:r>
       <w:r>
         <w:rPr>
@@ -3060,7 +3060,7 @@
           <w:noProof/>
           <w:lang w:val="en-US"/>
         </w:rPr>
-        <w:t>10</w:t>
+        <w:t>9</w:t>
       </w:r>
       <w:r>
         <w:rPr>
@@ -3273,7 +3273,7 @@
           <w:noProof/>
           <w:lang w:val="en-US"/>
         </w:rPr>
-        <w:t>12</w:t>
+        <w:t>11</w:t>
       </w:r>
       <w:r>
         <w:rPr>
@@ -3337,7 +3337,7 @@
           <w:noProof/>
           <w:lang w:val="en-US"/>
         </w:rPr>
-        <w:t>12</w:t>
+        <w:t>11</w:t>
       </w:r>
       <w:r>
         <w:rPr>
@@ -3401,7 +3401,7 @@
           <w:noProof/>
           <w:lang w:val="en-US"/>
         </w:rPr>
-        <w:t>12</w:t>
+        <w:t>11</w:t>
       </w:r>
       <w:r>
         <w:rPr>
@@ -3465,7 +3465,7 @@
           <w:noProof/>
           <w:lang w:val="en-US"/>
         </w:rPr>
-        <w:t>12</w:t>
+        <w:t>11</w:t>
       </w:r>
       <w:r>
         <w:rPr>
@@ -3657,7 +3657,7 @@
           <w:noProof/>
           <w:lang w:val="en-US"/>
         </w:rPr>
-        <w:t>13</w:t>
+        <w:t>12</w:t>
       </w:r>
       <w:r>
         <w:rPr>
@@ -3742,7 +3742,7 @@
           <w:noProof/>
           <w:lang w:val="en-US"/>
         </w:rPr>
-        <w:t>13</w:t>
+        <w:t>12</w:t>
       </w:r>
       <w:r>
         <w:rPr>
@@ -3806,7 +3806,7 @@
           <w:noProof/>
           <w:lang w:val="en-US"/>
         </w:rPr>
-        <w:t>13</w:t>
+        <w:t>12</w:t>
       </w:r>
       <w:r>
         <w:rPr>
@@ -3934,7 +3934,7 @@
           <w:noProof/>
           <w:lang w:val="en-US"/>
         </w:rPr>
-        <w:t>17</w:t>
+        <w:t>43</w:t>
       </w:r>
       <w:r>
         <w:rPr>
@@ -3998,7 +3998,7 @@
           <w:noProof/>
           <w:lang w:val="en-US"/>
         </w:rPr>
-        <w:t>17</w:t>
+        <w:t>47</w:t>
       </w:r>
       <w:r>
         <w:rPr>
@@ -4062,7 +4062,7 @@
           <w:noProof/>
           <w:lang w:val="en-US"/>
         </w:rPr>
-        <w:t>17</w:t>
+        <w:t>47</w:t>
       </w:r>
       <w:r>
         <w:rPr>
@@ -4140,7 +4140,7 @@
         <w:rPr>
           <w:noProof/>
         </w:rPr>
-        <w:t>17</w:t>
+        <w:t>47</w:t>
       </w:r>
       <w:r>
         <w:rPr>
@@ -12514,19 +12514,36 @@
       <w:r>
         <w:rPr>
           <w:rFonts w:asciiTheme="minorHAnsi" w:hAnsiTheme="minorHAnsi"/>
+          <w:b/>
+          <w:bCs/>
+          <w:sz w:val="28"/>
+          <w:szCs w:val="28"/>
+        </w:rPr>
+        <w:t>UC2 – Autenticazione</w:t>
+      </w:r>
+    </w:p>
+    <w:p>
+      <w:pPr>
+        <w:rPr>
+          <w:rFonts w:asciiTheme="minorHAnsi" w:hAnsiTheme="minorHAnsi"/>
+        </w:rPr>
+      </w:pPr>
+      <w:r>
+        <w:rPr>
+          <w:rFonts w:asciiTheme="minorHAnsi" w:hAnsiTheme="minorHAnsi"/>
           <w:noProof/>
         </w:rPr>
         <w:drawing>
-          <wp:anchor distT="0" distB="0" distL="114300" distR="114300" simplePos="0" relativeHeight="251659264" behindDoc="1" locked="0" layoutInCell="1" allowOverlap="1" wp14:anchorId="010F0B01" wp14:editId="639F9498">
+          <wp:anchor distT="0" distB="0" distL="114300" distR="114300" simplePos="0" relativeHeight="251659264" behindDoc="1" locked="0" layoutInCell="1" allowOverlap="1" wp14:anchorId="010F0B01" wp14:editId="48FF0EA6">
             <wp:simplePos x="0" y="0"/>
             <wp:positionH relativeFrom="column">
               <wp:posOffset>476885</wp:posOffset>
             </wp:positionH>
             <wp:positionV relativeFrom="paragraph">
-              <wp:posOffset>264795</wp:posOffset>
+              <wp:posOffset>224155</wp:posOffset>
             </wp:positionV>
-            <wp:extent cx="4704715" cy="2633345"/>
-            <wp:effectExtent l="0" t="0" r="635" b="0"/>
+            <wp:extent cx="5170805" cy="2501900"/>
+            <wp:effectExtent l="0" t="0" r="0" b="0"/>
             <wp:wrapTopAndBottom/>
             <wp:docPr id="535939912" name="Immagine 2"/>
             <wp:cNvGraphicFramePr>
@@ -12536,20 +12553,13 @@
               <a:graphicData uri="http://schemas.openxmlformats.org/drawingml/2006/picture">
                 <pic:pic xmlns:pic="http://schemas.openxmlformats.org/drawingml/2006/picture">
                   <pic:nvPicPr>
-                    <pic:cNvPr id="0" name="Picture 2"/>
+                    <pic:cNvPr id="535939912" name="Immagine 2"/>
                     <pic:cNvPicPr>
                       <a:picLocks noChangeAspect="1" noChangeArrowheads="1"/>
                     </pic:cNvPicPr>
                   </pic:nvPicPr>
                   <pic:blipFill>
-                    <a:blip r:embed="rId14">
-                      <a:extLst>
-                        <a:ext uri="{28A0092B-C50C-407E-A947-70E740481C1C}">
-                          <a14:useLocalDpi xmlns:a14="http://schemas.microsoft.com/office/drawing/2010/main" val="0"/>
-                        </a:ext>
-                      </a:extLst>
-                    </a:blip>
-                    <a:srcRect/>
+                    <a:blip r:embed="rId14"/>
                     <a:stretch>
                       <a:fillRect/>
                     </a:stretch>
@@ -12557,7 +12567,7 @@
                   <pic:spPr bwMode="auto">
                     <a:xfrm>
                       <a:off x="0" y="0"/>
-                      <a:ext cx="4704715" cy="2633345"/>
+                      <a:ext cx="5170805" cy="2501900"/>
                     </a:xfrm>
                     <a:prstGeom prst="rect">
                       <a:avLst/>
@@ -12584,23 +12594,6 @@
           <w:rFonts w:asciiTheme="minorHAnsi" w:hAnsiTheme="minorHAnsi"/>
           <w:b/>
           <w:bCs/>
-          <w:sz w:val="28"/>
-          <w:szCs w:val="28"/>
-        </w:rPr>
-        <w:t>UC2 – Autenticazione</w:t>
-      </w:r>
-    </w:p>
-    <w:p>
-      <w:pPr>
-        <w:rPr>
-          <w:rFonts w:asciiTheme="minorHAnsi" w:hAnsiTheme="minorHAnsi"/>
-        </w:rPr>
-      </w:pPr>
-      <w:r>
-        <w:rPr>
-          <w:rFonts w:asciiTheme="minorHAnsi" w:hAnsiTheme="minorHAnsi"/>
-          <w:b/>
-          <w:bCs/>
         </w:rPr>
         <w:t xml:space="preserve">Attori: </w:t>
       </w:r>
@@ -13320,6 +13313,186 @@
       <w:pPr>
         <w:rPr>
           <w:rFonts w:asciiTheme="minorHAnsi" w:hAnsiTheme="minorHAnsi"/>
+          <w:b/>
+          <w:bCs/>
+          <w:sz w:val="28"/>
+          <w:szCs w:val="28"/>
+        </w:rPr>
+      </w:pPr>
+    </w:p>
+    <w:p>
+      <w:pPr>
+        <w:rPr>
+          <w:rFonts w:asciiTheme="minorHAnsi" w:hAnsiTheme="minorHAnsi"/>
+          <w:b/>
+          <w:bCs/>
+          <w:sz w:val="28"/>
+          <w:szCs w:val="28"/>
+        </w:rPr>
+      </w:pPr>
+    </w:p>
+    <w:p>
+      <w:pPr>
+        <w:rPr>
+          <w:rFonts w:asciiTheme="minorHAnsi" w:hAnsiTheme="minorHAnsi"/>
+          <w:b/>
+          <w:bCs/>
+          <w:sz w:val="28"/>
+          <w:szCs w:val="28"/>
+        </w:rPr>
+      </w:pPr>
+    </w:p>
+    <w:p>
+      <w:pPr>
+        <w:rPr>
+          <w:rFonts w:asciiTheme="minorHAnsi" w:hAnsiTheme="minorHAnsi"/>
+          <w:b/>
+          <w:bCs/>
+          <w:sz w:val="28"/>
+          <w:szCs w:val="28"/>
+        </w:rPr>
+      </w:pPr>
+    </w:p>
+    <w:p>
+      <w:pPr>
+        <w:rPr>
+          <w:rFonts w:asciiTheme="minorHAnsi" w:hAnsiTheme="minorHAnsi"/>
+          <w:b/>
+          <w:bCs/>
+          <w:sz w:val="28"/>
+          <w:szCs w:val="28"/>
+        </w:rPr>
+      </w:pPr>
+    </w:p>
+    <w:p>
+      <w:pPr>
+        <w:rPr>
+          <w:rFonts w:asciiTheme="minorHAnsi" w:hAnsiTheme="minorHAnsi"/>
+          <w:b/>
+          <w:bCs/>
+          <w:sz w:val="28"/>
+          <w:szCs w:val="28"/>
+        </w:rPr>
+      </w:pPr>
+    </w:p>
+    <w:p>
+      <w:pPr>
+        <w:rPr>
+          <w:rFonts w:asciiTheme="minorHAnsi" w:hAnsiTheme="minorHAnsi"/>
+          <w:b/>
+          <w:bCs/>
+          <w:sz w:val="28"/>
+          <w:szCs w:val="28"/>
+        </w:rPr>
+      </w:pPr>
+    </w:p>
+    <w:p>
+      <w:pPr>
+        <w:rPr>
+          <w:rFonts w:asciiTheme="minorHAnsi" w:hAnsiTheme="minorHAnsi"/>
+          <w:b/>
+          <w:bCs/>
+          <w:sz w:val="28"/>
+          <w:szCs w:val="28"/>
+        </w:rPr>
+      </w:pPr>
+    </w:p>
+    <w:p>
+      <w:pPr>
+        <w:rPr>
+          <w:rFonts w:asciiTheme="minorHAnsi" w:hAnsiTheme="minorHAnsi"/>
+          <w:b/>
+          <w:bCs/>
+          <w:sz w:val="28"/>
+          <w:szCs w:val="28"/>
+        </w:rPr>
+      </w:pPr>
+    </w:p>
+    <w:p>
+      <w:pPr>
+        <w:rPr>
+          <w:rFonts w:asciiTheme="minorHAnsi" w:hAnsiTheme="minorHAnsi"/>
+          <w:b/>
+          <w:bCs/>
+          <w:sz w:val="28"/>
+          <w:szCs w:val="28"/>
+        </w:rPr>
+      </w:pPr>
+    </w:p>
+    <w:p>
+      <w:pPr>
+        <w:rPr>
+          <w:rFonts w:asciiTheme="minorHAnsi" w:hAnsiTheme="minorHAnsi"/>
+          <w:b/>
+          <w:bCs/>
+          <w:sz w:val="28"/>
+          <w:szCs w:val="28"/>
+        </w:rPr>
+      </w:pPr>
+    </w:p>
+    <w:p>
+      <w:pPr>
+        <w:rPr>
+          <w:rFonts w:asciiTheme="minorHAnsi" w:hAnsiTheme="minorHAnsi"/>
+          <w:b/>
+          <w:bCs/>
+          <w:sz w:val="28"/>
+          <w:szCs w:val="28"/>
+        </w:rPr>
+      </w:pPr>
+    </w:p>
+    <w:p>
+      <w:pPr>
+        <w:rPr>
+          <w:rFonts w:asciiTheme="minorHAnsi" w:hAnsiTheme="minorHAnsi"/>
+          <w:b/>
+          <w:bCs/>
+          <w:sz w:val="28"/>
+          <w:szCs w:val="28"/>
+        </w:rPr>
+      </w:pPr>
+    </w:p>
+    <w:p>
+      <w:pPr>
+        <w:rPr>
+          <w:rFonts w:asciiTheme="minorHAnsi" w:hAnsiTheme="minorHAnsi"/>
+          <w:b/>
+          <w:bCs/>
+          <w:sz w:val="28"/>
+          <w:szCs w:val="28"/>
+        </w:rPr>
+      </w:pPr>
+    </w:p>
+    <w:p>
+      <w:pPr>
+        <w:rPr>
+          <w:rFonts w:asciiTheme="minorHAnsi" w:hAnsiTheme="minorHAnsi"/>
+          <w:b/>
+          <w:bCs/>
+          <w:sz w:val="28"/>
+          <w:szCs w:val="28"/>
+        </w:rPr>
+      </w:pPr>
+    </w:p>
+    <w:p>
+      <w:pPr>
+        <w:rPr>
+          <w:rFonts w:asciiTheme="minorHAnsi" w:hAnsiTheme="minorHAnsi"/>
+          <w:b/>
+          <w:bCs/>
+          <w:sz w:val="28"/>
+          <w:szCs w:val="28"/>
+        </w:rPr>
+      </w:pPr>
+    </w:p>
+    <w:p>
+      <w:pPr>
+        <w:rPr>
+          <w:rFonts w:asciiTheme="minorHAnsi" w:hAnsiTheme="minorHAnsi"/>
+          <w:b/>
+          <w:bCs/>
+          <w:sz w:val="28"/>
+          <w:szCs w:val="28"/>
         </w:rPr>
       </w:pPr>
       <w:r>
@@ -13333,18 +13506,18 @@
         </w:rPr>
         <w:lastRenderedPageBreak/>
         <w:drawing>
-          <wp:anchor distT="0" distB="0" distL="114300" distR="114300" simplePos="0" relativeHeight="251660288" behindDoc="0" locked="0" layoutInCell="1" allowOverlap="1" wp14:anchorId="3C2DB71B" wp14:editId="59F543F3">
+          <wp:anchor distT="0" distB="0" distL="114300" distR="114300" simplePos="0" relativeHeight="251681792" behindDoc="0" locked="0" layoutInCell="1" allowOverlap="1" wp14:anchorId="7BB7111A" wp14:editId="2882DACB">
             <wp:simplePos x="0" y="0"/>
             <wp:positionH relativeFrom="margin">
               <wp:align>center</wp:align>
             </wp:positionH>
             <wp:positionV relativeFrom="paragraph">
-              <wp:posOffset>274320</wp:posOffset>
+              <wp:posOffset>274089</wp:posOffset>
             </wp:positionV>
-            <wp:extent cx="4172585" cy="4297680"/>
-            <wp:effectExtent l="0" t="0" r="0" b="7620"/>
+            <wp:extent cx="4613564" cy="3127743"/>
+            <wp:effectExtent l="0" t="0" r="0" b="0"/>
             <wp:wrapTopAndBottom/>
-            <wp:docPr id="1743054417" name="Immagine 3"/>
+            <wp:docPr id="1358923558" name="Immagine 1"/>
             <wp:cNvGraphicFramePr>
               <a:graphicFrameLocks xmlns:a="http://schemas.openxmlformats.org/drawingml/2006/main" noChangeAspect="1"/>
             </wp:cNvGraphicFramePr>
@@ -13352,7 +13525,7 @@
               <a:graphicData uri="http://schemas.openxmlformats.org/drawingml/2006/picture">
                 <pic:pic xmlns:pic="http://schemas.openxmlformats.org/drawingml/2006/picture">
                   <pic:nvPicPr>
-                    <pic:cNvPr id="0" name="Picture 3"/>
+                    <pic:cNvPr id="0" name="Picture 1"/>
                     <pic:cNvPicPr>
                       <a:picLocks noChangeAspect="1" noChangeArrowheads="1"/>
                     </pic:cNvPicPr>
@@ -13373,7 +13546,423 @@
                   <pic:spPr bwMode="auto">
                     <a:xfrm>
                       <a:off x="0" y="0"/>
-                      <a:ext cx="4172585" cy="4297680"/>
+                      <a:ext cx="4613564" cy="3127743"/>
+                    </a:xfrm>
+                    <a:prstGeom prst="rect">
+                      <a:avLst/>
+                    </a:prstGeom>
+                    <a:noFill/>
+                    <a:ln>
+                      <a:noFill/>
+                    </a:ln>
+                  </pic:spPr>
+                </pic:pic>
+              </a:graphicData>
+            </a:graphic>
+          </wp:anchor>
+        </w:drawing>
+      </w:r>
+      <w:r>
+        <w:rPr>
+          <w:rFonts w:asciiTheme="minorHAnsi" w:hAnsiTheme="minorHAnsi"/>
+          <w:b/>
+          <w:bCs/>
+          <w:sz w:val="28"/>
+          <w:szCs w:val="28"/>
+        </w:rPr>
+        <w:t>UC3 – Logout</w:t>
+      </w:r>
+    </w:p>
+    <w:p>
+      <w:pPr>
+        <w:rPr>
+          <w:rFonts w:asciiTheme="minorHAnsi" w:hAnsiTheme="minorHAnsi"/>
+        </w:rPr>
+      </w:pPr>
+      <w:r>
+        <w:rPr>
+          <w:rFonts w:asciiTheme="minorHAnsi" w:hAnsiTheme="minorHAnsi"/>
+          <w:b/>
+          <w:bCs/>
+        </w:rPr>
+        <w:t>Attori:</w:t>
+      </w:r>
+      <w:r>
+        <w:rPr>
+          <w:rFonts w:asciiTheme="minorHAnsi" w:hAnsiTheme="minorHAnsi"/>
+        </w:rPr>
+        <w:t xml:space="preserve"> Utente.</w:t>
+      </w:r>
+    </w:p>
+    <w:p>
+      <w:pPr>
+        <w:rPr>
+          <w:rFonts w:asciiTheme="minorHAnsi" w:hAnsiTheme="minorHAnsi"/>
+          <w:b/>
+          <w:bCs/>
+        </w:rPr>
+      </w:pPr>
+    </w:p>
+    <w:p>
+      <w:pPr>
+        <w:rPr>
+          <w:rFonts w:asciiTheme="minorHAnsi" w:hAnsiTheme="minorHAnsi"/>
+        </w:rPr>
+      </w:pPr>
+      <w:r>
+        <w:rPr>
+          <w:rFonts w:asciiTheme="minorHAnsi" w:hAnsiTheme="minorHAnsi"/>
+          <w:b/>
+          <w:bCs/>
+        </w:rPr>
+        <w:t xml:space="preserve">Entry </w:t>
+      </w:r>
+      <w:proofErr w:type="spellStart"/>
+      <w:r>
+        <w:rPr>
+          <w:rFonts w:asciiTheme="minorHAnsi" w:hAnsiTheme="minorHAnsi"/>
+          <w:b/>
+          <w:bCs/>
+        </w:rPr>
+        <w:t>condition</w:t>
+      </w:r>
+      <w:proofErr w:type="spellEnd"/>
+      <w:r>
+        <w:rPr>
+          <w:rFonts w:asciiTheme="minorHAnsi" w:hAnsiTheme="minorHAnsi"/>
+          <w:b/>
+          <w:bCs/>
+        </w:rPr>
+        <w:t>:</w:t>
+      </w:r>
+      <w:r>
+        <w:rPr>
+          <w:rFonts w:asciiTheme="minorHAnsi" w:hAnsiTheme="minorHAnsi"/>
+        </w:rPr>
+        <w:t xml:space="preserve"> L’utente è autenticato.</w:t>
+      </w:r>
+    </w:p>
+    <w:p>
+      <w:pPr>
+        <w:rPr>
+          <w:rFonts w:asciiTheme="minorHAnsi" w:hAnsiTheme="minorHAnsi"/>
+          <w:b/>
+          <w:bCs/>
+        </w:rPr>
+      </w:pPr>
+    </w:p>
+    <w:p>
+      <w:pPr>
+        <w:rPr>
+          <w:rFonts w:asciiTheme="minorHAnsi" w:hAnsiTheme="minorHAnsi"/>
+          <w:b/>
+          <w:bCs/>
+        </w:rPr>
+      </w:pPr>
+      <w:r>
+        <w:rPr>
+          <w:rFonts w:asciiTheme="minorHAnsi" w:hAnsiTheme="minorHAnsi"/>
+          <w:b/>
+          <w:bCs/>
+        </w:rPr>
+        <w:t>Flusso di eventi:</w:t>
+      </w:r>
+    </w:p>
+    <w:p>
+      <w:pPr>
+        <w:pStyle w:val="Paragrafoelenco"/>
+        <w:widowControl/>
+        <w:numPr>
+          <w:ilvl w:val="0"/>
+          <w:numId w:val="17"/>
+        </w:numPr>
+        <w:suppressAutoHyphens w:val="0"/>
+        <w:spacing w:after="160" w:line="278" w:lineRule="auto"/>
+        <w:rPr>
+          <w:rFonts w:asciiTheme="minorHAnsi" w:hAnsiTheme="minorHAnsi"/>
+        </w:rPr>
+      </w:pPr>
+      <w:r>
+        <w:rPr>
+          <w:rFonts w:asciiTheme="minorHAnsi" w:hAnsiTheme="minorHAnsi"/>
+        </w:rPr>
+        <w:t>L’utente preme sul pulsante “Logout”.</w:t>
+      </w:r>
+    </w:p>
+    <w:p>
+      <w:pPr>
+        <w:pStyle w:val="Paragrafoelenco"/>
+        <w:widowControl/>
+        <w:numPr>
+          <w:ilvl w:val="0"/>
+          <w:numId w:val="17"/>
+        </w:numPr>
+        <w:suppressAutoHyphens w:val="0"/>
+        <w:spacing w:after="160" w:line="278" w:lineRule="auto"/>
+        <w:rPr>
+          <w:rFonts w:asciiTheme="minorHAnsi" w:hAnsiTheme="minorHAnsi"/>
+        </w:rPr>
+      </w:pPr>
+      <w:r>
+        <w:rPr>
+          <w:rFonts w:asciiTheme="minorHAnsi" w:hAnsiTheme="minorHAnsi"/>
+        </w:rPr>
+        <w:t>Il sistema invalida la sessione utente.</w:t>
+      </w:r>
+    </w:p>
+    <w:p>
+      <w:pPr>
+        <w:pStyle w:val="Paragrafoelenco"/>
+        <w:widowControl/>
+        <w:numPr>
+          <w:ilvl w:val="0"/>
+          <w:numId w:val="17"/>
+        </w:numPr>
+        <w:suppressAutoHyphens w:val="0"/>
+        <w:spacing w:after="160" w:line="278" w:lineRule="auto"/>
+        <w:rPr>
+          <w:rFonts w:asciiTheme="minorHAnsi" w:hAnsiTheme="minorHAnsi"/>
+        </w:rPr>
+      </w:pPr>
+      <w:r>
+        <w:rPr>
+          <w:rFonts w:asciiTheme="minorHAnsi" w:hAnsiTheme="minorHAnsi"/>
+        </w:rPr>
+        <w:t>Il sistema reindirizza l’utente alla home page.</w:t>
+      </w:r>
+    </w:p>
+    <w:p>
+      <w:pPr>
+        <w:rPr>
+          <w:rFonts w:asciiTheme="minorHAnsi" w:hAnsiTheme="minorHAnsi"/>
+        </w:rPr>
+      </w:pPr>
+      <w:r>
+        <w:rPr>
+          <w:rFonts w:asciiTheme="minorHAnsi" w:hAnsiTheme="minorHAnsi"/>
+          <w:b/>
+          <w:bCs/>
+        </w:rPr>
+        <w:t xml:space="preserve">Exit </w:t>
+      </w:r>
+      <w:proofErr w:type="spellStart"/>
+      <w:r>
+        <w:rPr>
+          <w:rFonts w:asciiTheme="minorHAnsi" w:hAnsiTheme="minorHAnsi"/>
+          <w:b/>
+          <w:bCs/>
+        </w:rPr>
+        <w:t>condition</w:t>
+      </w:r>
+      <w:proofErr w:type="spellEnd"/>
+      <w:r>
+        <w:rPr>
+          <w:rFonts w:asciiTheme="minorHAnsi" w:hAnsiTheme="minorHAnsi"/>
+          <w:b/>
+          <w:bCs/>
+        </w:rPr>
+        <w:t>:</w:t>
+      </w:r>
+      <w:r>
+        <w:rPr>
+          <w:rFonts w:asciiTheme="minorHAnsi" w:hAnsiTheme="minorHAnsi"/>
+        </w:rPr>
+        <w:t xml:space="preserve"> L’utente non è più autenticato e si trova nella home page.</w:t>
+      </w:r>
+    </w:p>
+    <w:p/>
+    <w:p>
+      <w:pPr>
+        <w:rPr>
+          <w:rFonts w:asciiTheme="minorHAnsi" w:hAnsiTheme="minorHAnsi"/>
+          <w:b/>
+          <w:bCs/>
+          <w:sz w:val="28"/>
+          <w:szCs w:val="28"/>
+        </w:rPr>
+      </w:pPr>
+    </w:p>
+    <w:p>
+      <w:pPr>
+        <w:rPr>
+          <w:rFonts w:asciiTheme="minorHAnsi" w:hAnsiTheme="minorHAnsi"/>
+          <w:b/>
+          <w:bCs/>
+          <w:sz w:val="28"/>
+          <w:szCs w:val="28"/>
+        </w:rPr>
+      </w:pPr>
+    </w:p>
+    <w:p>
+      <w:pPr>
+        <w:rPr>
+          <w:rFonts w:asciiTheme="minorHAnsi" w:hAnsiTheme="minorHAnsi"/>
+          <w:b/>
+          <w:bCs/>
+          <w:sz w:val="28"/>
+          <w:szCs w:val="28"/>
+        </w:rPr>
+      </w:pPr>
+    </w:p>
+    <w:p>
+      <w:pPr>
+        <w:rPr>
+          <w:rFonts w:asciiTheme="minorHAnsi" w:hAnsiTheme="minorHAnsi"/>
+          <w:b/>
+          <w:bCs/>
+          <w:sz w:val="28"/>
+          <w:szCs w:val="28"/>
+        </w:rPr>
+      </w:pPr>
+    </w:p>
+    <w:p>
+      <w:pPr>
+        <w:rPr>
+          <w:rFonts w:asciiTheme="minorHAnsi" w:hAnsiTheme="minorHAnsi"/>
+          <w:b/>
+          <w:bCs/>
+          <w:sz w:val="28"/>
+          <w:szCs w:val="28"/>
+        </w:rPr>
+      </w:pPr>
+    </w:p>
+    <w:p>
+      <w:pPr>
+        <w:rPr>
+          <w:rFonts w:asciiTheme="minorHAnsi" w:hAnsiTheme="minorHAnsi"/>
+          <w:b/>
+          <w:bCs/>
+          <w:sz w:val="28"/>
+          <w:szCs w:val="28"/>
+        </w:rPr>
+      </w:pPr>
+    </w:p>
+    <w:p>
+      <w:pPr>
+        <w:rPr>
+          <w:rFonts w:asciiTheme="minorHAnsi" w:hAnsiTheme="minorHAnsi"/>
+          <w:b/>
+          <w:bCs/>
+          <w:sz w:val="28"/>
+          <w:szCs w:val="28"/>
+        </w:rPr>
+      </w:pPr>
+    </w:p>
+    <w:p>
+      <w:pPr>
+        <w:rPr>
+          <w:rFonts w:asciiTheme="minorHAnsi" w:hAnsiTheme="minorHAnsi"/>
+          <w:b/>
+          <w:bCs/>
+          <w:sz w:val="28"/>
+          <w:szCs w:val="28"/>
+        </w:rPr>
+      </w:pPr>
+    </w:p>
+    <w:p>
+      <w:pPr>
+        <w:rPr>
+          <w:rFonts w:asciiTheme="minorHAnsi" w:hAnsiTheme="minorHAnsi"/>
+          <w:b/>
+          <w:bCs/>
+          <w:sz w:val="28"/>
+          <w:szCs w:val="28"/>
+        </w:rPr>
+      </w:pPr>
+    </w:p>
+    <w:p>
+      <w:pPr>
+        <w:rPr>
+          <w:rFonts w:asciiTheme="minorHAnsi" w:hAnsiTheme="minorHAnsi"/>
+          <w:b/>
+          <w:bCs/>
+          <w:sz w:val="28"/>
+          <w:szCs w:val="28"/>
+        </w:rPr>
+      </w:pPr>
+    </w:p>
+    <w:p>
+      <w:pPr>
+        <w:rPr>
+          <w:rFonts w:asciiTheme="minorHAnsi" w:hAnsiTheme="minorHAnsi"/>
+          <w:b/>
+          <w:bCs/>
+          <w:sz w:val="28"/>
+          <w:szCs w:val="28"/>
+        </w:rPr>
+      </w:pPr>
+    </w:p>
+    <w:p>
+      <w:pPr>
+        <w:rPr>
+          <w:rFonts w:asciiTheme="minorHAnsi" w:hAnsiTheme="minorHAnsi"/>
+          <w:b/>
+          <w:bCs/>
+          <w:sz w:val="28"/>
+          <w:szCs w:val="28"/>
+        </w:rPr>
+      </w:pPr>
+    </w:p>
+    <w:p>
+      <w:pPr>
+        <w:rPr>
+          <w:rFonts w:asciiTheme="minorHAnsi" w:hAnsiTheme="minorHAnsi"/>
+          <w:b/>
+          <w:bCs/>
+          <w:sz w:val="28"/>
+          <w:szCs w:val="28"/>
+        </w:rPr>
+      </w:pPr>
+      <w:r>
+        <w:rPr>
+          <w:rFonts w:asciiTheme="minorHAnsi" w:hAnsiTheme="minorHAnsi"/>
+          <w:b/>
+          <w:bCs/>
+          <w:noProof/>
+        </w:rPr>
+        <w:lastRenderedPageBreak/>
+        <w:drawing>
+          <wp:anchor distT="0" distB="0" distL="114300" distR="114300" simplePos="0" relativeHeight="251682816" behindDoc="0" locked="0" layoutInCell="1" allowOverlap="1" wp14:anchorId="19693D97" wp14:editId="2F1FFB18">
+            <wp:simplePos x="0" y="0"/>
+            <wp:positionH relativeFrom="margin">
+              <wp:align>center</wp:align>
+            </wp:positionH>
+            <wp:positionV relativeFrom="paragraph">
+              <wp:posOffset>231371</wp:posOffset>
+            </wp:positionV>
+            <wp:extent cx="4634230" cy="3618865"/>
+            <wp:effectExtent l="0" t="0" r="0" b="635"/>
+            <wp:wrapTopAndBottom/>
+            <wp:docPr id="1801565934" name="Immagine 2"/>
+            <wp:cNvGraphicFramePr>
+              <a:graphicFrameLocks xmlns:a="http://schemas.openxmlformats.org/drawingml/2006/main" noChangeAspect="1"/>
+            </wp:cNvGraphicFramePr>
+            <a:graphic xmlns:a="http://schemas.openxmlformats.org/drawingml/2006/main">
+              <a:graphicData uri="http://schemas.openxmlformats.org/drawingml/2006/picture">
+                <pic:pic xmlns:pic="http://schemas.openxmlformats.org/drawingml/2006/picture">
+                  <pic:nvPicPr>
+                    <pic:cNvPr id="0" name="Picture 2"/>
+                    <pic:cNvPicPr>
+                      <a:picLocks noChangeAspect="1" noChangeArrowheads="1"/>
+                    </pic:cNvPicPr>
+                  </pic:nvPicPr>
+                  <pic:blipFill>
+                    <a:blip r:embed="rId16">
+                      <a:extLst>
+                        <a:ext uri="{28A0092B-C50C-407E-A947-70E740481C1C}">
+                          <a14:useLocalDpi xmlns:a14="http://schemas.microsoft.com/office/drawing/2010/main" val="0"/>
+                        </a:ext>
+                      </a:extLst>
+                    </a:blip>
+                    <a:srcRect/>
+                    <a:stretch>
+                      <a:fillRect/>
+                    </a:stretch>
+                  </pic:blipFill>
+                  <pic:spPr bwMode="auto">
+                    <a:xfrm>
+                      <a:off x="0" y="0"/>
+                      <a:ext cx="4634230" cy="3618865"/>
                     </a:xfrm>
                     <a:prstGeom prst="rect">
                       <a:avLst/>
@@ -13403,405 +13992,6 @@
           <w:sz w:val="28"/>
           <w:szCs w:val="28"/>
         </w:rPr>
-        <w:t>UC3 – Logout</w:t>
-      </w:r>
-    </w:p>
-    <w:p>
-      <w:pPr>
-        <w:rPr>
-          <w:rFonts w:asciiTheme="minorHAnsi" w:hAnsiTheme="minorHAnsi"/>
-        </w:rPr>
-      </w:pPr>
-      <w:r>
-        <w:rPr>
-          <w:rFonts w:asciiTheme="minorHAnsi" w:hAnsiTheme="minorHAnsi"/>
-          <w:b/>
-          <w:bCs/>
-        </w:rPr>
-        <w:t>Attori:</w:t>
-      </w:r>
-      <w:r>
-        <w:rPr>
-          <w:rFonts w:asciiTheme="minorHAnsi" w:hAnsiTheme="minorHAnsi"/>
-        </w:rPr>
-        <w:t xml:space="preserve"> Utente.</w:t>
-      </w:r>
-    </w:p>
-    <w:p>
-      <w:pPr>
-        <w:rPr>
-          <w:rFonts w:asciiTheme="minorHAnsi" w:hAnsiTheme="minorHAnsi"/>
-          <w:b/>
-          <w:bCs/>
-        </w:rPr>
-      </w:pPr>
-    </w:p>
-    <w:p>
-      <w:pPr>
-        <w:rPr>
-          <w:rFonts w:asciiTheme="minorHAnsi" w:hAnsiTheme="minorHAnsi"/>
-        </w:rPr>
-      </w:pPr>
-      <w:r>
-        <w:rPr>
-          <w:rFonts w:asciiTheme="minorHAnsi" w:hAnsiTheme="minorHAnsi"/>
-          <w:b/>
-          <w:bCs/>
-        </w:rPr>
-        <w:t xml:space="preserve">Entry </w:t>
-      </w:r>
-      <w:proofErr w:type="spellStart"/>
-      <w:r>
-        <w:rPr>
-          <w:rFonts w:asciiTheme="minorHAnsi" w:hAnsiTheme="minorHAnsi"/>
-          <w:b/>
-          <w:bCs/>
-        </w:rPr>
-        <w:t>condition</w:t>
-      </w:r>
-      <w:proofErr w:type="spellEnd"/>
-      <w:r>
-        <w:rPr>
-          <w:rFonts w:asciiTheme="minorHAnsi" w:hAnsiTheme="minorHAnsi"/>
-          <w:b/>
-          <w:bCs/>
-        </w:rPr>
-        <w:t>:</w:t>
-      </w:r>
-      <w:r>
-        <w:rPr>
-          <w:rFonts w:asciiTheme="minorHAnsi" w:hAnsiTheme="minorHAnsi"/>
-        </w:rPr>
-        <w:t xml:space="preserve"> L’utente è autenticato.</w:t>
-      </w:r>
-    </w:p>
-    <w:p>
-      <w:pPr>
-        <w:rPr>
-          <w:rFonts w:asciiTheme="minorHAnsi" w:hAnsiTheme="minorHAnsi"/>
-          <w:b/>
-          <w:bCs/>
-        </w:rPr>
-      </w:pPr>
-    </w:p>
-    <w:p>
-      <w:pPr>
-        <w:rPr>
-          <w:rFonts w:asciiTheme="minorHAnsi" w:hAnsiTheme="minorHAnsi"/>
-          <w:b/>
-          <w:bCs/>
-        </w:rPr>
-      </w:pPr>
-      <w:r>
-        <w:rPr>
-          <w:rFonts w:asciiTheme="minorHAnsi" w:hAnsiTheme="minorHAnsi"/>
-          <w:b/>
-          <w:bCs/>
-        </w:rPr>
-        <w:t>Flusso di eventi:</w:t>
-      </w:r>
-    </w:p>
-    <w:p>
-      <w:pPr>
-        <w:pStyle w:val="Paragrafoelenco"/>
-        <w:widowControl/>
-        <w:numPr>
-          <w:ilvl w:val="0"/>
-          <w:numId w:val="17"/>
-        </w:numPr>
-        <w:suppressAutoHyphens w:val="0"/>
-        <w:spacing w:after="160" w:line="278" w:lineRule="auto"/>
-        <w:rPr>
-          <w:rFonts w:asciiTheme="minorHAnsi" w:hAnsiTheme="minorHAnsi"/>
-        </w:rPr>
-      </w:pPr>
-      <w:r>
-        <w:rPr>
-          <w:rFonts w:asciiTheme="minorHAnsi" w:hAnsiTheme="minorHAnsi"/>
-        </w:rPr>
-        <w:t>L’utente preme sul pulsante “Logout”.</w:t>
-      </w:r>
-    </w:p>
-    <w:p>
-      <w:pPr>
-        <w:pStyle w:val="Paragrafoelenco"/>
-        <w:widowControl/>
-        <w:numPr>
-          <w:ilvl w:val="0"/>
-          <w:numId w:val="17"/>
-        </w:numPr>
-        <w:suppressAutoHyphens w:val="0"/>
-        <w:spacing w:after="160" w:line="278" w:lineRule="auto"/>
-        <w:rPr>
-          <w:rFonts w:asciiTheme="minorHAnsi" w:hAnsiTheme="minorHAnsi"/>
-        </w:rPr>
-      </w:pPr>
-      <w:r>
-        <w:rPr>
-          <w:rFonts w:asciiTheme="minorHAnsi" w:hAnsiTheme="minorHAnsi"/>
-        </w:rPr>
-        <w:t>Il sistema invalida la sessione utente.</w:t>
-      </w:r>
-    </w:p>
-    <w:p>
-      <w:pPr>
-        <w:pStyle w:val="Paragrafoelenco"/>
-        <w:widowControl/>
-        <w:numPr>
-          <w:ilvl w:val="0"/>
-          <w:numId w:val="17"/>
-        </w:numPr>
-        <w:suppressAutoHyphens w:val="0"/>
-        <w:spacing w:after="160" w:line="278" w:lineRule="auto"/>
-        <w:rPr>
-          <w:rFonts w:asciiTheme="minorHAnsi" w:hAnsiTheme="minorHAnsi"/>
-        </w:rPr>
-      </w:pPr>
-      <w:r>
-        <w:rPr>
-          <w:rFonts w:asciiTheme="minorHAnsi" w:hAnsiTheme="minorHAnsi"/>
-        </w:rPr>
-        <w:t>Il sistema reindirizza l’utente alla home page.</w:t>
-      </w:r>
-    </w:p>
-    <w:p>
-      <w:pPr>
-        <w:rPr>
-          <w:rFonts w:asciiTheme="minorHAnsi" w:hAnsiTheme="minorHAnsi"/>
-        </w:rPr>
-      </w:pPr>
-      <w:r>
-        <w:rPr>
-          <w:rFonts w:asciiTheme="minorHAnsi" w:hAnsiTheme="minorHAnsi"/>
-          <w:b/>
-          <w:bCs/>
-        </w:rPr>
-        <w:t xml:space="preserve">Exit </w:t>
-      </w:r>
-      <w:proofErr w:type="spellStart"/>
-      <w:r>
-        <w:rPr>
-          <w:rFonts w:asciiTheme="minorHAnsi" w:hAnsiTheme="minorHAnsi"/>
-          <w:b/>
-          <w:bCs/>
-        </w:rPr>
-        <w:t>condition</w:t>
-      </w:r>
-      <w:proofErr w:type="spellEnd"/>
-      <w:r>
-        <w:rPr>
-          <w:rFonts w:asciiTheme="minorHAnsi" w:hAnsiTheme="minorHAnsi"/>
-          <w:b/>
-          <w:bCs/>
-        </w:rPr>
-        <w:t>:</w:t>
-      </w:r>
-      <w:r>
-        <w:rPr>
-          <w:rFonts w:asciiTheme="minorHAnsi" w:hAnsiTheme="minorHAnsi"/>
-        </w:rPr>
-        <w:t xml:space="preserve"> L’utente non è più autenticato e si trova nella home page.</w:t>
-      </w:r>
-    </w:p>
-    <w:p/>
-    <w:p>
-      <w:pPr>
-        <w:rPr>
-          <w:rFonts w:asciiTheme="minorHAnsi" w:hAnsiTheme="minorHAnsi"/>
-          <w:b/>
-          <w:bCs/>
-          <w:sz w:val="28"/>
-          <w:szCs w:val="28"/>
-        </w:rPr>
-      </w:pPr>
-    </w:p>
-    <w:p>
-      <w:pPr>
-        <w:rPr>
-          <w:rFonts w:asciiTheme="minorHAnsi" w:hAnsiTheme="minorHAnsi"/>
-          <w:b/>
-          <w:bCs/>
-          <w:sz w:val="28"/>
-          <w:szCs w:val="28"/>
-        </w:rPr>
-      </w:pPr>
-    </w:p>
-    <w:p>
-      <w:pPr>
-        <w:rPr>
-          <w:rFonts w:asciiTheme="minorHAnsi" w:hAnsiTheme="minorHAnsi"/>
-          <w:b/>
-          <w:bCs/>
-          <w:sz w:val="28"/>
-          <w:szCs w:val="28"/>
-        </w:rPr>
-      </w:pPr>
-    </w:p>
-    <w:p>
-      <w:pPr>
-        <w:rPr>
-          <w:rFonts w:asciiTheme="minorHAnsi" w:hAnsiTheme="minorHAnsi"/>
-          <w:b/>
-          <w:bCs/>
-          <w:sz w:val="28"/>
-          <w:szCs w:val="28"/>
-        </w:rPr>
-      </w:pPr>
-    </w:p>
-    <w:p>
-      <w:pPr>
-        <w:rPr>
-          <w:rFonts w:asciiTheme="minorHAnsi" w:hAnsiTheme="minorHAnsi"/>
-          <w:b/>
-          <w:bCs/>
-          <w:sz w:val="28"/>
-          <w:szCs w:val="28"/>
-        </w:rPr>
-      </w:pPr>
-    </w:p>
-    <w:p>
-      <w:pPr>
-        <w:rPr>
-          <w:rFonts w:asciiTheme="minorHAnsi" w:hAnsiTheme="minorHAnsi"/>
-          <w:b/>
-          <w:bCs/>
-          <w:sz w:val="28"/>
-          <w:szCs w:val="28"/>
-        </w:rPr>
-      </w:pPr>
-    </w:p>
-    <w:p>
-      <w:pPr>
-        <w:rPr>
-          <w:rFonts w:asciiTheme="minorHAnsi" w:hAnsiTheme="minorHAnsi"/>
-          <w:b/>
-          <w:bCs/>
-          <w:sz w:val="28"/>
-          <w:szCs w:val="28"/>
-        </w:rPr>
-      </w:pPr>
-    </w:p>
-    <w:p>
-      <w:pPr>
-        <w:rPr>
-          <w:rFonts w:asciiTheme="minorHAnsi" w:hAnsiTheme="minorHAnsi"/>
-          <w:b/>
-          <w:bCs/>
-          <w:sz w:val="28"/>
-          <w:szCs w:val="28"/>
-        </w:rPr>
-      </w:pPr>
-    </w:p>
-    <w:p>
-      <w:pPr>
-        <w:rPr>
-          <w:rFonts w:asciiTheme="minorHAnsi" w:hAnsiTheme="minorHAnsi"/>
-          <w:b/>
-          <w:bCs/>
-          <w:sz w:val="28"/>
-          <w:szCs w:val="28"/>
-        </w:rPr>
-      </w:pPr>
-    </w:p>
-    <w:p>
-      <w:pPr>
-        <w:rPr>
-          <w:rFonts w:asciiTheme="minorHAnsi" w:hAnsiTheme="minorHAnsi"/>
-          <w:b/>
-          <w:bCs/>
-          <w:sz w:val="28"/>
-          <w:szCs w:val="28"/>
-        </w:rPr>
-      </w:pPr>
-    </w:p>
-    <w:p>
-      <w:pPr>
-        <w:rPr>
-          <w:rFonts w:asciiTheme="minorHAnsi" w:hAnsiTheme="minorHAnsi"/>
-          <w:b/>
-          <w:bCs/>
-          <w:sz w:val="28"/>
-          <w:szCs w:val="28"/>
-        </w:rPr>
-      </w:pPr>
-      <w:r>
-        <w:rPr>
-          <w:rFonts w:asciiTheme="minorHAnsi" w:hAnsiTheme="minorHAnsi"/>
-          <w:b/>
-          <w:bCs/>
-          <w:noProof/>
-        </w:rPr>
-        <w:drawing>
-          <wp:anchor distT="0" distB="0" distL="114300" distR="114300" simplePos="0" relativeHeight="251663360" behindDoc="0" locked="0" layoutInCell="1" allowOverlap="1" wp14:anchorId="03F6E958" wp14:editId="6E02D342">
-            <wp:simplePos x="0" y="0"/>
-            <wp:positionH relativeFrom="margin">
-              <wp:align>center</wp:align>
-            </wp:positionH>
-            <wp:positionV relativeFrom="paragraph">
-              <wp:posOffset>244475</wp:posOffset>
-            </wp:positionV>
-            <wp:extent cx="4824730" cy="3034030"/>
-            <wp:effectExtent l="0" t="0" r="0" b="0"/>
-            <wp:wrapTopAndBottom/>
-            <wp:docPr id="471821478" name="Immagine 4"/>
-            <wp:cNvGraphicFramePr>
-              <a:graphicFrameLocks xmlns:a="http://schemas.openxmlformats.org/drawingml/2006/main" noChangeAspect="1"/>
-            </wp:cNvGraphicFramePr>
-            <a:graphic xmlns:a="http://schemas.openxmlformats.org/drawingml/2006/main">
-              <a:graphicData uri="http://schemas.openxmlformats.org/drawingml/2006/picture">
-                <pic:pic xmlns:pic="http://schemas.openxmlformats.org/drawingml/2006/picture">
-                  <pic:nvPicPr>
-                    <pic:cNvPr id="0" name="Picture 4"/>
-                    <pic:cNvPicPr>
-                      <a:picLocks noChangeAspect="1" noChangeArrowheads="1"/>
-                    </pic:cNvPicPr>
-                  </pic:nvPicPr>
-                  <pic:blipFill>
-                    <a:blip r:embed="rId16">
-                      <a:extLst>
-                        <a:ext uri="{28A0092B-C50C-407E-A947-70E740481C1C}">
-                          <a14:useLocalDpi xmlns:a14="http://schemas.microsoft.com/office/drawing/2010/main" val="0"/>
-                        </a:ext>
-                      </a:extLst>
-                    </a:blip>
-                    <a:srcRect/>
-                    <a:stretch>
-                      <a:fillRect/>
-                    </a:stretch>
-                  </pic:blipFill>
-                  <pic:spPr bwMode="auto">
-                    <a:xfrm>
-                      <a:off x="0" y="0"/>
-                      <a:ext cx="4824730" cy="3034030"/>
-                    </a:xfrm>
-                    <a:prstGeom prst="rect">
-                      <a:avLst/>
-                    </a:prstGeom>
-                    <a:noFill/>
-                    <a:ln>
-                      <a:noFill/>
-                    </a:ln>
-                  </pic:spPr>
-                </pic:pic>
-              </a:graphicData>
-            </a:graphic>
-            <wp14:sizeRelH relativeFrom="margin">
-              <wp14:pctWidth>0</wp14:pctWidth>
-            </wp14:sizeRelH>
-            <wp14:sizeRelV relativeFrom="margin">
-              <wp14:pctHeight>0</wp14:pctHeight>
-            </wp14:sizeRelV>
-          </wp:anchor>
-        </w:drawing>
-      </w:r>
-      <w:r>
-        <w:rPr>
-          <w:rFonts w:asciiTheme="minorHAnsi" w:hAnsiTheme="minorHAnsi"/>
-          <w:b/>
-          <w:bCs/>
-          <w:sz w:val="28"/>
-          <w:szCs w:val="28"/>
-        </w:rPr>
         <w:t>UC4 – Ricerca di un’edizione tramite filtri nel catalogo</w:t>
       </w:r>
     </w:p>
@@ -13809,6 +13999,8 @@
       <w:pPr>
         <w:rPr>
           <w:rFonts w:asciiTheme="minorHAnsi" w:hAnsiTheme="minorHAnsi"/>
+          <w:b/>
+          <w:bCs/>
         </w:rPr>
       </w:pPr>
       <w:r>
@@ -15294,18 +15486,18 @@
         </w:rPr>
         <w:lastRenderedPageBreak/>
         <w:drawing>
-          <wp:anchor distT="0" distB="0" distL="114300" distR="114300" simplePos="0" relativeHeight="251661312" behindDoc="0" locked="0" layoutInCell="1" allowOverlap="1" wp14:anchorId="7DC9B53C" wp14:editId="42B481D5">
+          <wp:anchor distT="0" distB="0" distL="114300" distR="114300" simplePos="0" relativeHeight="251683840" behindDoc="0" locked="0" layoutInCell="1" allowOverlap="1" wp14:anchorId="2254ADEC" wp14:editId="391B0EB6">
             <wp:simplePos x="0" y="0"/>
             <wp:positionH relativeFrom="margin">
               <wp:align>center</wp:align>
             </wp:positionH>
             <wp:positionV relativeFrom="paragraph">
-              <wp:posOffset>331412</wp:posOffset>
+              <wp:posOffset>245629</wp:posOffset>
             </wp:positionV>
-            <wp:extent cx="4363720" cy="1398270"/>
+            <wp:extent cx="5638800" cy="1454785"/>
             <wp:effectExtent l="0" t="0" r="0" b="0"/>
             <wp:wrapTopAndBottom/>
-            <wp:docPr id="455970339" name="Immagine 6"/>
+            <wp:docPr id="2135250380" name="Immagine 3"/>
             <wp:cNvGraphicFramePr>
               <a:graphicFrameLocks xmlns:a="http://schemas.openxmlformats.org/drawingml/2006/main" noChangeAspect="1"/>
             </wp:cNvGraphicFramePr>
@@ -15313,7 +15505,7 @@
               <a:graphicData uri="http://schemas.openxmlformats.org/drawingml/2006/picture">
                 <pic:pic xmlns:pic="http://schemas.openxmlformats.org/drawingml/2006/picture">
                   <pic:nvPicPr>
-                    <pic:cNvPr id="0" name="Picture 6"/>
+                    <pic:cNvPr id="0" name="Picture 3"/>
                     <pic:cNvPicPr>
                       <a:picLocks noChangeAspect="1" noChangeArrowheads="1"/>
                     </pic:cNvPicPr>
@@ -15334,7 +15526,7 @@
                   <pic:spPr bwMode="auto">
                     <a:xfrm>
                       <a:off x="0" y="0"/>
-                      <a:ext cx="4363720" cy="1398270"/>
+                      <a:ext cx="5638800" cy="1454785"/>
                     </a:xfrm>
                     <a:prstGeom prst="rect">
                       <a:avLst/>
@@ -15347,12 +15539,6 @@
                 </pic:pic>
               </a:graphicData>
             </a:graphic>
-            <wp14:sizeRelH relativeFrom="margin">
-              <wp14:pctWidth>0</wp14:pctWidth>
-            </wp14:sizeRelH>
-            <wp14:sizeRelV relativeFrom="margin">
-              <wp14:pctHeight>0</wp14:pctHeight>
-            </wp14:sizeRelV>
           </wp:anchor>
         </w:drawing>
       </w:r>
@@ -17865,17 +18051,6 @@
           <w:szCs w:val="28"/>
         </w:rPr>
       </w:pPr>
-    </w:p>
-    <w:p>
-      <w:pPr>
-        <w:rPr>
-          <w:rFonts w:asciiTheme="minorHAnsi" w:hAnsiTheme="minorHAnsi"/>
-          <w:b/>
-          <w:bCs/>
-          <w:sz w:val="28"/>
-          <w:szCs w:val="28"/>
-        </w:rPr>
-      </w:pPr>
       <w:r>
         <w:rPr>
           <w:rFonts w:asciiTheme="minorHAnsi" w:hAnsiTheme="minorHAnsi"/>
@@ -24339,7 +24514,7 @@
                     </pic:cNvPicPr>
                   </pic:nvPicPr>
                   <pic:blipFill>
-                    <a:blip r:embed="rId18">
+                    <a:blip r:embed="rId30">
                       <a:extLst>
                         <a:ext uri="{28A0092B-C50C-407E-A947-70E740481C1C}">
                           <a14:useLocalDpi xmlns:a14="http://schemas.microsoft.com/office/drawing/2010/main" val="0"/>
@@ -24841,15 +25016,15 @@
           <w:noProof/>
         </w:rPr>
         <w:drawing>
-          <wp:anchor distT="0" distB="0" distL="114300" distR="114300" simplePos="0" relativeHeight="251676672" behindDoc="0" locked="0" layoutInCell="1" allowOverlap="1" wp14:anchorId="73830ACD" wp14:editId="71D2047E">
+          <wp:anchor distT="0" distB="0" distL="114300" distR="114300" simplePos="0" relativeHeight="251676672" behindDoc="0" locked="0" layoutInCell="1" allowOverlap="1" wp14:anchorId="73830ACD" wp14:editId="188BF163">
             <wp:simplePos x="0" y="0"/>
             <wp:positionH relativeFrom="page">
-              <wp:align>left</wp:align>
+              <wp:posOffset>0</wp:posOffset>
             </wp:positionH>
             <wp:positionV relativeFrom="paragraph">
-              <wp:posOffset>218960</wp:posOffset>
+              <wp:posOffset>245110</wp:posOffset>
             </wp:positionV>
-            <wp:extent cx="7647918" cy="5095702"/>
+            <wp:extent cx="7647305" cy="5037455"/>
             <wp:effectExtent l="0" t="0" r="0" b="0"/>
             <wp:wrapTopAndBottom/>
             <wp:docPr id="1323086350" name="Immagine 21"/>
@@ -24860,20 +25035,13 @@
               <a:graphicData uri="http://schemas.openxmlformats.org/drawingml/2006/picture">
                 <pic:pic xmlns:pic="http://schemas.openxmlformats.org/drawingml/2006/picture">
                   <pic:nvPicPr>
-                    <pic:cNvPr id="0" name="Picture 21"/>
+                    <pic:cNvPr id="1323086350" name="Immagine 21"/>
                     <pic:cNvPicPr>
                       <a:picLocks noChangeAspect="1" noChangeArrowheads="1"/>
                     </pic:cNvPicPr>
                   </pic:nvPicPr>
                   <pic:blipFill>
-                    <a:blip r:embed="rId30">
-                      <a:extLst>
-                        <a:ext uri="{28A0092B-C50C-407E-A947-70E740481C1C}">
-                          <a14:useLocalDpi xmlns:a14="http://schemas.microsoft.com/office/drawing/2010/main" val="0"/>
-                        </a:ext>
-                      </a:extLst>
-                    </a:blip>
-                    <a:srcRect/>
+                    <a:blip r:embed="rId31"/>
                     <a:stretch>
                       <a:fillRect/>
                     </a:stretch>
@@ -24881,7 +25049,7 @@
                   <pic:spPr bwMode="auto">
                     <a:xfrm>
                       <a:off x="0" y="0"/>
-                      <a:ext cx="7647918" cy="5095702"/>
+                      <a:ext cx="7647305" cy="5037455"/>
                     </a:xfrm>
                     <a:prstGeom prst="rect">
                       <a:avLst/>
@@ -25076,7 +25244,7 @@
                     </pic:cNvPicPr>
                   </pic:nvPicPr>
                   <pic:blipFill>
-                    <a:blip r:embed="rId31">
+                    <a:blip r:embed="rId32">
                       <a:extLst>
                         <a:ext uri="{28A0092B-C50C-407E-A947-70E740481C1C}">
                           <a14:useLocalDpi xmlns:a14="http://schemas.microsoft.com/office/drawing/2010/main" val="0"/>
@@ -25277,7 +25445,7 @@
                     </pic:cNvPicPr>
                   </pic:nvPicPr>
                   <pic:blipFill>
-                    <a:blip r:embed="rId32">
+                    <a:blip r:embed="rId33">
                       <a:extLst>
                         <a:ext uri="{28A0092B-C50C-407E-A947-70E740481C1C}">
                           <a14:useLocalDpi xmlns:a14="http://schemas.microsoft.com/office/drawing/2010/main" val="0"/>
@@ -25484,15 +25652,15 @@
         </w:rPr>
         <w:lastRenderedPageBreak/>
         <w:drawing>
-          <wp:anchor distT="0" distB="0" distL="114300" distR="114300" simplePos="0" relativeHeight="251679744" behindDoc="0" locked="0" layoutInCell="1" allowOverlap="1" wp14:anchorId="0B61E005" wp14:editId="4D338FB9">
+          <wp:anchor distT="0" distB="0" distL="114300" distR="114300" simplePos="0" relativeHeight="251679744" behindDoc="0" locked="0" layoutInCell="1" allowOverlap="1" wp14:anchorId="0B61E005" wp14:editId="4CEAD106">
             <wp:simplePos x="0" y="0"/>
             <wp:positionH relativeFrom="page">
-              <wp:align>left</wp:align>
+              <wp:posOffset>0</wp:posOffset>
             </wp:positionH>
             <wp:positionV relativeFrom="paragraph">
-              <wp:posOffset>231486</wp:posOffset>
+              <wp:posOffset>337820</wp:posOffset>
             </wp:positionV>
-            <wp:extent cx="7562215" cy="4294505"/>
+            <wp:extent cx="7562215" cy="4082415"/>
             <wp:effectExtent l="0" t="0" r="635" b="0"/>
             <wp:wrapTopAndBottom/>
             <wp:docPr id="157626701" name="Immagine 24"/>
@@ -25503,20 +25671,13 @@
               <a:graphicData uri="http://schemas.openxmlformats.org/drawingml/2006/picture">
                 <pic:pic xmlns:pic="http://schemas.openxmlformats.org/drawingml/2006/picture">
                   <pic:nvPicPr>
-                    <pic:cNvPr id="0" name="Picture 27"/>
+                    <pic:cNvPr id="157626701" name="Immagine 24"/>
                     <pic:cNvPicPr>
                       <a:picLocks noChangeAspect="1" noChangeArrowheads="1"/>
                     </pic:cNvPicPr>
                   </pic:nvPicPr>
                   <pic:blipFill>
-                    <a:blip r:embed="rId33">
-                      <a:extLst>
-                        <a:ext uri="{28A0092B-C50C-407E-A947-70E740481C1C}">
-                          <a14:useLocalDpi xmlns:a14="http://schemas.microsoft.com/office/drawing/2010/main" val="0"/>
-                        </a:ext>
-                      </a:extLst>
-                    </a:blip>
-                    <a:srcRect/>
+                    <a:blip r:embed="rId34"/>
                     <a:stretch>
                       <a:fillRect/>
                     </a:stretch>
@@ -25524,7 +25685,7 @@
                   <pic:spPr bwMode="auto">
                     <a:xfrm>
                       <a:off x="0" y="0"/>
-                      <a:ext cx="7562215" cy="4294505"/>
+                      <a:ext cx="7562215" cy="4082415"/>
                     </a:xfrm>
                     <a:prstGeom prst="rect">
                       <a:avLst/>
@@ -25792,7 +25953,7 @@
                     </pic:cNvPicPr>
                   </pic:nvPicPr>
                   <pic:blipFill>
-                    <a:blip r:embed="rId34">
+                    <a:blip r:embed="rId35">
                       <a:extLst>
                         <a:ext uri="{28A0092B-C50C-407E-A947-70E740481C1C}">
                           <a14:useLocalDpi xmlns:a14="http://schemas.microsoft.com/office/drawing/2010/main" val="0"/>

</xml_diff>

<commit_message>
Aggiustati alcuni flussi e sottocasi
</commit_message>
<xml_diff>
--- a/Documents/02_NovaBiblioteca_RAD.docx
+++ b/Documents/02_NovaBiblioteca_RAD.docx
@@ -1635,14 +1635,7 @@
                 <w:rFonts w:asciiTheme="minorHAnsi" w:hAnsiTheme="minorHAnsi"/>
                 <w:sz w:val="20"/>
               </w:rPr>
-              <w:t xml:space="preserve"> </w:t>
-            </w:r>
-            <w:r>
-              <w:rPr>
-                <w:rFonts w:asciiTheme="minorHAnsi" w:hAnsiTheme="minorHAnsi"/>
-                <w:sz w:val="20"/>
-              </w:rPr>
-              <w:t>del RAD</w:t>
+              <w:t xml:space="preserve"> del RAD</w:t>
             </w:r>
           </w:p>
         </w:tc>
@@ -2137,7 +2130,6 @@
           <w:lang w:val="en-US"/>
         </w:rPr>
       </w:pPr>
-      <w:proofErr w:type="spellStart"/>
       <w:r>
         <w:rPr>
           <w:rFonts w:asciiTheme="minorHAnsi" w:hAnsiTheme="minorHAnsi"/>
@@ -2146,7 +2138,6 @@
         <w:lastRenderedPageBreak/>
         <w:t>Indice</w:t>
       </w:r>
-      <w:proofErr w:type="spellEnd"/>
     </w:p>
     <w:p>
       <w:pPr>
@@ -5181,9 +5172,8 @@
           <w:iCs w:val="0"/>
           <w:lang w:val="en-US"/>
         </w:rPr>
-        <w:t xml:space="preserve">Objectives and success criteria </w:t>
-      </w:r>
-      <w:proofErr w:type="gramStart"/>
+        <w:t>Objectives and success criteria o</w:t>
+      </w:r>
       <w:r>
         <w:rPr>
           <w:rFonts w:asciiTheme="minorHAnsi" w:hAnsiTheme="minorHAnsi"/>
@@ -5191,26 +5181,7 @@
           <w:iCs w:val="0"/>
           <w:lang w:val="en-US"/>
         </w:rPr>
-        <w:t>o</w:t>
-      </w:r>
-      <w:r>
-        <w:rPr>
-          <w:rFonts w:asciiTheme="minorHAnsi" w:hAnsiTheme="minorHAnsi"/>
-          <w:i w:val="0"/>
-          <w:iCs w:val="0"/>
-          <w:lang w:val="en-US"/>
-        </w:rPr>
-        <w:t>f</w:t>
-      </w:r>
-      <w:proofErr w:type="gramEnd"/>
-      <w:r>
-        <w:rPr>
-          <w:rFonts w:asciiTheme="minorHAnsi" w:hAnsiTheme="minorHAnsi"/>
-          <w:i w:val="0"/>
-          <w:iCs w:val="0"/>
-          <w:lang w:val="en-US"/>
-        </w:rPr>
-        <w:t xml:space="preserve"> the project</w:t>
+        <w:t>f the project</w:t>
       </w:r>
       <w:bookmarkEnd w:id="3"/>
     </w:p>
@@ -21481,16 +21452,34 @@
           <w:lang w:eastAsia="en-US"/>
           <w14:ligatures w14:val="standardContextual"/>
         </w:rPr>
-        <w:t>, categorie e lingua) l’edizione</w:t>
-      </w:r>
-      <w:r>
-        <w:rPr>
-          <w:rFonts w:asciiTheme="minorHAnsi" w:eastAsiaTheme="minorHAnsi" w:hAnsiTheme="minorHAnsi" w:cstheme="minorBidi"/>
-          <w:kern w:val="2"/>
-          <w:lang w:eastAsia="en-US"/>
-          <w14:ligatures w14:val="standardContextual"/>
-        </w:rPr>
-        <w:t xml:space="preserve"> preme il pulsante “Modifica” accanto all’edizione che vuole modificare.</w:t>
+        <w:t>, categorie e lingua)</w:t>
+      </w:r>
+      <w:r>
+        <w:rPr>
+          <w:rFonts w:asciiTheme="minorHAnsi" w:eastAsiaTheme="minorHAnsi" w:hAnsiTheme="minorHAnsi" w:cstheme="minorBidi"/>
+          <w:kern w:val="2"/>
+          <w:lang w:eastAsia="en-US"/>
+          <w14:ligatures w14:val="standardContextual"/>
+        </w:rPr>
+        <w:t>,</w:t>
+      </w:r>
+      <w:r>
+        <w:rPr>
+          <w:rFonts w:asciiTheme="minorHAnsi" w:eastAsiaTheme="minorHAnsi" w:hAnsiTheme="minorHAnsi" w:cstheme="minorBidi"/>
+          <w:kern w:val="2"/>
+          <w:lang w:eastAsia="en-US"/>
+          <w14:ligatures w14:val="standardContextual"/>
+        </w:rPr>
+        <w:t xml:space="preserve"> l’edizione</w:t>
+      </w:r>
+      <w:r>
+        <w:rPr>
+          <w:rFonts w:asciiTheme="minorHAnsi" w:eastAsiaTheme="minorHAnsi" w:hAnsiTheme="minorHAnsi" w:cstheme="minorBidi"/>
+          <w:kern w:val="2"/>
+          <w:lang w:eastAsia="en-US"/>
+          <w14:ligatures w14:val="standardContextual"/>
+        </w:rPr>
+        <w:t>.</w:t>
       </w:r>
     </w:p>
     <w:p>
@@ -21517,6 +21506,42 @@
           <w:lang w:eastAsia="en-US"/>
           <w14:ligatures w14:val="standardContextual"/>
         </w:rPr>
+        <w:t xml:space="preserve">L’operatore </w:t>
+      </w:r>
+      <w:r>
+        <w:rPr>
+          <w:rFonts w:asciiTheme="minorHAnsi" w:eastAsiaTheme="minorHAnsi" w:hAnsiTheme="minorHAnsi" w:cstheme="minorBidi"/>
+          <w:kern w:val="2"/>
+          <w:lang w:eastAsia="en-US"/>
+          <w14:ligatures w14:val="standardContextual"/>
+        </w:rPr>
+        <w:t>preme il pulsante “Modifica” accanto all’edizione che vuole modificare.</w:t>
+      </w:r>
+    </w:p>
+    <w:p>
+      <w:pPr>
+        <w:widowControl/>
+        <w:numPr>
+          <w:ilvl w:val="0"/>
+          <w:numId w:val="28"/>
+        </w:numPr>
+        <w:suppressAutoHyphens w:val="0"/>
+        <w:spacing w:after="100" w:afterAutospacing="1" w:line="278" w:lineRule="auto"/>
+        <w:contextualSpacing/>
+        <w:rPr>
+          <w:rFonts w:asciiTheme="minorHAnsi" w:eastAsiaTheme="minorHAnsi" w:hAnsiTheme="minorHAnsi" w:cstheme="minorBidi"/>
+          <w:kern w:val="2"/>
+          <w:lang w:eastAsia="en-US"/>
+          <w14:ligatures w14:val="standardContextual"/>
+        </w:rPr>
+      </w:pPr>
+      <w:r>
+        <w:rPr>
+          <w:rFonts w:asciiTheme="minorHAnsi" w:eastAsiaTheme="minorHAnsi" w:hAnsiTheme="minorHAnsi" w:cstheme="minorBidi"/>
+          <w:kern w:val="2"/>
+          <w:lang w:eastAsia="en-US"/>
+          <w14:ligatures w14:val="standardContextual"/>
+        </w:rPr>
         <w:t>Il sistema reindirizza l’operatore in una pagina</w:t>
       </w:r>
       <w:r>
@@ -22216,7 +22241,7 @@
         <w:rPr>
           <w:rFonts w:asciiTheme="minorHAnsi" w:hAnsiTheme="minorHAnsi"/>
         </w:rPr>
-        <w:t>4</w:t>
+        <w:t>5</w:t>
       </w:r>
       <w:r>
         <w:rPr>
@@ -22228,7 +22253,7 @@
         <w:rPr>
           <w:rFonts w:asciiTheme="minorHAnsi" w:hAnsiTheme="minorHAnsi"/>
         </w:rPr>
-        <w:t>6</w:t>
+        <w:t>7</w:t>
       </w:r>
       <w:r>
         <w:rPr>
@@ -22309,16 +22334,16 @@
           <w:lang w:eastAsia="en-US"/>
           <w14:ligatures w14:val="standardContextual"/>
         </w:rPr>
-        <w:t>7</w:t>
-      </w:r>
-      <w:r>
-        <w:rPr>
-          <w:rFonts w:asciiTheme="minorHAnsi" w:eastAsiaTheme="minorHAnsi" w:hAnsiTheme="minorHAnsi" w:cstheme="minorBidi"/>
-          <w:kern w:val="2"/>
-          <w:lang w:eastAsia="en-US"/>
-          <w14:ligatures w14:val="standardContextual"/>
-        </w:rPr>
-        <w:t xml:space="preserve"> il sistema rileva delle informazioni non valide, viene eseguito il caso d’uso </w:t>
+        <w:t xml:space="preserve">8 </w:t>
+      </w:r>
+      <w:r>
+        <w:rPr>
+          <w:rFonts w:asciiTheme="minorHAnsi" w:eastAsiaTheme="minorHAnsi" w:hAnsiTheme="minorHAnsi" w:cstheme="minorBidi"/>
+          <w:kern w:val="2"/>
+          <w:lang w:eastAsia="en-US"/>
+          <w14:ligatures w14:val="standardContextual"/>
+        </w:rPr>
+        <w:t xml:space="preserve">il sistema rileva delle informazioni non valide, viene eseguito il caso d’uso </w:t>
       </w:r>
       <w:r>
         <w:rPr>
@@ -23629,16 +23654,16 @@
           <w:lang w:eastAsia="en-US"/>
           <w14:ligatures w14:val="standardContextual"/>
         </w:rPr>
-        <w:t xml:space="preserve">, categorie e lingua) e </w:t>
-      </w:r>
-      <w:r>
-        <w:rPr>
-          <w:rFonts w:asciiTheme="minorHAnsi" w:eastAsiaTheme="minorHAnsi" w:hAnsiTheme="minorHAnsi" w:cstheme="minorBidi"/>
-          <w:kern w:val="2"/>
-          <w:lang w:eastAsia="en-US"/>
-          <w14:ligatures w14:val="standardContextual"/>
-        </w:rPr>
-        <w:t>preme il pulsante “Copie” accanto all’edizione per la quale vuole aggiungere una copia.</w:t>
+        <w:t>, categorie e lingua)</w:t>
+      </w:r>
+      <w:r>
+        <w:rPr>
+          <w:rFonts w:asciiTheme="minorHAnsi" w:eastAsiaTheme="minorHAnsi" w:hAnsiTheme="minorHAnsi" w:cstheme="minorBidi"/>
+          <w:kern w:val="2"/>
+          <w:lang w:eastAsia="en-US"/>
+          <w14:ligatures w14:val="standardContextual"/>
+        </w:rPr>
+        <w:t>, l’edizione.</w:t>
       </w:r>
     </w:p>
     <w:p>
@@ -23665,25 +23690,25 @@
           <w:lang w:eastAsia="en-US"/>
           <w14:ligatures w14:val="standardContextual"/>
         </w:rPr>
-        <w:t xml:space="preserve">Il sistema reindirizza </w:t>
-      </w:r>
-      <w:r>
-        <w:rPr>
-          <w:rFonts w:asciiTheme="minorHAnsi" w:eastAsiaTheme="minorHAnsi" w:hAnsiTheme="minorHAnsi" w:cstheme="minorBidi"/>
-          <w:kern w:val="2"/>
-          <w:lang w:eastAsia="en-US"/>
-          <w14:ligatures w14:val="standardContextual"/>
-        </w:rPr>
-        <w:t xml:space="preserve">l’operatore </w:t>
-      </w:r>
-      <w:r>
-        <w:rPr>
-          <w:rFonts w:asciiTheme="minorHAnsi" w:eastAsiaTheme="minorHAnsi" w:hAnsiTheme="minorHAnsi" w:cstheme="minorBidi"/>
-          <w:kern w:val="2"/>
-          <w:lang w:eastAsia="en-US"/>
-          <w14:ligatures w14:val="standardContextual"/>
-        </w:rPr>
-        <w:t>alla pagina di informazione delle copie dell’edizione.</w:t>
+        <w:t xml:space="preserve"> </w:t>
+      </w:r>
+      <w:r>
+        <w:rPr>
+          <w:rFonts w:asciiTheme="minorHAnsi" w:eastAsiaTheme="minorHAnsi" w:hAnsiTheme="minorHAnsi" w:cstheme="minorBidi"/>
+          <w:kern w:val="2"/>
+          <w:lang w:eastAsia="en-US"/>
+          <w14:ligatures w14:val="standardContextual"/>
+        </w:rPr>
+        <w:t>L’operatore preme</w:t>
+      </w:r>
+      <w:r>
+        <w:rPr>
+          <w:rFonts w:asciiTheme="minorHAnsi" w:eastAsiaTheme="minorHAnsi" w:hAnsiTheme="minorHAnsi" w:cstheme="minorBidi"/>
+          <w:kern w:val="2"/>
+          <w:lang w:eastAsia="en-US"/>
+          <w14:ligatures w14:val="standardContextual"/>
+        </w:rPr>
+        <w:t xml:space="preserve"> il pulsante “Copie” accanto all’edizione per la quale vuole aggiungere una copia.</w:t>
       </w:r>
     </w:p>
     <w:p>
@@ -23710,7 +23735,25 @@
           <w:lang w:eastAsia="en-US"/>
           <w14:ligatures w14:val="standardContextual"/>
         </w:rPr>
-        <w:t>L'operatore preme “Aggiungi copia”.</w:t>
+        <w:t xml:space="preserve">Il sistema reindirizza </w:t>
+      </w:r>
+      <w:r>
+        <w:rPr>
+          <w:rFonts w:asciiTheme="minorHAnsi" w:eastAsiaTheme="minorHAnsi" w:hAnsiTheme="minorHAnsi" w:cstheme="minorBidi"/>
+          <w:kern w:val="2"/>
+          <w:lang w:eastAsia="en-US"/>
+          <w14:ligatures w14:val="standardContextual"/>
+        </w:rPr>
+        <w:t xml:space="preserve">l’operatore </w:t>
+      </w:r>
+      <w:r>
+        <w:rPr>
+          <w:rFonts w:asciiTheme="minorHAnsi" w:eastAsiaTheme="minorHAnsi" w:hAnsiTheme="minorHAnsi" w:cstheme="minorBidi"/>
+          <w:kern w:val="2"/>
+          <w:lang w:eastAsia="en-US"/>
+          <w14:ligatures w14:val="standardContextual"/>
+        </w:rPr>
+        <w:t>alla pagina di informazione delle copie dell’edizione.</w:t>
       </w:r>
     </w:p>
     <w:p>
@@ -23737,7 +23780,7 @@
           <w:lang w:eastAsia="en-US"/>
           <w14:ligatures w14:val="standardContextual"/>
         </w:rPr>
-        <w:t>Il sistema aggiunge la copia al database.</w:t>
+        <w:t>L'operatore preme “Aggiungi copia”.</w:t>
       </w:r>
     </w:p>
     <w:p>
@@ -23764,25 +23807,7 @@
           <w:lang w:eastAsia="en-US"/>
           <w14:ligatures w14:val="standardContextual"/>
         </w:rPr>
-        <w:t xml:space="preserve">Il </w:t>
-      </w:r>
-      <w:r>
-        <w:rPr>
-          <w:rFonts w:asciiTheme="minorHAnsi" w:eastAsiaTheme="minorHAnsi" w:hAnsiTheme="minorHAnsi" w:cstheme="minorBidi"/>
-          <w:kern w:val="2"/>
-          <w:lang w:eastAsia="en-US"/>
-          <w14:ligatures w14:val="standardContextual"/>
-        </w:rPr>
-        <w:t>database</w:t>
-      </w:r>
-      <w:r>
-        <w:rPr>
-          <w:rFonts w:asciiTheme="minorHAnsi" w:eastAsiaTheme="minorHAnsi" w:hAnsiTheme="minorHAnsi" w:cstheme="minorBidi"/>
-          <w:kern w:val="2"/>
-          <w:lang w:eastAsia="en-US"/>
-          <w14:ligatures w14:val="standardContextual"/>
-        </w:rPr>
-        <w:t xml:space="preserve"> assegna un ID univoco alla copia.</w:t>
+        <w:t>Il sistema aggiunge la copia al database.</w:t>
       </w:r>
     </w:p>
     <w:p>
@@ -23809,16 +23834,25 @@
           <w:lang w:eastAsia="en-US"/>
           <w14:ligatures w14:val="standardContextual"/>
         </w:rPr>
-        <w:t>Il sistema mostra a schermo il messaggio “Copia aggiunta con successo”</w:t>
-      </w:r>
-      <w:r>
-        <w:rPr>
-          <w:rFonts w:asciiTheme="minorHAnsi" w:eastAsiaTheme="minorHAnsi" w:hAnsiTheme="minorHAnsi" w:cstheme="minorBidi"/>
-          <w:kern w:val="2"/>
-          <w:lang w:eastAsia="en-US"/>
-          <w14:ligatures w14:val="standardContextual"/>
-        </w:rPr>
-        <w:t>, con un pulsante “Ok”.</w:t>
+        <w:t xml:space="preserve">Il </w:t>
+      </w:r>
+      <w:r>
+        <w:rPr>
+          <w:rFonts w:asciiTheme="minorHAnsi" w:eastAsiaTheme="minorHAnsi" w:hAnsiTheme="minorHAnsi" w:cstheme="minorBidi"/>
+          <w:kern w:val="2"/>
+          <w:lang w:eastAsia="en-US"/>
+          <w14:ligatures w14:val="standardContextual"/>
+        </w:rPr>
+        <w:t>database</w:t>
+      </w:r>
+      <w:r>
+        <w:rPr>
+          <w:rFonts w:asciiTheme="minorHAnsi" w:eastAsiaTheme="minorHAnsi" w:hAnsiTheme="minorHAnsi" w:cstheme="minorBidi"/>
+          <w:kern w:val="2"/>
+          <w:lang w:eastAsia="en-US"/>
+          <w14:ligatures w14:val="standardContextual"/>
+        </w:rPr>
+        <w:t xml:space="preserve"> assegna un ID univoco alla copia.</w:t>
       </w:r>
     </w:p>
     <w:p>
@@ -23845,7 +23879,16 @@
           <w:lang w:eastAsia="en-US"/>
           <w14:ligatures w14:val="standardContextual"/>
         </w:rPr>
-        <w:t>L’operatore preme il pulsante “Ok”.</w:t>
+        <w:t>Il sistema mostra a schermo il messaggio “Copia aggiunta con successo”</w:t>
+      </w:r>
+      <w:r>
+        <w:rPr>
+          <w:rFonts w:asciiTheme="minorHAnsi" w:eastAsiaTheme="minorHAnsi" w:hAnsiTheme="minorHAnsi" w:cstheme="minorBidi"/>
+          <w:kern w:val="2"/>
+          <w:lang w:eastAsia="en-US"/>
+          <w14:ligatures w14:val="standardContextual"/>
+        </w:rPr>
+        <w:t>, con un pulsante “Ok”.</w:t>
       </w:r>
     </w:p>
     <w:p>
@@ -23872,6 +23915,33 @@
           <w:lang w:eastAsia="en-US"/>
           <w14:ligatures w14:val="standardContextual"/>
         </w:rPr>
+        <w:t>L’operatore preme il pulsante “Ok”.</w:t>
+      </w:r>
+    </w:p>
+    <w:p>
+      <w:pPr>
+        <w:widowControl/>
+        <w:numPr>
+          <w:ilvl w:val="0"/>
+          <w:numId w:val="44"/>
+        </w:numPr>
+        <w:suppressAutoHyphens w:val="0"/>
+        <w:spacing w:after="100" w:afterAutospacing="1" w:line="278" w:lineRule="auto"/>
+        <w:contextualSpacing/>
+        <w:rPr>
+          <w:rFonts w:asciiTheme="minorHAnsi" w:eastAsiaTheme="minorHAnsi" w:hAnsiTheme="minorHAnsi" w:cstheme="minorBidi"/>
+          <w:kern w:val="2"/>
+          <w:lang w:eastAsia="en-US"/>
+          <w14:ligatures w14:val="standardContextual"/>
+        </w:rPr>
+      </w:pPr>
+      <w:r>
+        <w:rPr>
+          <w:rFonts w:asciiTheme="minorHAnsi" w:eastAsiaTheme="minorHAnsi" w:hAnsiTheme="minorHAnsi" w:cstheme="minorBidi"/>
+          <w:kern w:val="2"/>
+          <w:lang w:eastAsia="en-US"/>
+          <w14:ligatures w14:val="standardContextual"/>
+        </w:rPr>
         <w:t>Il sistema reindirizza l’operatore alla pagina di gestione del catalogo.</w:t>
       </w:r>
     </w:p>
@@ -24174,6 +24244,7 @@
         <w:rPr>
           <w:rFonts w:asciiTheme="minorHAnsi" w:hAnsiTheme="minorHAnsi"/>
         </w:rPr>
+        <w:lastRenderedPageBreak/>
         <w:t>Il sistema</w:t>
       </w:r>
       <w:r>
@@ -24202,7 +24273,6 @@
           <w:b/>
           <w:bCs/>
         </w:rPr>
-        <w:lastRenderedPageBreak/>
         <w:t>Exit condition:</w:t>
       </w:r>
       <w:r>
@@ -28087,7 +28157,43 @@
           <w:lang w:eastAsia="en-US"/>
           <w14:ligatures w14:val="standardContextual"/>
         </w:rPr>
-        <w:t>Il sistema reindirizza il lettore alla pagina del lettore, che presenta prenotazioni attive, prestiti, restituzioni, sospensioni e due pulsanti: “Modifica” e “Sospendi”.</w:t>
+        <w:t xml:space="preserve">Il sistema reindirizza </w:t>
+      </w:r>
+      <w:r>
+        <w:rPr>
+          <w:rFonts w:asciiTheme="minorHAnsi" w:eastAsiaTheme="minorHAnsi" w:hAnsiTheme="minorHAnsi" w:cstheme="minorBidi"/>
+          <w:kern w:val="2"/>
+          <w:lang w:eastAsia="en-US"/>
+          <w14:ligatures w14:val="standardContextual"/>
+        </w:rPr>
+        <w:t>l</w:t>
+      </w:r>
+      <w:r>
+        <w:rPr>
+          <w:rFonts w:asciiTheme="minorHAnsi" w:eastAsiaTheme="minorHAnsi" w:hAnsiTheme="minorHAnsi" w:cstheme="minorBidi"/>
+          <w:kern w:val="2"/>
+          <w:lang w:eastAsia="en-US"/>
+          <w14:ligatures w14:val="standardContextual"/>
+        </w:rPr>
+        <w:t>’operatore</w:t>
+      </w:r>
+      <w:r>
+        <w:rPr>
+          <w:rFonts w:asciiTheme="minorHAnsi" w:eastAsiaTheme="minorHAnsi" w:hAnsiTheme="minorHAnsi" w:cstheme="minorBidi"/>
+          <w:kern w:val="2"/>
+          <w:lang w:eastAsia="en-US"/>
+          <w14:ligatures w14:val="standardContextual"/>
+        </w:rPr>
+        <w:t xml:space="preserve"> </w:t>
+      </w:r>
+      <w:r>
+        <w:rPr>
+          <w:rFonts w:asciiTheme="minorHAnsi" w:eastAsiaTheme="minorHAnsi" w:hAnsiTheme="minorHAnsi" w:cstheme="minorBidi"/>
+          <w:kern w:val="2"/>
+          <w:lang w:eastAsia="en-US"/>
+          <w14:ligatures w14:val="standardContextual"/>
+        </w:rPr>
+        <w:t>alla pagina del lettore, che presenta prenotazioni attive, prestiti, restituzioni, sospensioni e due pulsanti: “Modifica” e “Sospendi”.</w:t>
       </w:r>
     </w:p>
     <w:p>
@@ -28508,7 +28614,34 @@
           <w:lang w:eastAsia="en-US"/>
           <w14:ligatures w14:val="standardContextual"/>
         </w:rPr>
-        <w:t>Il sistema reindirizza il lettore alla pagina del lettore, che presenta prestiti, restituzioni, sospensioni e due pulsanti: “Registra” e “Sospendi”</w:t>
+        <w:t xml:space="preserve">Il sistema reindirizza </w:t>
+      </w:r>
+      <w:r>
+        <w:rPr>
+          <w:rFonts w:asciiTheme="minorHAnsi" w:eastAsiaTheme="minorHAnsi" w:hAnsiTheme="minorHAnsi" w:cstheme="minorBidi"/>
+          <w:kern w:val="2"/>
+          <w:lang w:eastAsia="en-US"/>
+          <w14:ligatures w14:val="standardContextual"/>
+        </w:rPr>
+        <w:t>l’</w:t>
+      </w:r>
+      <w:r>
+        <w:rPr>
+          <w:rFonts w:asciiTheme="minorHAnsi" w:eastAsiaTheme="minorHAnsi" w:hAnsiTheme="minorHAnsi" w:cstheme="minorBidi"/>
+          <w:kern w:val="2"/>
+          <w:lang w:eastAsia="en-US"/>
+          <w14:ligatures w14:val="standardContextual"/>
+        </w:rPr>
+        <w:t>’operatore</w:t>
+      </w:r>
+      <w:r>
+        <w:rPr>
+          <w:rFonts w:asciiTheme="minorHAnsi" w:eastAsiaTheme="minorHAnsi" w:hAnsiTheme="minorHAnsi" w:cstheme="minorBidi"/>
+          <w:kern w:val="2"/>
+          <w:lang w:eastAsia="en-US"/>
+          <w14:ligatures w14:val="standardContextual"/>
+        </w:rPr>
+        <w:t xml:space="preserve"> alla pagina del lettore, che presenta prestiti, restituzioni, sospensioni e due pulsanti: “Registra” e “Sospendi”</w:t>
       </w:r>
     </w:p>
     <w:p>
@@ -29757,7 +29890,25 @@
           <w:lang w:eastAsia="en-US"/>
           <w14:ligatures w14:val="standardContextual"/>
         </w:rPr>
-        <w:t>l’operatore preme “Reset Password” viene eseguito</w:t>
+        <w:t>l’operatore preme “Reset Password”</w:t>
+      </w:r>
+      <w:r>
+        <w:rPr>
+          <w:rFonts w:asciiTheme="minorHAnsi" w:eastAsiaTheme="minorHAnsi" w:hAnsiTheme="minorHAnsi" w:cstheme="minorBidi"/>
+          <w:kern w:val="2"/>
+          <w:lang w:eastAsia="en-US"/>
+          <w14:ligatures w14:val="standardContextual"/>
+        </w:rPr>
+        <w:t>, le modifiche non vengono salvate e</w:t>
+      </w:r>
+      <w:r>
+        <w:rPr>
+          <w:rFonts w:asciiTheme="minorHAnsi" w:eastAsiaTheme="minorHAnsi" w:hAnsiTheme="minorHAnsi" w:cstheme="minorBidi"/>
+          <w:kern w:val="2"/>
+          <w:lang w:eastAsia="en-US"/>
+          <w14:ligatures w14:val="standardContextual"/>
+        </w:rPr>
+        <w:t xml:space="preserve"> viene eseguito</w:t>
       </w:r>
       <w:r>
         <w:rPr>
@@ -31535,7 +31686,25 @@
           <w:lang w:eastAsia="en-US"/>
           <w14:ligatures w14:val="standardContextual"/>
         </w:rPr>
-        <w:t>l’edizione della copia per la quale deve effettuare il prestito.</w:t>
+        <w:t>l’edizione della copia per la quale deve effettuare il prestito</w:t>
+      </w:r>
+      <w:r>
+        <w:rPr>
+          <w:rFonts w:asciiTheme="minorHAnsi" w:eastAsiaTheme="minorHAnsi" w:hAnsiTheme="minorHAnsi" w:cstheme="minorBidi"/>
+          <w:kern w:val="2"/>
+          <w:lang w:eastAsia="en-US"/>
+          <w14:ligatures w14:val="standardContextual"/>
+        </w:rPr>
+        <w:t xml:space="preserve"> e preme su di essa</w:t>
+      </w:r>
+      <w:r>
+        <w:rPr>
+          <w:rFonts w:asciiTheme="minorHAnsi" w:eastAsiaTheme="minorHAnsi" w:hAnsiTheme="minorHAnsi" w:cstheme="minorBidi"/>
+          <w:kern w:val="2"/>
+          <w:lang w:eastAsia="en-US"/>
+          <w14:ligatures w14:val="standardContextual"/>
+        </w:rPr>
+        <w:t>.</w:t>
       </w:r>
     </w:p>
     <w:p>
@@ -31562,34 +31731,16 @@
           <w:lang w:eastAsia="en-US"/>
           <w14:ligatures w14:val="standardContextual"/>
         </w:rPr>
-        <w:t>Il sistema mostra all’operatore una lista di copie disponibili</w:t>
-      </w:r>
-      <w:r>
-        <w:rPr>
-          <w:rFonts w:asciiTheme="minorHAnsi" w:eastAsiaTheme="minorHAnsi" w:hAnsiTheme="minorHAnsi" w:cstheme="minorBidi"/>
-          <w:kern w:val="2"/>
-          <w:lang w:eastAsia="en-US"/>
-          <w14:ligatures w14:val="standardContextual"/>
-        </w:rPr>
-        <w:t xml:space="preserve"> per quell’edizione</w:t>
-      </w:r>
-      <w:r>
-        <w:rPr>
-          <w:rFonts w:asciiTheme="minorHAnsi" w:eastAsiaTheme="minorHAnsi" w:hAnsiTheme="minorHAnsi" w:cstheme="minorBidi"/>
-          <w:kern w:val="2"/>
-          <w:lang w:eastAsia="en-US"/>
-          <w14:ligatures w14:val="standardContextual"/>
-        </w:rPr>
-        <w:t>, ciascuna con un pulsante “Presta”</w:t>
-      </w:r>
-      <w:r>
-        <w:rPr>
-          <w:rFonts w:asciiTheme="minorHAnsi" w:eastAsiaTheme="minorHAnsi" w:hAnsiTheme="minorHAnsi" w:cstheme="minorBidi"/>
-          <w:kern w:val="2"/>
-          <w:lang w:eastAsia="en-US"/>
-          <w14:ligatures w14:val="standardContextual"/>
-        </w:rPr>
-        <w:t>.</w:t>
+        <w:t xml:space="preserve">Il sistema reindirizza l’operatore a una pagina che presenta la </w:t>
+      </w:r>
+      <w:r>
+        <w:rPr>
+          <w:rFonts w:asciiTheme="minorHAnsi" w:eastAsiaTheme="minorHAnsi" w:hAnsiTheme="minorHAnsi" w:cstheme="minorBidi"/>
+          <w:kern w:val="2"/>
+          <w:lang w:eastAsia="en-US"/>
+          <w14:ligatures w14:val="standardContextual"/>
+        </w:rPr>
+        <w:t>lista di copie disponibili per quell’edizione, ciascuna con un pulsante “Presta”.</w:t>
       </w:r>
     </w:p>
     <w:p>
@@ -32764,6 +32915,59 @@
       <w:pPr>
         <w:widowControl/>
         <w:suppressAutoHyphens w:val="0"/>
+        <w:spacing w:after="100" w:afterAutospacing="1" w:line="278" w:lineRule="auto"/>
+        <w:rPr>
+          <w:rFonts w:asciiTheme="minorHAnsi" w:eastAsiaTheme="minorHAnsi" w:hAnsiTheme="minorHAnsi" w:cstheme="minorBidi"/>
+          <w:kern w:val="2"/>
+          <w:lang w:eastAsia="en-US"/>
+          <w14:ligatures w14:val="standardContextual"/>
+        </w:rPr>
+      </w:pPr>
+      <w:r>
+        <w:rPr>
+          <w:rFonts w:asciiTheme="minorHAnsi" w:eastAsiaTheme="minorHAnsi" w:hAnsiTheme="minorHAnsi" w:cstheme="minorBidi"/>
+          <w:kern w:val="2"/>
+          <w:lang w:eastAsia="en-US"/>
+          <w14:ligatures w14:val="standardContextual"/>
+        </w:rPr>
+        <w:t xml:space="preserve">Se al passo 4 il sistema non rileva copie disponibili, viene eseguito il caso d’uso </w:t>
+      </w:r>
+      <w:r>
+        <w:rPr>
+          <w:rFonts w:asciiTheme="minorHAnsi" w:eastAsiaTheme="minorHAnsi" w:hAnsiTheme="minorHAnsi" w:cstheme="minorBidi"/>
+          <w:b/>
+          <w:bCs/>
+          <w:kern w:val="2"/>
+          <w:lang w:eastAsia="en-US"/>
+          <w14:ligatures w14:val="standardContextual"/>
+        </w:rPr>
+        <w:t>UC15.5 – Nessuna copia</w:t>
+      </w:r>
+      <w:r>
+        <w:rPr>
+          <w:rFonts w:asciiTheme="minorHAnsi" w:eastAsiaTheme="minorHAnsi" w:hAnsiTheme="minorHAnsi" w:cstheme="minorBidi"/>
+          <w:b/>
+          <w:bCs/>
+          <w:kern w:val="2"/>
+          <w:lang w:eastAsia="en-US"/>
+          <w14:ligatures w14:val="standardContextual"/>
+        </w:rPr>
+        <w:t xml:space="preserve"> disponibile</w:t>
+      </w:r>
+      <w:r>
+        <w:rPr>
+          <w:rFonts w:asciiTheme="minorHAnsi" w:eastAsiaTheme="minorHAnsi" w:hAnsiTheme="minorHAnsi" w:cstheme="minorBidi"/>
+          <w:kern w:val="2"/>
+          <w:lang w:eastAsia="en-US"/>
+          <w14:ligatures w14:val="standardContextual"/>
+        </w:rPr>
+        <w:t>.</w:t>
+      </w:r>
+    </w:p>
+    <w:p>
+      <w:pPr>
+        <w:widowControl/>
+        <w:suppressAutoHyphens w:val="0"/>
         <w:rPr>
           <w:rFonts w:asciiTheme="minorHAnsi" w:hAnsiTheme="minorHAnsi"/>
           <w:b/>
@@ -32921,7 +33125,7 @@
         <w:widowControl/>
         <w:numPr>
           <w:ilvl w:val="0"/>
-          <w:numId w:val="76"/>
+          <w:numId w:val="81"/>
         </w:numPr>
         <w:suppressAutoHyphens w:val="0"/>
         <w:spacing w:after="100" w:afterAutospacing="1" w:line="278" w:lineRule="auto"/>
@@ -33224,6 +33428,7 @@
         <w:rPr>
           <w:rFonts w:asciiTheme="minorHAnsi" w:hAnsiTheme="minorHAnsi"/>
         </w:rPr>
+        <w:lastRenderedPageBreak/>
         <w:t xml:space="preserve">Il sistema </w:t>
       </w:r>
       <w:r>
@@ -33306,17 +33511,7 @@
           <w:lang w:eastAsia="en-US"/>
           <w14:ligatures w14:val="standardContextual"/>
         </w:rPr>
-        <w:t xml:space="preserve">registrazione </w:t>
-      </w:r>
-      <w:r>
-        <w:rPr>
-          <w:rFonts w:asciiTheme="minorHAnsi" w:eastAsiaTheme="minorHAnsi" w:hAnsiTheme="minorHAnsi" w:cstheme="minorBidi"/>
-          <w:kern w:val="2"/>
-          <w:lang w:eastAsia="en-US"/>
-          <w14:ligatures w14:val="standardContextual"/>
-        </w:rPr>
-        <w:lastRenderedPageBreak/>
-        <w:t>del prestito</w:t>
+        <w:t>registrazione del prestito</w:t>
       </w:r>
       <w:r>
         <w:rPr>
@@ -33918,7 +34113,115 @@
           <w:lang w:eastAsia="en-US"/>
           <w14:ligatures w14:val="standardContextual"/>
         </w:rPr>
-        <w:t>Il sistema mostra a schermo il messaggio “Errore: Il lettore è temporaneamente sospeso”.</w:t>
+        <w:t>Il sistema mostra a schermo il messaggio “Errore: Il lettore è temporaneamente sospeso”</w:t>
+      </w:r>
+      <w:r>
+        <w:rPr>
+          <w:rFonts w:asciiTheme="minorHAnsi" w:eastAsiaTheme="minorHAnsi" w:hAnsiTheme="minorHAnsi" w:cstheme="minorBidi"/>
+          <w:kern w:val="2"/>
+          <w:lang w:eastAsia="en-US"/>
+          <w14:ligatures w14:val="standardContextual"/>
+        </w:rPr>
+        <w:t xml:space="preserve"> con un pulsante “Ok”</w:t>
+      </w:r>
+      <w:r>
+        <w:rPr>
+          <w:rFonts w:asciiTheme="minorHAnsi" w:eastAsiaTheme="minorHAnsi" w:hAnsiTheme="minorHAnsi" w:cstheme="minorBidi"/>
+          <w:kern w:val="2"/>
+          <w:lang w:eastAsia="en-US"/>
+          <w14:ligatures w14:val="standardContextual"/>
+        </w:rPr>
+        <w:t>.</w:t>
+      </w:r>
+    </w:p>
+    <w:p>
+      <w:pPr>
+        <w:widowControl/>
+        <w:numPr>
+          <w:ilvl w:val="0"/>
+          <w:numId w:val="37"/>
+        </w:numPr>
+        <w:suppressAutoHyphens w:val="0"/>
+        <w:spacing w:after="100" w:afterAutospacing="1" w:line="278" w:lineRule="auto"/>
+        <w:contextualSpacing/>
+        <w:rPr>
+          <w:rFonts w:asciiTheme="minorHAnsi" w:eastAsiaTheme="minorHAnsi" w:hAnsiTheme="minorHAnsi" w:cstheme="minorBidi"/>
+          <w:kern w:val="2"/>
+          <w:lang w:eastAsia="en-US"/>
+          <w14:ligatures w14:val="standardContextual"/>
+        </w:rPr>
+      </w:pPr>
+      <w:r>
+        <w:rPr>
+          <w:rFonts w:asciiTheme="minorHAnsi" w:eastAsiaTheme="minorHAnsi" w:hAnsiTheme="minorHAnsi" w:cstheme="minorBidi"/>
+          <w:kern w:val="2"/>
+          <w:lang w:eastAsia="en-US"/>
+          <w14:ligatures w14:val="standardContextual"/>
+        </w:rPr>
+        <w:t>L’operatore preme “Ok”.</w:t>
+      </w:r>
+    </w:p>
+    <w:p>
+      <w:pPr>
+        <w:widowControl/>
+        <w:numPr>
+          <w:ilvl w:val="0"/>
+          <w:numId w:val="37"/>
+        </w:numPr>
+        <w:suppressAutoHyphens w:val="0"/>
+        <w:spacing w:after="100" w:afterAutospacing="1" w:line="278" w:lineRule="auto"/>
+        <w:contextualSpacing/>
+        <w:rPr>
+          <w:rFonts w:asciiTheme="minorHAnsi" w:eastAsiaTheme="minorHAnsi" w:hAnsiTheme="minorHAnsi" w:cstheme="minorBidi"/>
+          <w:kern w:val="2"/>
+          <w:lang w:eastAsia="en-US"/>
+          <w14:ligatures w14:val="standardContextual"/>
+        </w:rPr>
+      </w:pPr>
+      <w:r>
+        <w:rPr>
+          <w:rFonts w:asciiTheme="minorHAnsi" w:eastAsiaTheme="minorHAnsi" w:hAnsiTheme="minorHAnsi" w:cstheme="minorBidi"/>
+          <w:kern w:val="2"/>
+          <w:lang w:eastAsia="en-US"/>
+          <w14:ligatures w14:val="standardContextual"/>
+        </w:rPr>
+        <w:t>Il sistema chiude la finestra</w:t>
+      </w:r>
+      <w:r>
+        <w:rPr>
+          <w:rFonts w:asciiTheme="minorHAnsi" w:eastAsiaTheme="minorHAnsi" w:hAnsiTheme="minorHAnsi" w:cstheme="minorBidi"/>
+          <w:kern w:val="2"/>
+          <w:lang w:eastAsia="en-US"/>
+          <w14:ligatures w14:val="standardContextual"/>
+        </w:rPr>
+        <w:t xml:space="preserve"> con il messaggio</w:t>
+      </w:r>
+      <w:r>
+        <w:rPr>
+          <w:rFonts w:asciiTheme="minorHAnsi" w:eastAsiaTheme="minorHAnsi" w:hAnsiTheme="minorHAnsi" w:cstheme="minorBidi"/>
+          <w:kern w:val="2"/>
+          <w:lang w:eastAsia="en-US"/>
+          <w14:ligatures w14:val="standardContextual"/>
+        </w:rPr>
+        <w:t xml:space="preserve"> di</w:t>
+      </w:r>
+      <w:r>
+        <w:rPr>
+          <w:rFonts w:asciiTheme="minorHAnsi" w:eastAsiaTheme="minorHAnsi" w:hAnsiTheme="minorHAnsi" w:cstheme="minorBidi"/>
+          <w:kern w:val="2"/>
+          <w:lang w:eastAsia="en-US"/>
+          <w14:ligatures w14:val="standardContextual"/>
+        </w:rPr>
+        <w:t xml:space="preserve"> errore</w:t>
+      </w:r>
+      <w:r>
+        <w:rPr>
+          <w:rFonts w:asciiTheme="minorHAnsi" w:eastAsiaTheme="minorHAnsi" w:hAnsiTheme="minorHAnsi" w:cstheme="minorBidi"/>
+          <w:kern w:val="2"/>
+          <w:lang w:eastAsia="en-US"/>
+          <w14:ligatures w14:val="standardContextual"/>
+        </w:rPr>
+        <w:t>.</w:t>
       </w:r>
     </w:p>
     <w:p>
@@ -33978,6 +34281,15 @@
           <w:lang w:eastAsia="en-US"/>
           <w14:ligatures w14:val="standardContextual"/>
         </w:rPr>
+        <w:t xml:space="preserve"> e il prestito non è registrato</w:t>
+      </w:r>
+      <w:r>
+        <w:rPr>
+          <w:rFonts w:asciiTheme="minorHAnsi" w:eastAsiaTheme="minorHAnsi" w:hAnsiTheme="minorHAnsi" w:cstheme="minorBidi"/>
+          <w:kern w:val="2"/>
+          <w:lang w:eastAsia="en-US"/>
+          <w14:ligatures w14:val="standardContextual"/>
+        </w:rPr>
         <w:t>.</w:t>
       </w:r>
     </w:p>
@@ -33985,6 +34297,366 @@
       <w:pPr>
         <w:widowControl/>
         <w:suppressAutoHyphens w:val="0"/>
+        <w:spacing w:after="100" w:afterAutospacing="1" w:line="278" w:lineRule="auto"/>
+        <w:rPr>
+          <w:rFonts w:asciiTheme="minorHAnsi" w:eastAsiaTheme="minorHAnsi" w:hAnsiTheme="minorHAnsi" w:cstheme="minorBidi"/>
+          <w:kern w:val="2"/>
+          <w:lang w:eastAsia="en-US"/>
+          <w14:ligatures w14:val="standardContextual"/>
+        </w:rPr>
+      </w:pPr>
+    </w:p>
+    <w:p>
+      <w:pPr>
+        <w:widowControl/>
+        <w:suppressAutoHyphens w:val="0"/>
+        <w:spacing w:after="100" w:afterAutospacing="1" w:line="278" w:lineRule="auto"/>
+        <w:rPr>
+          <w:rFonts w:asciiTheme="minorHAnsi" w:eastAsiaTheme="minorHAnsi" w:hAnsiTheme="minorHAnsi" w:cstheme="minorBidi"/>
+          <w:b/>
+          <w:bCs/>
+          <w:kern w:val="2"/>
+          <w:sz w:val="28"/>
+          <w:szCs w:val="28"/>
+          <w:lang w:eastAsia="en-US"/>
+          <w14:ligatures w14:val="standardContextual"/>
+        </w:rPr>
+      </w:pPr>
+      <w:r>
+        <w:rPr>
+          <w:rFonts w:asciiTheme="minorHAnsi" w:eastAsiaTheme="minorHAnsi" w:hAnsiTheme="minorHAnsi" w:cstheme="minorBidi"/>
+          <w:b/>
+          <w:bCs/>
+          <w:kern w:val="2"/>
+          <w:sz w:val="28"/>
+          <w:szCs w:val="28"/>
+          <w:lang w:eastAsia="en-US"/>
+          <w14:ligatures w14:val="standardContextual"/>
+        </w:rPr>
+        <w:t>UC1</w:t>
+      </w:r>
+      <w:r>
+        <w:rPr>
+          <w:rFonts w:asciiTheme="minorHAnsi" w:eastAsiaTheme="minorHAnsi" w:hAnsiTheme="minorHAnsi" w:cstheme="minorBidi"/>
+          <w:b/>
+          <w:bCs/>
+          <w:kern w:val="2"/>
+          <w:sz w:val="28"/>
+          <w:szCs w:val="28"/>
+          <w:lang w:eastAsia="en-US"/>
+          <w14:ligatures w14:val="standardContextual"/>
+        </w:rPr>
+        <w:t>5</w:t>
+      </w:r>
+      <w:r>
+        <w:rPr>
+          <w:rFonts w:asciiTheme="minorHAnsi" w:eastAsiaTheme="minorHAnsi" w:hAnsiTheme="minorHAnsi" w:cstheme="minorBidi"/>
+          <w:b/>
+          <w:bCs/>
+          <w:kern w:val="2"/>
+          <w:sz w:val="28"/>
+          <w:szCs w:val="28"/>
+          <w:lang w:eastAsia="en-US"/>
+          <w14:ligatures w14:val="standardContextual"/>
+        </w:rPr>
+        <w:t>.</w:t>
+      </w:r>
+      <w:r>
+        <w:rPr>
+          <w:rFonts w:asciiTheme="minorHAnsi" w:eastAsiaTheme="minorHAnsi" w:hAnsiTheme="minorHAnsi" w:cstheme="minorBidi"/>
+          <w:b/>
+          <w:bCs/>
+          <w:kern w:val="2"/>
+          <w:sz w:val="28"/>
+          <w:szCs w:val="28"/>
+          <w:lang w:eastAsia="en-US"/>
+          <w14:ligatures w14:val="standardContextual"/>
+        </w:rPr>
+        <w:t>5</w:t>
+      </w:r>
+      <w:r>
+        <w:rPr>
+          <w:rFonts w:asciiTheme="minorHAnsi" w:eastAsiaTheme="minorHAnsi" w:hAnsiTheme="minorHAnsi" w:cstheme="minorBidi"/>
+          <w:b/>
+          <w:bCs/>
+          <w:kern w:val="2"/>
+          <w:sz w:val="28"/>
+          <w:szCs w:val="28"/>
+          <w:lang w:eastAsia="en-US"/>
+          <w14:ligatures w14:val="standardContextual"/>
+        </w:rPr>
+        <w:t xml:space="preserve"> – Nessuna copia</w:t>
+      </w:r>
+      <w:r>
+        <w:rPr>
+          <w:rFonts w:asciiTheme="minorHAnsi" w:eastAsiaTheme="minorHAnsi" w:hAnsiTheme="minorHAnsi" w:cstheme="minorBidi"/>
+          <w:b/>
+          <w:bCs/>
+          <w:kern w:val="2"/>
+          <w:sz w:val="28"/>
+          <w:szCs w:val="28"/>
+          <w:lang w:eastAsia="en-US"/>
+          <w14:ligatures w14:val="standardContextual"/>
+        </w:rPr>
+        <w:t xml:space="preserve"> disponibile</w:t>
+      </w:r>
+    </w:p>
+    <w:p>
+      <w:pPr>
+        <w:widowControl/>
+        <w:suppressAutoHyphens w:val="0"/>
+        <w:spacing w:after="100" w:afterAutospacing="1" w:line="278" w:lineRule="auto"/>
+        <w:rPr>
+          <w:rFonts w:asciiTheme="minorHAnsi" w:eastAsiaTheme="minorHAnsi" w:hAnsiTheme="minorHAnsi" w:cstheme="minorBidi"/>
+          <w:kern w:val="2"/>
+          <w:lang w:eastAsia="en-US"/>
+          <w14:ligatures w14:val="standardContextual"/>
+        </w:rPr>
+      </w:pPr>
+      <w:r>
+        <w:rPr>
+          <w:rFonts w:asciiTheme="minorHAnsi" w:eastAsiaTheme="minorHAnsi" w:hAnsiTheme="minorHAnsi" w:cstheme="minorBidi"/>
+          <w:b/>
+          <w:bCs/>
+          <w:kern w:val="2"/>
+          <w:lang w:eastAsia="en-US"/>
+          <w14:ligatures w14:val="standardContextual"/>
+        </w:rPr>
+        <w:t>Attori:</w:t>
+      </w:r>
+      <w:r>
+        <w:rPr>
+          <w:rFonts w:asciiTheme="minorHAnsi" w:eastAsiaTheme="minorHAnsi" w:hAnsiTheme="minorHAnsi" w:cstheme="minorBidi"/>
+          <w:kern w:val="2"/>
+          <w:lang w:eastAsia="en-US"/>
+          <w14:ligatures w14:val="standardContextual"/>
+        </w:rPr>
+        <w:t xml:space="preserve"> Operatore.</w:t>
+      </w:r>
+    </w:p>
+    <w:p>
+      <w:pPr>
+        <w:widowControl/>
+        <w:suppressAutoHyphens w:val="0"/>
+        <w:spacing w:after="100" w:afterAutospacing="1" w:line="278" w:lineRule="auto"/>
+        <w:rPr>
+          <w:rFonts w:asciiTheme="minorHAnsi" w:eastAsiaTheme="minorHAnsi" w:hAnsiTheme="minorHAnsi" w:cstheme="minorBidi"/>
+          <w:kern w:val="2"/>
+          <w:lang w:eastAsia="en-US"/>
+          <w14:ligatures w14:val="standardContextual"/>
+        </w:rPr>
+      </w:pPr>
+      <w:r>
+        <w:rPr>
+          <w:rFonts w:asciiTheme="minorHAnsi" w:eastAsiaTheme="minorHAnsi" w:hAnsiTheme="minorHAnsi" w:cstheme="minorBidi"/>
+          <w:b/>
+          <w:bCs/>
+          <w:kern w:val="2"/>
+          <w:lang w:eastAsia="en-US"/>
+          <w14:ligatures w14:val="standardContextual"/>
+        </w:rPr>
+        <w:t>Entry condition:</w:t>
+      </w:r>
+      <w:r>
+        <w:rPr>
+          <w:rFonts w:asciiTheme="minorHAnsi" w:eastAsiaTheme="minorHAnsi" w:hAnsiTheme="minorHAnsi" w:cstheme="minorBidi"/>
+          <w:kern w:val="2"/>
+          <w:lang w:eastAsia="en-US"/>
+          <w14:ligatures w14:val="standardContextual"/>
+        </w:rPr>
+        <w:t xml:space="preserve"> L’operatore </w:t>
+      </w:r>
+      <w:r>
+        <w:rPr>
+          <w:rFonts w:asciiTheme="minorHAnsi" w:eastAsiaTheme="minorHAnsi" w:hAnsiTheme="minorHAnsi" w:cstheme="minorBidi"/>
+          <w:kern w:val="2"/>
+          <w:lang w:eastAsia="en-US"/>
+          <w14:ligatures w14:val="standardContextual"/>
+        </w:rPr>
+        <w:t xml:space="preserve">si trova nella pagina </w:t>
+      </w:r>
+      <w:r>
+        <w:rPr>
+          <w:rFonts w:asciiTheme="minorHAnsi" w:eastAsiaTheme="minorHAnsi" w:hAnsiTheme="minorHAnsi" w:cstheme="minorBidi"/>
+          <w:kern w:val="2"/>
+          <w:lang w:eastAsia="en-US"/>
+          <w14:ligatures w14:val="standardContextual"/>
+        </w:rPr>
+        <w:t xml:space="preserve">di scelta della copia da prestare e non vi sono copie disponibili per quella edizione. </w:t>
+      </w:r>
+    </w:p>
+    <w:p>
+      <w:pPr>
+        <w:widowControl/>
+        <w:suppressAutoHyphens w:val="0"/>
+        <w:spacing w:after="100" w:afterAutospacing="1" w:line="278" w:lineRule="auto"/>
+        <w:rPr>
+          <w:rFonts w:asciiTheme="minorHAnsi" w:eastAsiaTheme="minorHAnsi" w:hAnsiTheme="minorHAnsi" w:cstheme="minorBidi"/>
+          <w:b/>
+          <w:bCs/>
+          <w:kern w:val="2"/>
+          <w:lang w:eastAsia="en-US"/>
+          <w14:ligatures w14:val="standardContextual"/>
+        </w:rPr>
+      </w:pPr>
+      <w:r>
+        <w:rPr>
+          <w:rFonts w:asciiTheme="minorHAnsi" w:eastAsiaTheme="minorHAnsi" w:hAnsiTheme="minorHAnsi" w:cstheme="minorBidi"/>
+          <w:b/>
+          <w:bCs/>
+          <w:kern w:val="2"/>
+          <w:lang w:eastAsia="en-US"/>
+          <w14:ligatures w14:val="standardContextual"/>
+        </w:rPr>
+        <w:t xml:space="preserve">Flusso di eventi: </w:t>
+      </w:r>
+    </w:p>
+    <w:p>
+      <w:pPr>
+        <w:widowControl/>
+        <w:numPr>
+          <w:ilvl w:val="0"/>
+          <w:numId w:val="80"/>
+        </w:numPr>
+        <w:suppressAutoHyphens w:val="0"/>
+        <w:spacing w:after="100" w:afterAutospacing="1" w:line="278" w:lineRule="auto"/>
+        <w:contextualSpacing/>
+        <w:rPr>
+          <w:rFonts w:asciiTheme="minorHAnsi" w:eastAsiaTheme="minorHAnsi" w:hAnsiTheme="minorHAnsi" w:cstheme="minorBidi"/>
+          <w:kern w:val="2"/>
+          <w:lang w:eastAsia="en-US"/>
+          <w14:ligatures w14:val="standardContextual"/>
+        </w:rPr>
+      </w:pPr>
+      <w:r>
+        <w:rPr>
+          <w:rFonts w:asciiTheme="minorHAnsi" w:eastAsiaTheme="minorHAnsi" w:hAnsiTheme="minorHAnsi" w:cstheme="minorBidi"/>
+          <w:kern w:val="2"/>
+          <w:lang w:eastAsia="en-US"/>
+          <w14:ligatures w14:val="standardContextual"/>
+        </w:rPr>
+        <w:lastRenderedPageBreak/>
+        <w:t>Il sistema mostra</w:t>
+      </w:r>
+      <w:r>
+        <w:rPr>
+          <w:rFonts w:asciiTheme="minorHAnsi" w:eastAsiaTheme="minorHAnsi" w:hAnsiTheme="minorHAnsi" w:cstheme="minorBidi"/>
+          <w:kern w:val="2"/>
+          <w:lang w:eastAsia="en-US"/>
+          <w14:ligatures w14:val="standardContextual"/>
+        </w:rPr>
+        <w:t xml:space="preserve"> al posto della lista delle copie il messaggio “</w:t>
+      </w:r>
+      <w:r>
+        <w:rPr>
+          <w:rFonts w:asciiTheme="minorHAnsi" w:eastAsiaTheme="minorHAnsi" w:hAnsiTheme="minorHAnsi" w:cstheme="minorBidi"/>
+          <w:kern w:val="2"/>
+          <w:lang w:eastAsia="en-US"/>
+          <w14:ligatures w14:val="standardContextual"/>
+        </w:rPr>
+        <w:t xml:space="preserve">Attualmente non vi sono </w:t>
+      </w:r>
+      <w:r>
+        <w:rPr>
+          <w:rFonts w:asciiTheme="minorHAnsi" w:eastAsiaTheme="minorHAnsi" w:hAnsiTheme="minorHAnsi" w:cstheme="minorBidi"/>
+          <w:kern w:val="2"/>
+          <w:lang w:eastAsia="en-US"/>
+          <w14:ligatures w14:val="standardContextual"/>
+        </w:rPr>
+        <w:t xml:space="preserve">copie </w:t>
+      </w:r>
+      <w:r>
+        <w:rPr>
+          <w:rFonts w:asciiTheme="minorHAnsi" w:eastAsiaTheme="minorHAnsi" w:hAnsiTheme="minorHAnsi" w:cstheme="minorBidi"/>
+          <w:kern w:val="2"/>
+          <w:lang w:eastAsia="en-US"/>
+          <w14:ligatures w14:val="standardContextual"/>
+        </w:rPr>
+        <w:t xml:space="preserve">disponibili </w:t>
+      </w:r>
+      <w:r>
+        <w:rPr>
+          <w:rFonts w:asciiTheme="minorHAnsi" w:eastAsiaTheme="minorHAnsi" w:hAnsiTheme="minorHAnsi" w:cstheme="minorBidi"/>
+          <w:kern w:val="2"/>
+          <w:lang w:eastAsia="en-US"/>
+          <w14:ligatures w14:val="standardContextual"/>
+        </w:rPr>
+        <w:t>per questa edizione”</w:t>
+      </w:r>
+      <w:r>
+        <w:rPr>
+          <w:rFonts w:asciiTheme="minorHAnsi" w:eastAsiaTheme="minorHAnsi" w:hAnsiTheme="minorHAnsi" w:cstheme="minorBidi"/>
+          <w:kern w:val="2"/>
+          <w:lang w:eastAsia="en-US"/>
+          <w14:ligatures w14:val="standardContextual"/>
+        </w:rPr>
+        <w:t>.</w:t>
+      </w:r>
+    </w:p>
+    <w:p>
+      <w:pPr>
+        <w:widowControl/>
+        <w:suppressAutoHyphens w:val="0"/>
+        <w:spacing w:after="100" w:afterAutospacing="1" w:line="278" w:lineRule="auto"/>
+        <w:rPr>
+          <w:rFonts w:asciiTheme="minorHAnsi" w:eastAsiaTheme="minorHAnsi" w:hAnsiTheme="minorHAnsi" w:cstheme="minorBidi"/>
+          <w:kern w:val="2"/>
+          <w:lang w:eastAsia="en-US"/>
+          <w14:ligatures w14:val="standardContextual"/>
+        </w:rPr>
+      </w:pPr>
+      <w:r>
+        <w:rPr>
+          <w:rFonts w:asciiTheme="minorHAnsi" w:eastAsiaTheme="minorHAnsi" w:hAnsiTheme="minorHAnsi" w:cstheme="minorBidi"/>
+          <w:b/>
+          <w:bCs/>
+          <w:kern w:val="2"/>
+          <w:lang w:eastAsia="en-US"/>
+          <w14:ligatures w14:val="standardContextual"/>
+        </w:rPr>
+        <w:t>Exit condition:</w:t>
+      </w:r>
+      <w:r>
+        <w:rPr>
+          <w:rFonts w:asciiTheme="minorHAnsi" w:eastAsiaTheme="minorHAnsi" w:hAnsiTheme="minorHAnsi" w:cstheme="minorBidi"/>
+          <w:kern w:val="2"/>
+          <w:lang w:eastAsia="en-US"/>
+          <w14:ligatures w14:val="standardContextual"/>
+        </w:rPr>
+        <w:t xml:space="preserve"> L'operatore </w:t>
+      </w:r>
+      <w:r>
+        <w:rPr>
+          <w:rFonts w:asciiTheme="minorHAnsi" w:eastAsiaTheme="minorHAnsi" w:hAnsiTheme="minorHAnsi" w:cstheme="minorBidi"/>
+          <w:kern w:val="2"/>
+          <w:lang w:eastAsia="en-US"/>
+          <w14:ligatures w14:val="standardContextual"/>
+        </w:rPr>
+        <w:t xml:space="preserve">si trova nella pagina </w:t>
+      </w:r>
+      <w:r>
+        <w:rPr>
+          <w:rFonts w:asciiTheme="minorHAnsi" w:eastAsiaTheme="minorHAnsi" w:hAnsiTheme="minorHAnsi" w:cstheme="minorBidi"/>
+          <w:kern w:val="2"/>
+          <w:lang w:eastAsia="en-US"/>
+          <w14:ligatures w14:val="standardContextual"/>
+        </w:rPr>
+        <w:t xml:space="preserve">pagina di scelta della copia da prestare </w:t>
+      </w:r>
+      <w:r>
+        <w:rPr>
+          <w:rFonts w:asciiTheme="minorHAnsi" w:eastAsiaTheme="minorHAnsi" w:hAnsiTheme="minorHAnsi" w:cstheme="minorBidi"/>
+          <w:kern w:val="2"/>
+          <w:lang w:eastAsia="en-US"/>
+          <w14:ligatures w14:val="standardContextual"/>
+        </w:rPr>
+        <w:t>dell’edizione.</w:t>
+      </w:r>
+    </w:p>
+    <w:p>
+      <w:pPr>
+        <w:widowControl/>
+        <w:suppressAutoHyphens w:val="0"/>
         <w:rPr>
           <w:rFonts w:asciiTheme="minorHAnsi" w:eastAsiaTheme="minorHAnsi" w:hAnsiTheme="minorHAnsi" w:cstheme="minorBidi"/>
           <w:kern w:val="2"/>
@@ -34001,6 +34673,19 @@
         </w:rPr>
         <w:br w:type="page"/>
       </w:r>
+    </w:p>
+    <w:p>
+      <w:pPr>
+        <w:widowControl/>
+        <w:suppressAutoHyphens w:val="0"/>
+        <w:spacing w:after="100" w:afterAutospacing="1" w:line="278" w:lineRule="auto"/>
+        <w:rPr>
+          <w:rFonts w:asciiTheme="minorHAnsi" w:eastAsiaTheme="minorHAnsi" w:hAnsiTheme="minorHAnsi" w:cstheme="minorBidi"/>
+          <w:kern w:val="2"/>
+          <w:lang w:eastAsia="en-US"/>
+          <w14:ligatures w14:val="standardContextual"/>
+        </w:rPr>
+      </w:pPr>
       <w:r>
         <w:rPr>
           <w:rFonts w:asciiTheme="minorHAnsi" w:hAnsiTheme="minorHAnsi"/>
@@ -34513,7 +35198,7 @@
           <w:lang w:eastAsia="en-US"/>
           <w14:ligatures w14:val="standardContextual"/>
         </w:rPr>
-        <w:t>Il sistema crea un nuovo prestito associando ad esso le informazioni del lettore che ha effettuato la prenotazione online e la data di restituzione inserita dall’operatore, e lo inserisce nel database.</w:t>
+        <w:t>Il sistema verifica che il lettore non ha sospensioni attive.</w:t>
       </w:r>
     </w:p>
     <w:p>
@@ -34540,7 +35225,7 @@
           <w:lang w:eastAsia="en-US"/>
           <w14:ligatures w14:val="standardContextual"/>
         </w:rPr>
-        <w:t>Il database associa un ID al prestito.</w:t>
+        <w:t>Il sistema crea un nuovo prestito associando ad esso le informazioni del lettore che ha effettuato la prenotazione online e la data di restituzione inserita dall’operatore, e lo inserisce nel database.</w:t>
       </w:r>
     </w:p>
     <w:p>
@@ -34567,7 +35252,7 @@
           <w:lang w:eastAsia="en-US"/>
           <w14:ligatures w14:val="standardContextual"/>
         </w:rPr>
-        <w:t>Il sistema rimuove la prenotazione dal database associata alla copia prestata e al lettore.</w:t>
+        <w:t>Il database associa un ID al prestito.</w:t>
       </w:r>
     </w:p>
     <w:p>
@@ -34594,25 +35279,7 @@
           <w:lang w:eastAsia="en-US"/>
           <w14:ligatures w14:val="standardContextual"/>
         </w:rPr>
-        <w:t xml:space="preserve">Il sistema </w:t>
-      </w:r>
-      <w:r>
-        <w:rPr>
-          <w:rFonts w:asciiTheme="minorHAnsi" w:eastAsiaTheme="minorHAnsi" w:hAnsiTheme="minorHAnsi" w:cstheme="minorBidi"/>
-          <w:kern w:val="2"/>
-          <w:lang w:eastAsia="en-US"/>
-          <w14:ligatures w14:val="standardContextual"/>
-        </w:rPr>
-        <w:t>modifica lo stato della copia in “in prestito” e aggiorna il database</w:t>
-      </w:r>
-      <w:r>
-        <w:rPr>
-          <w:rFonts w:asciiTheme="minorHAnsi" w:eastAsiaTheme="minorHAnsi" w:hAnsiTheme="minorHAnsi" w:cstheme="minorBidi"/>
-          <w:kern w:val="2"/>
-          <w:lang w:eastAsia="en-US"/>
-          <w14:ligatures w14:val="standardContextual"/>
-        </w:rPr>
-        <w:t>.</w:t>
+        <w:t>Il sistema rimuove la prenotazione dal database associata alla copia prestata e al lettore.</w:t>
       </w:r>
     </w:p>
     <w:p>
@@ -34639,7 +35306,25 @@
           <w:lang w:eastAsia="en-US"/>
           <w14:ligatures w14:val="standardContextual"/>
         </w:rPr>
-        <w:t>Il sistema mostra a schermo il messaggio “Prestito registrato con successo”.</w:t>
+        <w:t xml:space="preserve">Il sistema </w:t>
+      </w:r>
+      <w:r>
+        <w:rPr>
+          <w:rFonts w:asciiTheme="minorHAnsi" w:eastAsiaTheme="minorHAnsi" w:hAnsiTheme="minorHAnsi" w:cstheme="minorBidi"/>
+          <w:kern w:val="2"/>
+          <w:lang w:eastAsia="en-US"/>
+          <w14:ligatures w14:val="standardContextual"/>
+        </w:rPr>
+        <w:t>modifica lo stato della copia in “in prestito” e aggiorna il database</w:t>
+      </w:r>
+      <w:r>
+        <w:rPr>
+          <w:rFonts w:asciiTheme="minorHAnsi" w:eastAsiaTheme="minorHAnsi" w:hAnsiTheme="minorHAnsi" w:cstheme="minorBidi"/>
+          <w:kern w:val="2"/>
+          <w:lang w:eastAsia="en-US"/>
+          <w14:ligatures w14:val="standardContextual"/>
+        </w:rPr>
+        <w:t>.</w:t>
       </w:r>
     </w:p>
     <w:p>
@@ -34666,6 +35351,33 @@
           <w:lang w:eastAsia="en-US"/>
           <w14:ligatures w14:val="standardContextual"/>
         </w:rPr>
+        <w:t>Il sistema mostra a schermo il messaggio “Prestito registrato con successo”.</w:t>
+      </w:r>
+    </w:p>
+    <w:p>
+      <w:pPr>
+        <w:widowControl/>
+        <w:numPr>
+          <w:ilvl w:val="0"/>
+          <w:numId w:val="39"/>
+        </w:numPr>
+        <w:suppressAutoHyphens w:val="0"/>
+        <w:spacing w:after="100" w:afterAutospacing="1" w:line="278" w:lineRule="auto"/>
+        <w:contextualSpacing/>
+        <w:rPr>
+          <w:rFonts w:asciiTheme="minorHAnsi" w:eastAsiaTheme="minorHAnsi" w:hAnsiTheme="minorHAnsi" w:cstheme="minorBidi"/>
+          <w:kern w:val="2"/>
+          <w:lang w:eastAsia="en-US"/>
+          <w14:ligatures w14:val="standardContextual"/>
+        </w:rPr>
+      </w:pPr>
+      <w:r>
+        <w:rPr>
+          <w:rFonts w:asciiTheme="minorHAnsi" w:eastAsiaTheme="minorHAnsi" w:hAnsiTheme="minorHAnsi" w:cstheme="minorBidi"/>
+          <w:kern w:val="2"/>
+          <w:lang w:eastAsia="en-US"/>
+          <w14:ligatures w14:val="standardContextual"/>
+        </w:rPr>
         <w:t xml:space="preserve">Il sistema reindirizza l’operatore alla pagina </w:t>
       </w:r>
       <w:r>
@@ -35030,6 +35742,66 @@
           <w14:ligatures w14:val="standardContextual"/>
         </w:rPr>
         <w:t>.</w:t>
+      </w:r>
+    </w:p>
+    <w:p>
+      <w:pPr>
+        <w:widowControl/>
+        <w:suppressAutoHyphens w:val="0"/>
+        <w:spacing w:after="100" w:afterAutospacing="1" w:line="278" w:lineRule="auto"/>
+        <w:rPr>
+          <w:rFonts w:asciiTheme="minorHAnsi" w:eastAsiaTheme="minorHAnsi" w:hAnsiTheme="minorHAnsi" w:cstheme="minorBidi"/>
+          <w:kern w:val="2"/>
+          <w:lang w:eastAsia="en-US"/>
+          <w14:ligatures w14:val="standardContextual"/>
+        </w:rPr>
+      </w:pPr>
+      <w:r>
+        <w:rPr>
+          <w:rFonts w:asciiTheme="minorHAnsi" w:eastAsiaTheme="minorHAnsi" w:hAnsiTheme="minorHAnsi" w:cstheme="minorBidi"/>
+          <w:kern w:val="2"/>
+          <w:lang w:eastAsia="en-US"/>
+          <w14:ligatures w14:val="standardContextual"/>
+        </w:rPr>
+        <w:t xml:space="preserve">Se al passo 6 il sistema rileva che il lettore è sospeso, viene eseguito il caso d’uso </w:t>
+      </w:r>
+      <w:r>
+        <w:rPr>
+          <w:rFonts w:asciiTheme="minorHAnsi" w:eastAsiaTheme="minorHAnsi" w:hAnsiTheme="minorHAnsi" w:cstheme="minorBidi"/>
+          <w:b/>
+          <w:bCs/>
+          <w:kern w:val="2"/>
+          <w:lang w:eastAsia="en-US"/>
+          <w14:ligatures w14:val="standardContextual"/>
+        </w:rPr>
+        <w:t>UC16.3 – Lettore sospeso</w:t>
+      </w:r>
+      <w:r>
+        <w:rPr>
+          <w:rFonts w:asciiTheme="minorHAnsi" w:eastAsiaTheme="minorHAnsi" w:hAnsiTheme="minorHAnsi" w:cstheme="minorBidi"/>
+          <w:kern w:val="2"/>
+          <w:lang w:eastAsia="en-US"/>
+          <w14:ligatures w14:val="standardContextual"/>
+        </w:rPr>
+        <w:t xml:space="preserve">. </w:t>
+      </w:r>
+      <w:r>
+        <w:rPr>
+          <w:rFonts w:asciiTheme="minorHAnsi" w:eastAsiaTheme="minorHAnsi" w:hAnsiTheme="minorHAnsi" w:cstheme="minorBidi"/>
+          <w:kern w:val="2"/>
+          <w:lang w:eastAsia="en-US"/>
+          <w14:ligatures w14:val="standardContextual"/>
+        </w:rPr>
+        <w:t xml:space="preserve">Per quanto possa sembrare un controllo ridondante, può essere utile </w:t>
+      </w:r>
+      <w:r>
+        <w:rPr>
+          <w:rFonts w:asciiTheme="minorHAnsi" w:eastAsiaTheme="minorHAnsi" w:hAnsiTheme="minorHAnsi" w:cstheme="minorBidi"/>
+          <w:kern w:val="2"/>
+          <w:lang w:eastAsia="en-US"/>
+          <w14:ligatures w14:val="standardContextual"/>
+        </w:rPr>
+        <w:t>nel caso in cui si ha accesso ad una pagina lettore non aggiornata in seguito ad una sospensione.</w:t>
       </w:r>
     </w:p>
     <w:p>
@@ -35760,16 +36532,408 @@
     </w:p>
     <w:p/>
     <w:p>
-      <w:r>
+      <w:pPr>
+        <w:spacing w:after="100" w:afterAutospacing="1"/>
+      </w:pPr>
+      <w:r>
+        <w:rPr>
+          <w:rFonts w:asciiTheme="minorHAnsi" w:eastAsiaTheme="minorHAnsi" w:hAnsiTheme="minorHAnsi" w:cstheme="minorBidi"/>
+          <w:b/>
+          <w:bCs/>
+          <w:kern w:val="2"/>
+          <w:sz w:val="28"/>
+          <w:szCs w:val="28"/>
+          <w:lang w:eastAsia="en-US"/>
+          <w14:ligatures w14:val="standardContextual"/>
+        </w:rPr>
+        <w:t>UC1</w:t>
+      </w:r>
+      <w:r>
+        <w:rPr>
+          <w:rFonts w:asciiTheme="minorHAnsi" w:eastAsiaTheme="minorHAnsi" w:hAnsiTheme="minorHAnsi" w:cstheme="minorBidi"/>
+          <w:b/>
+          <w:bCs/>
+          <w:kern w:val="2"/>
+          <w:sz w:val="28"/>
+          <w:szCs w:val="28"/>
+          <w:lang w:eastAsia="en-US"/>
+          <w14:ligatures w14:val="standardContextual"/>
+        </w:rPr>
+        <w:t>6</w:t>
+      </w:r>
+      <w:r>
+        <w:rPr>
+          <w:rFonts w:asciiTheme="minorHAnsi" w:eastAsiaTheme="minorHAnsi" w:hAnsiTheme="minorHAnsi" w:cstheme="minorBidi"/>
+          <w:b/>
+          <w:bCs/>
+          <w:kern w:val="2"/>
+          <w:sz w:val="28"/>
+          <w:szCs w:val="28"/>
+          <w:lang w:eastAsia="en-US"/>
+          <w14:ligatures w14:val="standardContextual"/>
+        </w:rPr>
+        <w:t>.</w:t>
+      </w:r>
+      <w:r>
+        <w:rPr>
+          <w:rFonts w:asciiTheme="minorHAnsi" w:eastAsiaTheme="minorHAnsi" w:hAnsiTheme="minorHAnsi" w:cstheme="minorBidi"/>
+          <w:b/>
+          <w:bCs/>
+          <w:kern w:val="2"/>
+          <w:sz w:val="28"/>
+          <w:szCs w:val="28"/>
+          <w:lang w:eastAsia="en-US"/>
+          <w14:ligatures w14:val="standardContextual"/>
+        </w:rPr>
+        <w:t xml:space="preserve">3 </w:t>
+      </w:r>
+      <w:r>
+        <w:rPr>
+          <w:rFonts w:asciiTheme="minorHAnsi" w:eastAsiaTheme="minorHAnsi" w:hAnsiTheme="minorHAnsi" w:cstheme="minorBidi"/>
+          <w:b/>
+          <w:bCs/>
+          <w:kern w:val="2"/>
+          <w:sz w:val="28"/>
+          <w:szCs w:val="28"/>
+          <w:lang w:eastAsia="en-US"/>
+          <w14:ligatures w14:val="standardContextual"/>
+        </w:rPr>
+        <w:t xml:space="preserve">– </w:t>
+      </w:r>
+      <w:r>
+        <w:rPr>
+          <w:rFonts w:asciiTheme="minorHAnsi" w:eastAsiaTheme="minorHAnsi" w:hAnsiTheme="minorHAnsi" w:cstheme="minorBidi"/>
+          <w:b/>
+          <w:bCs/>
+          <w:kern w:val="2"/>
+          <w:sz w:val="28"/>
+          <w:szCs w:val="28"/>
+          <w:lang w:eastAsia="en-US"/>
+          <w14:ligatures w14:val="standardContextual"/>
+        </w:rPr>
+        <w:t>Lettore sospeso</w:t>
+      </w:r>
+    </w:p>
+    <w:p>
+      <w:pPr>
+        <w:widowControl/>
+        <w:suppressAutoHyphens w:val="0"/>
+        <w:spacing w:after="100" w:afterAutospacing="1" w:line="278" w:lineRule="auto"/>
+        <w:rPr>
+          <w:rFonts w:asciiTheme="minorHAnsi" w:eastAsiaTheme="minorHAnsi" w:hAnsiTheme="minorHAnsi" w:cstheme="minorBidi"/>
+          <w:kern w:val="2"/>
+          <w:lang w:eastAsia="en-US"/>
+          <w14:ligatures w14:val="standardContextual"/>
+        </w:rPr>
+      </w:pPr>
+      <w:r>
+        <w:rPr>
+          <w:rFonts w:asciiTheme="minorHAnsi" w:eastAsiaTheme="minorHAnsi" w:hAnsiTheme="minorHAnsi" w:cstheme="minorBidi"/>
+          <w:b/>
+          <w:bCs/>
+          <w:kern w:val="2"/>
+          <w:lang w:eastAsia="en-US"/>
+          <w14:ligatures w14:val="standardContextual"/>
+        </w:rPr>
+        <w:t>Attori:</w:t>
+      </w:r>
+      <w:r>
+        <w:rPr>
+          <w:rFonts w:asciiTheme="minorHAnsi" w:eastAsiaTheme="minorHAnsi" w:hAnsiTheme="minorHAnsi" w:cstheme="minorBidi"/>
+          <w:kern w:val="2"/>
+          <w:lang w:eastAsia="en-US"/>
+          <w14:ligatures w14:val="standardContextual"/>
+        </w:rPr>
+        <w:t xml:space="preserve"> Operatore.</w:t>
+      </w:r>
+    </w:p>
+    <w:p>
+      <w:pPr>
+        <w:widowControl/>
+        <w:suppressAutoHyphens w:val="0"/>
+        <w:spacing w:after="100" w:afterAutospacing="1" w:line="278" w:lineRule="auto"/>
+        <w:rPr>
+          <w:rFonts w:asciiTheme="minorHAnsi" w:eastAsiaTheme="minorHAnsi" w:hAnsiTheme="minorHAnsi" w:cstheme="minorBidi"/>
+          <w:kern w:val="2"/>
+          <w:lang w:eastAsia="en-US"/>
+          <w14:ligatures w14:val="standardContextual"/>
+        </w:rPr>
+      </w:pPr>
+      <w:r>
+        <w:rPr>
+          <w:rFonts w:asciiTheme="minorHAnsi" w:eastAsiaTheme="minorHAnsi" w:hAnsiTheme="minorHAnsi" w:cstheme="minorBidi"/>
+          <w:b/>
+          <w:bCs/>
+          <w:kern w:val="2"/>
+          <w:lang w:eastAsia="en-US"/>
+          <w14:ligatures w14:val="standardContextual"/>
+        </w:rPr>
+        <w:t>Entry condition:</w:t>
+      </w:r>
+      <w:r>
+        <w:rPr>
+          <w:rFonts w:asciiTheme="minorHAnsi" w:eastAsiaTheme="minorHAnsi" w:hAnsiTheme="minorHAnsi" w:cstheme="minorBidi"/>
+          <w:kern w:val="2"/>
+          <w:lang w:eastAsia="en-US"/>
+          <w14:ligatures w14:val="standardContextual"/>
+        </w:rPr>
+        <w:t xml:space="preserve"> L’operatore ha provato ad effettuare un prestito per un lettore sospeso.</w:t>
+      </w:r>
+    </w:p>
+    <w:p>
+      <w:pPr>
+        <w:widowControl/>
+        <w:suppressAutoHyphens w:val="0"/>
+        <w:spacing w:after="100" w:afterAutospacing="1" w:line="278" w:lineRule="auto"/>
+        <w:rPr>
+          <w:rFonts w:asciiTheme="minorHAnsi" w:eastAsiaTheme="minorHAnsi" w:hAnsiTheme="minorHAnsi" w:cstheme="minorBidi"/>
+          <w:b/>
+          <w:bCs/>
+          <w:kern w:val="2"/>
+          <w:lang w:eastAsia="en-US"/>
+          <w14:ligatures w14:val="standardContextual"/>
+        </w:rPr>
+      </w:pPr>
+      <w:r>
+        <w:rPr>
+          <w:rFonts w:asciiTheme="minorHAnsi" w:eastAsiaTheme="minorHAnsi" w:hAnsiTheme="minorHAnsi" w:cstheme="minorBidi"/>
+          <w:b/>
+          <w:bCs/>
+          <w:kern w:val="2"/>
+          <w:lang w:eastAsia="en-US"/>
+          <w14:ligatures w14:val="standardContextual"/>
+        </w:rPr>
+        <w:t>Flusso di eventi:</w:t>
+      </w:r>
+    </w:p>
+    <w:p>
+      <w:pPr>
+        <w:widowControl/>
+        <w:numPr>
+          <w:ilvl w:val="0"/>
+          <w:numId w:val="83"/>
+        </w:numPr>
+        <w:suppressAutoHyphens w:val="0"/>
+        <w:spacing w:after="100" w:afterAutospacing="1" w:line="278" w:lineRule="auto"/>
+        <w:contextualSpacing/>
+        <w:rPr>
+          <w:rFonts w:asciiTheme="minorHAnsi" w:eastAsiaTheme="minorHAnsi" w:hAnsiTheme="minorHAnsi" w:cstheme="minorBidi"/>
+          <w:kern w:val="2"/>
+          <w:lang w:eastAsia="en-US"/>
+          <w14:ligatures w14:val="standardContextual"/>
+        </w:rPr>
+      </w:pPr>
+      <w:r>
+        <w:rPr>
+          <w:rFonts w:asciiTheme="minorHAnsi" w:eastAsiaTheme="minorHAnsi" w:hAnsiTheme="minorHAnsi" w:cstheme="minorBidi"/>
+          <w:kern w:val="2"/>
+          <w:lang w:eastAsia="en-US"/>
+          <w14:ligatures w14:val="standardContextual"/>
+        </w:rPr>
+        <w:t>Il sistema mostra a schermo il messaggio “Errore: Il lettore è temporaneamente sospeso”</w:t>
+      </w:r>
+      <w:r>
+        <w:rPr>
+          <w:rFonts w:asciiTheme="minorHAnsi" w:eastAsiaTheme="minorHAnsi" w:hAnsiTheme="minorHAnsi" w:cstheme="minorBidi"/>
+          <w:kern w:val="2"/>
+          <w:lang w:eastAsia="en-US"/>
+          <w14:ligatures w14:val="standardContextual"/>
+        </w:rPr>
+        <w:t xml:space="preserve"> con un pulsante “Ok”</w:t>
+      </w:r>
+      <w:r>
+        <w:rPr>
+          <w:rFonts w:asciiTheme="minorHAnsi" w:eastAsiaTheme="minorHAnsi" w:hAnsiTheme="minorHAnsi" w:cstheme="minorBidi"/>
+          <w:kern w:val="2"/>
+          <w:lang w:eastAsia="en-US"/>
+          <w14:ligatures w14:val="standardContextual"/>
+        </w:rPr>
+        <w:t>.</w:t>
+      </w:r>
+    </w:p>
+    <w:p>
+      <w:pPr>
+        <w:widowControl/>
+        <w:numPr>
+          <w:ilvl w:val="0"/>
+          <w:numId w:val="83"/>
+        </w:numPr>
+        <w:suppressAutoHyphens w:val="0"/>
+        <w:spacing w:after="100" w:afterAutospacing="1" w:line="278" w:lineRule="auto"/>
+        <w:contextualSpacing/>
+        <w:rPr>
+          <w:rFonts w:asciiTheme="minorHAnsi" w:eastAsiaTheme="minorHAnsi" w:hAnsiTheme="minorHAnsi" w:cstheme="minorBidi"/>
+          <w:kern w:val="2"/>
+          <w:lang w:eastAsia="en-US"/>
+          <w14:ligatures w14:val="standardContextual"/>
+        </w:rPr>
+      </w:pPr>
+      <w:r>
+        <w:rPr>
+          <w:rFonts w:asciiTheme="minorHAnsi" w:eastAsiaTheme="minorHAnsi" w:hAnsiTheme="minorHAnsi" w:cstheme="minorBidi"/>
+          <w:kern w:val="2"/>
+          <w:lang w:eastAsia="en-US"/>
+          <w14:ligatures w14:val="standardContextual"/>
+        </w:rPr>
+        <w:t>L’operatore preme “Ok”.</w:t>
+      </w:r>
+    </w:p>
+    <w:p>
+      <w:pPr>
+        <w:widowControl/>
+        <w:numPr>
+          <w:ilvl w:val="0"/>
+          <w:numId w:val="83"/>
+        </w:numPr>
+        <w:suppressAutoHyphens w:val="0"/>
+        <w:spacing w:after="100" w:afterAutospacing="1" w:line="278" w:lineRule="auto"/>
+        <w:contextualSpacing/>
+        <w:rPr>
+          <w:rFonts w:asciiTheme="minorHAnsi" w:eastAsiaTheme="minorHAnsi" w:hAnsiTheme="minorHAnsi" w:cstheme="minorBidi"/>
+          <w:kern w:val="2"/>
+          <w:lang w:eastAsia="en-US"/>
+          <w14:ligatures w14:val="standardContextual"/>
+        </w:rPr>
+      </w:pPr>
+      <w:r>
+        <w:rPr>
+          <w:rFonts w:asciiTheme="minorHAnsi" w:eastAsiaTheme="minorHAnsi" w:hAnsiTheme="minorHAnsi" w:cstheme="minorBidi"/>
+          <w:kern w:val="2"/>
+          <w:lang w:eastAsia="en-US"/>
+          <w14:ligatures w14:val="standardContextual"/>
+        </w:rPr>
+        <w:t xml:space="preserve">Il sistema </w:t>
+      </w:r>
+      <w:r>
+        <w:rPr>
+          <w:rFonts w:asciiTheme="minorHAnsi" w:hAnsiTheme="minorHAnsi"/>
+        </w:rPr>
+        <w:t xml:space="preserve">reindirizza l’operatore alla </w:t>
+      </w:r>
+      <w:r>
+        <w:rPr>
+          <w:rFonts w:asciiTheme="minorHAnsi" w:eastAsiaTheme="minorHAnsi" w:hAnsiTheme="minorHAnsi" w:cstheme="minorBidi"/>
+          <w:kern w:val="2"/>
+          <w:lang w:eastAsia="en-US"/>
+          <w14:ligatures w14:val="standardContextual"/>
+        </w:rPr>
+        <w:t>pagina</w:t>
+      </w:r>
+      <w:r>
+        <w:rPr>
+          <w:rFonts w:asciiTheme="minorHAnsi" w:eastAsiaTheme="minorHAnsi" w:hAnsiTheme="minorHAnsi" w:cstheme="minorBidi"/>
+          <w:kern w:val="2"/>
+          <w:lang w:eastAsia="en-US"/>
+          <w14:ligatures w14:val="standardContextual"/>
+        </w:rPr>
+        <w:t xml:space="preserve"> delle informazioni del </w:t>
+      </w:r>
+      <w:r>
+        <w:rPr>
+          <w:rFonts w:asciiTheme="minorHAnsi" w:eastAsiaTheme="minorHAnsi" w:hAnsiTheme="minorHAnsi" w:cstheme="minorBidi"/>
+          <w:kern w:val="2"/>
+          <w:lang w:eastAsia="en-US"/>
+          <w14:ligatures w14:val="standardContextual"/>
+        </w:rPr>
+        <w:t>lettore registrato</w:t>
+      </w:r>
+      <w:r>
+        <w:rPr>
+          <w:rFonts w:asciiTheme="minorHAnsi" w:eastAsiaTheme="minorHAnsi" w:hAnsiTheme="minorHAnsi" w:cstheme="minorBidi"/>
+          <w:kern w:val="2"/>
+          <w:lang w:eastAsia="en-US"/>
+          <w14:ligatures w14:val="standardContextual"/>
+        </w:rPr>
+        <w:t>.</w:t>
+      </w:r>
+    </w:p>
+    <w:p>
+      <w:pPr>
+        <w:widowControl/>
+        <w:suppressAutoHyphens w:val="0"/>
+        <w:spacing w:after="100" w:afterAutospacing="1" w:line="278" w:lineRule="auto"/>
+        <w:rPr>
+          <w:rFonts w:asciiTheme="minorHAnsi" w:eastAsiaTheme="minorHAnsi" w:hAnsiTheme="minorHAnsi" w:cstheme="minorBidi"/>
+          <w:kern w:val="2"/>
+          <w:lang w:eastAsia="en-US"/>
+          <w14:ligatures w14:val="standardContextual"/>
+        </w:rPr>
+      </w:pPr>
+      <w:r>
+        <w:rPr>
+          <w:rFonts w:asciiTheme="minorHAnsi" w:eastAsiaTheme="minorHAnsi" w:hAnsiTheme="minorHAnsi" w:cstheme="minorBidi"/>
+          <w:b/>
+          <w:bCs/>
+          <w:kern w:val="2"/>
+          <w:lang w:eastAsia="en-US"/>
+          <w14:ligatures w14:val="standardContextual"/>
+        </w:rPr>
+        <w:t>Exit condition:</w:t>
+      </w:r>
+      <w:r>
+        <w:rPr>
+          <w:rFonts w:asciiTheme="minorHAnsi" w:eastAsiaTheme="minorHAnsi" w:hAnsiTheme="minorHAnsi" w:cstheme="minorBidi"/>
+          <w:kern w:val="2"/>
+          <w:lang w:eastAsia="en-US"/>
+          <w14:ligatures w14:val="standardContextual"/>
+        </w:rPr>
+        <w:t xml:space="preserve"> L’operatore si trova sulla </w:t>
+      </w:r>
+      <w:r>
+        <w:rPr>
+          <w:rFonts w:asciiTheme="minorHAnsi" w:eastAsiaTheme="minorHAnsi" w:hAnsiTheme="minorHAnsi" w:cstheme="minorBidi"/>
+          <w:kern w:val="2"/>
+          <w:lang w:eastAsia="en-US"/>
+          <w14:ligatures w14:val="standardContextual"/>
+        </w:rPr>
+        <w:t>pagina</w:t>
+      </w:r>
+      <w:r>
+        <w:rPr>
+          <w:rFonts w:asciiTheme="minorHAnsi" w:eastAsiaTheme="minorHAnsi" w:hAnsiTheme="minorHAnsi" w:cstheme="minorBidi"/>
+          <w:kern w:val="2"/>
+          <w:lang w:eastAsia="en-US"/>
+          <w14:ligatures w14:val="standardContextual"/>
+        </w:rPr>
+        <w:t xml:space="preserve"> delle informazioni del </w:t>
+      </w:r>
+      <w:r>
+        <w:rPr>
+          <w:rFonts w:asciiTheme="minorHAnsi" w:eastAsiaTheme="minorHAnsi" w:hAnsiTheme="minorHAnsi" w:cstheme="minorBidi"/>
+          <w:kern w:val="2"/>
+          <w:lang w:eastAsia="en-US"/>
+          <w14:ligatures w14:val="standardContextual"/>
+        </w:rPr>
+        <w:t>lettore registrato</w:t>
+      </w:r>
+      <w:r>
+        <w:rPr>
+          <w:rFonts w:asciiTheme="minorHAnsi" w:eastAsiaTheme="minorHAnsi" w:hAnsiTheme="minorHAnsi" w:cstheme="minorBidi"/>
+          <w:kern w:val="2"/>
+          <w:lang w:eastAsia="en-US"/>
+          <w14:ligatures w14:val="standardContextual"/>
+        </w:rPr>
+        <w:t xml:space="preserve"> e il prestito non è registrato</w:t>
+      </w:r>
+      <w:r>
+        <w:rPr>
+          <w:rFonts w:asciiTheme="minorHAnsi" w:eastAsiaTheme="minorHAnsi" w:hAnsiTheme="minorHAnsi" w:cstheme="minorBidi"/>
+          <w:kern w:val="2"/>
+          <w:lang w:eastAsia="en-US"/>
+          <w14:ligatures w14:val="standardContextual"/>
+        </w:rPr>
+        <w:t>.</w:t>
+      </w:r>
+      <w:r>
+        <w:rPr>
+          <w:rFonts w:asciiTheme="minorHAnsi" w:hAnsiTheme="minorHAnsi"/>
+          <w:b/>
+          <w:bCs/>
+          <w:sz w:val="28"/>
+          <w:szCs w:val="28"/>
+        </w:rPr>
         <w:br w:type="page"/>
       </w:r>
-    </w:p>
-    <w:p>
-      <w:pPr>
-        <w:rPr>
-          <w:rFonts w:asciiTheme="minorHAnsi" w:hAnsiTheme="minorHAnsi"/>
-        </w:rPr>
-      </w:pPr>
       <w:r>
         <w:rPr>
           <w:rFonts w:asciiTheme="minorHAnsi" w:hAnsiTheme="minorHAnsi"/>
@@ -36643,16 +37807,7 @@
           <w:lang w:eastAsia="en-US"/>
           <w14:ligatures w14:val="standardContextual"/>
         </w:rPr>
-        <w:t xml:space="preserve">al </w:t>
-      </w:r>
-      <w:r>
-        <w:rPr>
-          <w:rFonts w:asciiTheme="minorHAnsi" w:eastAsiaTheme="minorHAnsi" w:hAnsiTheme="minorHAnsi" w:cstheme="minorBidi"/>
-          <w:kern w:val="2"/>
-          <w:lang w:eastAsia="en-US"/>
-          <w14:ligatures w14:val="standardContextual"/>
-        </w:rPr>
-        <w:t xml:space="preserve">passo 4 </w:t>
+        <w:t xml:space="preserve">tra il passo 4 e il passo 5 </w:t>
       </w:r>
       <w:r>
         <w:rPr>
@@ -36758,6 +37913,17 @@
         </w:rPr>
         <w:t>.</w:t>
       </w:r>
+    </w:p>
+    <w:p>
+      <w:pPr>
+        <w:spacing w:after="100" w:afterAutospacing="1"/>
+        <w:rPr>
+          <w:rFonts w:asciiTheme="minorHAnsi" w:eastAsiaTheme="minorHAnsi" w:hAnsiTheme="minorHAnsi" w:cstheme="minorBidi"/>
+          <w:kern w:val="2"/>
+          <w:lang w:eastAsia="en-US"/>
+          <w14:ligatures w14:val="standardContextual"/>
+        </w:rPr>
+      </w:pPr>
     </w:p>
     <w:p>
       <w:pPr>
@@ -36872,6 +38038,7 @@
           <w:b/>
           <w:bCs/>
         </w:rPr>
+        <w:lastRenderedPageBreak/>
         <w:t>Attori:</w:t>
       </w:r>
       <w:r>
@@ -36894,7 +38061,6 @@
           <w:b/>
           <w:bCs/>
         </w:rPr>
-        <w:lastRenderedPageBreak/>
         <w:t>Entry condition</w:t>
       </w:r>
       <w:r>
@@ -42362,16 +43528,8 @@
         <w:rPr>
           <w:lang w:val="en-US"/>
         </w:rPr>
-        <w:t xml:space="preserve">Fig 1.2 - Home </w:t>
-      </w:r>
-      <w:proofErr w:type="spellStart"/>
-      <w:r>
-        <w:rPr>
-          <w:lang w:val="en-US"/>
-        </w:rPr>
-        <w:t>operatore</w:t>
-      </w:r>
-      <w:proofErr w:type="spellEnd"/>
+        <w:t>Fig 1.2 - Home operatore</w:t>
+      </w:r>
     </w:p>
     <w:p>
       <w:pPr>
@@ -42457,30 +43615,8 @@
         <w:rPr>
           <w:lang w:val="en-US"/>
         </w:rPr>
-        <w:t xml:space="preserve">Fig 3.0 - </w:t>
-      </w:r>
-      <w:proofErr w:type="spellStart"/>
-      <w:r>
-        <w:rPr>
-          <w:lang w:val="en-US"/>
-        </w:rPr>
-        <w:t>Gestione</w:t>
-      </w:r>
-      <w:proofErr w:type="spellEnd"/>
-      <w:r>
-        <w:rPr>
-          <w:lang w:val="en-US"/>
-        </w:rPr>
-        <w:t xml:space="preserve"> </w:t>
-      </w:r>
-      <w:proofErr w:type="spellStart"/>
-      <w:r>
-        <w:rPr>
-          <w:lang w:val="en-US"/>
-        </w:rPr>
-        <w:t>Lettori</w:t>
-      </w:r>
-      <w:proofErr w:type="spellEnd"/>
+        <w:t>Fig 3.0 - Gestione Lettori</w:t>
+      </w:r>
     </w:p>
     <w:p>
       <w:pPr>
@@ -45864,6 +47000,92 @@
     </w:lvl>
   </w:abstractNum>
   <w:abstractNum w:abstractNumId="9" w15:restartNumberingAfterBreak="0">
+    <w:nsid w:val="07FB694D"/>
+    <w:multiLevelType w:val="multilevel"/>
+    <w:tmpl w:val="BCBCE796"/>
+    <w:lvl w:ilvl="0">
+      <w:start w:val="1"/>
+      <w:numFmt w:val="decimal"/>
+      <w:lvlText w:val="%1."/>
+      <w:lvlJc w:val="left"/>
+      <w:pPr>
+        <w:ind w:left="709" w:hanging="360"/>
+      </w:pPr>
+    </w:lvl>
+    <w:lvl w:ilvl="1">
+      <w:start w:val="1"/>
+      <w:numFmt w:val="lowerLetter"/>
+      <w:lvlText w:val="%2."/>
+      <w:lvlJc w:val="left"/>
+      <w:pPr>
+        <w:ind w:left="1429" w:hanging="360"/>
+      </w:pPr>
+    </w:lvl>
+    <w:lvl w:ilvl="2">
+      <w:start w:val="1"/>
+      <w:numFmt w:val="lowerRoman"/>
+      <w:lvlText w:val="%3."/>
+      <w:lvlJc w:val="right"/>
+      <w:pPr>
+        <w:ind w:left="2149" w:hanging="180"/>
+      </w:pPr>
+    </w:lvl>
+    <w:lvl w:ilvl="3">
+      <w:start w:val="1"/>
+      <w:numFmt w:val="decimal"/>
+      <w:lvlText w:val="%4."/>
+      <w:lvlJc w:val="left"/>
+      <w:pPr>
+        <w:ind w:left="2869" w:hanging="360"/>
+      </w:pPr>
+    </w:lvl>
+    <w:lvl w:ilvl="4">
+      <w:start w:val="1"/>
+      <w:numFmt w:val="lowerLetter"/>
+      <w:lvlText w:val="%5."/>
+      <w:lvlJc w:val="left"/>
+      <w:pPr>
+        <w:ind w:left="3589" w:hanging="360"/>
+      </w:pPr>
+    </w:lvl>
+    <w:lvl w:ilvl="5">
+      <w:start w:val="1"/>
+      <w:numFmt w:val="lowerRoman"/>
+      <w:lvlText w:val="%6."/>
+      <w:lvlJc w:val="right"/>
+      <w:pPr>
+        <w:ind w:left="4309" w:hanging="180"/>
+      </w:pPr>
+    </w:lvl>
+    <w:lvl w:ilvl="6">
+      <w:start w:val="1"/>
+      <w:numFmt w:val="decimal"/>
+      <w:lvlText w:val="%7."/>
+      <w:lvlJc w:val="left"/>
+      <w:pPr>
+        <w:ind w:left="5029" w:hanging="360"/>
+      </w:pPr>
+    </w:lvl>
+    <w:lvl w:ilvl="7">
+      <w:start w:val="1"/>
+      <w:numFmt w:val="lowerLetter"/>
+      <w:lvlText w:val="%8."/>
+      <w:lvlJc w:val="left"/>
+      <w:pPr>
+        <w:ind w:left="5749" w:hanging="360"/>
+      </w:pPr>
+    </w:lvl>
+    <w:lvl w:ilvl="8">
+      <w:start w:val="1"/>
+      <w:numFmt w:val="lowerRoman"/>
+      <w:lvlText w:val="%9."/>
+      <w:lvlJc w:val="right"/>
+      <w:pPr>
+        <w:ind w:left="6469" w:hanging="180"/>
+      </w:pPr>
+    </w:lvl>
+  </w:abstractNum>
+  <w:abstractNum w:abstractNumId="10" w15:restartNumberingAfterBreak="0">
     <w:nsid w:val="0C943BA3"/>
     <w:multiLevelType w:val="multilevel"/>
     <w:tmpl w:val="BCBCE796"/>
@@ -45949,7 +47171,7 @@
       </w:pPr>
     </w:lvl>
   </w:abstractNum>
-  <w:abstractNum w:abstractNumId="10" w15:restartNumberingAfterBreak="0">
+  <w:abstractNum w:abstractNumId="11" w15:restartNumberingAfterBreak="0">
     <w:nsid w:val="0CE30B61"/>
     <w:multiLevelType w:val="hybridMultilevel"/>
     <w:tmpl w:val="119E2AFA"/>
@@ -46038,7 +47260,7 @@
       </w:pPr>
     </w:lvl>
   </w:abstractNum>
-  <w:abstractNum w:abstractNumId="11" w15:restartNumberingAfterBreak="0">
+  <w:abstractNum w:abstractNumId="12" w15:restartNumberingAfterBreak="0">
     <w:nsid w:val="0DC04316"/>
     <w:multiLevelType w:val="hybridMultilevel"/>
     <w:tmpl w:val="5FF489AA"/>
@@ -46130,7 +47352,7 @@
       </w:pPr>
     </w:lvl>
   </w:abstractNum>
-  <w:abstractNum w:abstractNumId="12" w15:restartNumberingAfterBreak="0">
+  <w:abstractNum w:abstractNumId="13" w15:restartNumberingAfterBreak="0">
     <w:nsid w:val="102A3C9A"/>
     <w:multiLevelType w:val="multilevel"/>
     <w:tmpl w:val="BCBCE796"/>
@@ -46216,7 +47438,7 @@
       </w:pPr>
     </w:lvl>
   </w:abstractNum>
-  <w:abstractNum w:abstractNumId="13" w15:restartNumberingAfterBreak="0">
+  <w:abstractNum w:abstractNumId="14" w15:restartNumberingAfterBreak="0">
     <w:nsid w:val="106351B3"/>
     <w:multiLevelType w:val="multilevel"/>
     <w:tmpl w:val="BCBCE796"/>
@@ -46302,7 +47524,7 @@
       </w:pPr>
     </w:lvl>
   </w:abstractNum>
-  <w:abstractNum w:abstractNumId="14" w15:restartNumberingAfterBreak="0">
+  <w:abstractNum w:abstractNumId="15" w15:restartNumberingAfterBreak="0">
     <w:nsid w:val="125C020E"/>
     <w:multiLevelType w:val="multilevel"/>
     <w:tmpl w:val="BCBCE796"/>
@@ -46388,7 +47610,7 @@
       </w:pPr>
     </w:lvl>
   </w:abstractNum>
-  <w:abstractNum w:abstractNumId="15" w15:restartNumberingAfterBreak="0">
+  <w:abstractNum w:abstractNumId="16" w15:restartNumberingAfterBreak="0">
     <w:nsid w:val="146D44E1"/>
     <w:multiLevelType w:val="multilevel"/>
     <w:tmpl w:val="BCBCE796"/>
@@ -46474,7 +47696,7 @@
       </w:pPr>
     </w:lvl>
   </w:abstractNum>
-  <w:abstractNum w:abstractNumId="16" w15:restartNumberingAfterBreak="0">
+  <w:abstractNum w:abstractNumId="17" w15:restartNumberingAfterBreak="0">
     <w:nsid w:val="14CF0887"/>
     <w:multiLevelType w:val="multilevel"/>
     <w:tmpl w:val="BCBCE796"/>
@@ -46560,7 +47782,7 @@
       </w:pPr>
     </w:lvl>
   </w:abstractNum>
-  <w:abstractNum w:abstractNumId="17" w15:restartNumberingAfterBreak="0">
+  <w:abstractNum w:abstractNumId="18" w15:restartNumberingAfterBreak="0">
     <w:nsid w:val="15A87742"/>
     <w:multiLevelType w:val="hybridMultilevel"/>
     <w:tmpl w:val="119E2AFA"/>
@@ -46649,7 +47871,7 @@
       </w:pPr>
     </w:lvl>
   </w:abstractNum>
-  <w:abstractNum w:abstractNumId="18" w15:restartNumberingAfterBreak="0">
+  <w:abstractNum w:abstractNumId="19" w15:restartNumberingAfterBreak="0">
     <w:nsid w:val="15BC09F0"/>
     <w:multiLevelType w:val="multilevel"/>
     <w:tmpl w:val="BCBCE796"/>
@@ -46735,7 +47957,7 @@
       </w:pPr>
     </w:lvl>
   </w:abstractNum>
-  <w:abstractNum w:abstractNumId="19" w15:restartNumberingAfterBreak="0">
+  <w:abstractNum w:abstractNumId="20" w15:restartNumberingAfterBreak="0">
     <w:nsid w:val="160A2B8B"/>
     <w:multiLevelType w:val="hybridMultilevel"/>
     <w:tmpl w:val="119E2AFA"/>
@@ -46824,7 +48046,7 @@
       </w:pPr>
     </w:lvl>
   </w:abstractNum>
-  <w:abstractNum w:abstractNumId="20" w15:restartNumberingAfterBreak="0">
+  <w:abstractNum w:abstractNumId="21" w15:restartNumberingAfterBreak="0">
     <w:nsid w:val="17001144"/>
     <w:multiLevelType w:val="hybridMultilevel"/>
     <w:tmpl w:val="72BABDB8"/>
@@ -46913,7 +48135,7 @@
       </w:pPr>
     </w:lvl>
   </w:abstractNum>
-  <w:abstractNum w:abstractNumId="21" w15:restartNumberingAfterBreak="0">
+  <w:abstractNum w:abstractNumId="22" w15:restartNumberingAfterBreak="0">
     <w:nsid w:val="17303659"/>
     <w:multiLevelType w:val="hybridMultilevel"/>
     <w:tmpl w:val="5FF489AA"/>
@@ -47005,7 +48227,7 @@
       </w:pPr>
     </w:lvl>
   </w:abstractNum>
-  <w:abstractNum w:abstractNumId="22" w15:restartNumberingAfterBreak="0">
+  <w:abstractNum w:abstractNumId="23" w15:restartNumberingAfterBreak="0">
     <w:nsid w:val="181A44E8"/>
     <w:multiLevelType w:val="hybridMultilevel"/>
     <w:tmpl w:val="119E2AFA"/>
@@ -47094,7 +48316,7 @@
       </w:pPr>
     </w:lvl>
   </w:abstractNum>
-  <w:abstractNum w:abstractNumId="23" w15:restartNumberingAfterBreak="0">
+  <w:abstractNum w:abstractNumId="24" w15:restartNumberingAfterBreak="0">
     <w:nsid w:val="18EE1A96"/>
     <w:multiLevelType w:val="multilevel"/>
     <w:tmpl w:val="BCBCE796"/>
@@ -47180,7 +48402,7 @@
       </w:pPr>
     </w:lvl>
   </w:abstractNum>
-  <w:abstractNum w:abstractNumId="24" w15:restartNumberingAfterBreak="0">
+  <w:abstractNum w:abstractNumId="25" w15:restartNumberingAfterBreak="0">
     <w:nsid w:val="19C674F4"/>
     <w:multiLevelType w:val="multilevel"/>
     <w:tmpl w:val="E54E71DC"/>
@@ -47292,7 +48514,7 @@
       </w:rPr>
     </w:lvl>
   </w:abstractNum>
-  <w:abstractNum w:abstractNumId="25" w15:restartNumberingAfterBreak="0">
+  <w:abstractNum w:abstractNumId="26" w15:restartNumberingAfterBreak="0">
     <w:nsid w:val="19EC2D93"/>
     <w:multiLevelType w:val="hybridMultilevel"/>
     <w:tmpl w:val="5FF489AA"/>
@@ -47384,7 +48606,7 @@
       </w:pPr>
     </w:lvl>
   </w:abstractNum>
-  <w:abstractNum w:abstractNumId="26" w15:restartNumberingAfterBreak="0">
+  <w:abstractNum w:abstractNumId="27" w15:restartNumberingAfterBreak="0">
     <w:nsid w:val="1A2FD67D"/>
     <w:multiLevelType w:val="hybridMultilevel"/>
     <w:tmpl w:val="B9BE572A"/>
@@ -47497,7 +48719,7 @@
       </w:rPr>
     </w:lvl>
   </w:abstractNum>
-  <w:abstractNum w:abstractNumId="27" w15:restartNumberingAfterBreak="0">
+  <w:abstractNum w:abstractNumId="28" w15:restartNumberingAfterBreak="0">
     <w:nsid w:val="1A920B99"/>
     <w:multiLevelType w:val="multilevel"/>
     <w:tmpl w:val="BCBCE796"/>
@@ -47583,7 +48805,7 @@
       </w:pPr>
     </w:lvl>
   </w:abstractNum>
-  <w:abstractNum w:abstractNumId="28" w15:restartNumberingAfterBreak="0">
+  <w:abstractNum w:abstractNumId="29" w15:restartNumberingAfterBreak="0">
     <w:nsid w:val="1D7FC9C9"/>
     <w:multiLevelType w:val="multilevel"/>
     <w:tmpl w:val="40C2ADEC"/>
@@ -47672,7 +48894,7 @@
       </w:pPr>
     </w:lvl>
   </w:abstractNum>
-  <w:abstractNum w:abstractNumId="29" w15:restartNumberingAfterBreak="0">
+  <w:abstractNum w:abstractNumId="30" w15:restartNumberingAfterBreak="0">
     <w:nsid w:val="1DDE17E0"/>
     <w:multiLevelType w:val="multilevel"/>
     <w:tmpl w:val="2B060D34"/>
@@ -47784,7 +49006,7 @@
       </w:rPr>
     </w:lvl>
   </w:abstractNum>
-  <w:abstractNum w:abstractNumId="30" w15:restartNumberingAfterBreak="0">
+  <w:abstractNum w:abstractNumId="31" w15:restartNumberingAfterBreak="0">
     <w:nsid w:val="1EB636BE"/>
     <w:multiLevelType w:val="hybridMultilevel"/>
     <w:tmpl w:val="708C4F1E"/>
@@ -47897,7 +49119,7 @@
       </w:rPr>
     </w:lvl>
   </w:abstractNum>
-  <w:abstractNum w:abstractNumId="31" w15:restartNumberingAfterBreak="0">
+  <w:abstractNum w:abstractNumId="32" w15:restartNumberingAfterBreak="0">
     <w:nsid w:val="1F8433D7"/>
     <w:multiLevelType w:val="multilevel"/>
     <w:tmpl w:val="03B49136"/>
@@ -48015,7 +49237,93 @@
       </w:rPr>
     </w:lvl>
   </w:abstractNum>
-  <w:abstractNum w:abstractNumId="32" w15:restartNumberingAfterBreak="0">
+  <w:abstractNum w:abstractNumId="33" w15:restartNumberingAfterBreak="0">
+    <w:nsid w:val="214D340A"/>
+    <w:multiLevelType w:val="multilevel"/>
+    <w:tmpl w:val="BCBCE796"/>
+    <w:lvl w:ilvl="0">
+      <w:start w:val="1"/>
+      <w:numFmt w:val="decimal"/>
+      <w:lvlText w:val="%1."/>
+      <w:lvlJc w:val="left"/>
+      <w:pPr>
+        <w:ind w:left="709" w:hanging="360"/>
+      </w:pPr>
+    </w:lvl>
+    <w:lvl w:ilvl="1">
+      <w:start w:val="1"/>
+      <w:numFmt w:val="lowerLetter"/>
+      <w:lvlText w:val="%2."/>
+      <w:lvlJc w:val="left"/>
+      <w:pPr>
+        <w:ind w:left="1429" w:hanging="360"/>
+      </w:pPr>
+    </w:lvl>
+    <w:lvl w:ilvl="2">
+      <w:start w:val="1"/>
+      <w:numFmt w:val="lowerRoman"/>
+      <w:lvlText w:val="%3."/>
+      <w:lvlJc w:val="right"/>
+      <w:pPr>
+        <w:ind w:left="2149" w:hanging="180"/>
+      </w:pPr>
+    </w:lvl>
+    <w:lvl w:ilvl="3">
+      <w:start w:val="1"/>
+      <w:numFmt w:val="decimal"/>
+      <w:lvlText w:val="%4."/>
+      <w:lvlJc w:val="left"/>
+      <w:pPr>
+        <w:ind w:left="2869" w:hanging="360"/>
+      </w:pPr>
+    </w:lvl>
+    <w:lvl w:ilvl="4">
+      <w:start w:val="1"/>
+      <w:numFmt w:val="lowerLetter"/>
+      <w:lvlText w:val="%5."/>
+      <w:lvlJc w:val="left"/>
+      <w:pPr>
+        <w:ind w:left="3589" w:hanging="360"/>
+      </w:pPr>
+    </w:lvl>
+    <w:lvl w:ilvl="5">
+      <w:start w:val="1"/>
+      <w:numFmt w:val="lowerRoman"/>
+      <w:lvlText w:val="%6."/>
+      <w:lvlJc w:val="right"/>
+      <w:pPr>
+        <w:ind w:left="4309" w:hanging="180"/>
+      </w:pPr>
+    </w:lvl>
+    <w:lvl w:ilvl="6">
+      <w:start w:val="1"/>
+      <w:numFmt w:val="decimal"/>
+      <w:lvlText w:val="%7."/>
+      <w:lvlJc w:val="left"/>
+      <w:pPr>
+        <w:ind w:left="5029" w:hanging="360"/>
+      </w:pPr>
+    </w:lvl>
+    <w:lvl w:ilvl="7">
+      <w:start w:val="1"/>
+      <w:numFmt w:val="lowerLetter"/>
+      <w:lvlText w:val="%8."/>
+      <w:lvlJc w:val="left"/>
+      <w:pPr>
+        <w:ind w:left="5749" w:hanging="360"/>
+      </w:pPr>
+    </w:lvl>
+    <w:lvl w:ilvl="8">
+      <w:start w:val="1"/>
+      <w:numFmt w:val="lowerRoman"/>
+      <w:lvlText w:val="%9."/>
+      <w:lvlJc w:val="right"/>
+      <w:pPr>
+        <w:ind w:left="6469" w:hanging="180"/>
+      </w:pPr>
+    </w:lvl>
+  </w:abstractNum>
+  <w:abstractNum w:abstractNumId="34" w15:restartNumberingAfterBreak="0">
     <w:nsid w:val="281154F3"/>
     <w:multiLevelType w:val="multilevel"/>
     <w:tmpl w:val="BCBCE796"/>
@@ -48101,7 +49409,7 @@
       </w:pPr>
     </w:lvl>
   </w:abstractNum>
-  <w:abstractNum w:abstractNumId="33" w15:restartNumberingAfterBreak="0">
+  <w:abstractNum w:abstractNumId="35" w15:restartNumberingAfterBreak="0">
     <w:nsid w:val="29295052"/>
     <w:multiLevelType w:val="hybridMultilevel"/>
     <w:tmpl w:val="4E385230"/>
@@ -48187,7 +49495,7 @@
       </w:pPr>
     </w:lvl>
   </w:abstractNum>
-  <w:abstractNum w:abstractNumId="34" w15:restartNumberingAfterBreak="0">
+  <w:abstractNum w:abstractNumId="36" w15:restartNumberingAfterBreak="0">
     <w:nsid w:val="2BED5D7D"/>
     <w:multiLevelType w:val="hybridMultilevel"/>
     <w:tmpl w:val="9AD8B90C"/>
@@ -48300,7 +49608,7 @@
       </w:rPr>
     </w:lvl>
   </w:abstractNum>
-  <w:abstractNum w:abstractNumId="35" w15:restartNumberingAfterBreak="0">
+  <w:abstractNum w:abstractNumId="37" w15:restartNumberingAfterBreak="0">
     <w:nsid w:val="2EA70700"/>
     <w:multiLevelType w:val="hybridMultilevel"/>
     <w:tmpl w:val="32728526"/>
@@ -48389,7 +49697,7 @@
       </w:pPr>
     </w:lvl>
   </w:abstractNum>
-  <w:abstractNum w:abstractNumId="36" w15:restartNumberingAfterBreak="0">
+  <w:abstractNum w:abstractNumId="38" w15:restartNumberingAfterBreak="0">
     <w:nsid w:val="301561E6"/>
     <w:multiLevelType w:val="hybridMultilevel"/>
     <w:tmpl w:val="8C8AFCD4"/>
@@ -48501,7 +49809,7 @@
       </w:rPr>
     </w:lvl>
   </w:abstractNum>
-  <w:abstractNum w:abstractNumId="37" w15:restartNumberingAfterBreak="0">
+  <w:abstractNum w:abstractNumId="39" w15:restartNumberingAfterBreak="0">
     <w:nsid w:val="30FE3FE0"/>
     <w:multiLevelType w:val="multilevel"/>
     <w:tmpl w:val="BCBCE796"/>
@@ -48587,7 +49895,7 @@
       </w:pPr>
     </w:lvl>
   </w:abstractNum>
-  <w:abstractNum w:abstractNumId="38" w15:restartNumberingAfterBreak="0">
+  <w:abstractNum w:abstractNumId="40" w15:restartNumberingAfterBreak="0">
     <w:nsid w:val="337837FD"/>
     <w:multiLevelType w:val="hybridMultilevel"/>
     <w:tmpl w:val="ADC840B0"/>
@@ -48676,7 +49984,7 @@
       </w:pPr>
     </w:lvl>
   </w:abstractNum>
-  <w:abstractNum w:abstractNumId="39" w15:restartNumberingAfterBreak="0">
+  <w:abstractNum w:abstractNumId="41" w15:restartNumberingAfterBreak="0">
     <w:nsid w:val="34A71A83"/>
     <w:multiLevelType w:val="hybridMultilevel"/>
     <w:tmpl w:val="9536D8B4"/>
@@ -48765,7 +50073,7 @@
       </w:pPr>
     </w:lvl>
   </w:abstractNum>
-  <w:abstractNum w:abstractNumId="40" w15:restartNumberingAfterBreak="0">
+  <w:abstractNum w:abstractNumId="42" w15:restartNumberingAfterBreak="0">
     <w:nsid w:val="363F0FE1"/>
     <w:multiLevelType w:val="hybridMultilevel"/>
     <w:tmpl w:val="C2607868"/>
@@ -48878,7 +50186,7 @@
       </w:rPr>
     </w:lvl>
   </w:abstractNum>
-  <w:abstractNum w:abstractNumId="41" w15:restartNumberingAfterBreak="0">
+  <w:abstractNum w:abstractNumId="43" w15:restartNumberingAfterBreak="0">
     <w:nsid w:val="37DA68D9"/>
     <w:multiLevelType w:val="multilevel"/>
     <w:tmpl w:val="DE32CF2C"/>
@@ -48990,7 +50298,7 @@
       </w:rPr>
     </w:lvl>
   </w:abstractNum>
-  <w:abstractNum w:abstractNumId="42" w15:restartNumberingAfterBreak="0">
+  <w:abstractNum w:abstractNumId="44" w15:restartNumberingAfterBreak="0">
     <w:nsid w:val="396E60DE"/>
     <w:multiLevelType w:val="multilevel"/>
     <w:tmpl w:val="BCBCE796"/>
@@ -49076,7 +50384,7 @@
       </w:pPr>
     </w:lvl>
   </w:abstractNum>
-  <w:abstractNum w:abstractNumId="43" w15:restartNumberingAfterBreak="0">
+  <w:abstractNum w:abstractNumId="45" w15:restartNumberingAfterBreak="0">
     <w:nsid w:val="3A72591D"/>
     <w:multiLevelType w:val="multilevel"/>
     <w:tmpl w:val="BCBCE796"/>
@@ -49162,7 +50470,7 @@
       </w:pPr>
     </w:lvl>
   </w:abstractNum>
-  <w:abstractNum w:abstractNumId="44" w15:restartNumberingAfterBreak="0">
+  <w:abstractNum w:abstractNumId="46" w15:restartNumberingAfterBreak="0">
     <w:nsid w:val="3B9C1183"/>
     <w:multiLevelType w:val="multilevel"/>
     <w:tmpl w:val="BCBCE796"/>
@@ -49248,7 +50556,7 @@
       </w:pPr>
     </w:lvl>
   </w:abstractNum>
-  <w:abstractNum w:abstractNumId="45" w15:restartNumberingAfterBreak="0">
+  <w:abstractNum w:abstractNumId="47" w15:restartNumberingAfterBreak="0">
     <w:nsid w:val="3C263778"/>
     <w:multiLevelType w:val="multilevel"/>
     <w:tmpl w:val="BCBCE796"/>
@@ -49334,7 +50642,7 @@
       </w:pPr>
     </w:lvl>
   </w:abstractNum>
-  <w:abstractNum w:abstractNumId="46" w15:restartNumberingAfterBreak="0">
+  <w:abstractNum w:abstractNumId="48" w15:restartNumberingAfterBreak="0">
     <w:nsid w:val="4134CF1A"/>
     <w:multiLevelType w:val="hybridMultilevel"/>
     <w:tmpl w:val="66DEBF48"/>
@@ -49447,7 +50755,7 @@
       </w:rPr>
     </w:lvl>
   </w:abstractNum>
-  <w:abstractNum w:abstractNumId="47" w15:restartNumberingAfterBreak="0">
+  <w:abstractNum w:abstractNumId="49" w15:restartNumberingAfterBreak="0">
     <w:nsid w:val="41F634D3"/>
     <w:multiLevelType w:val="multilevel"/>
     <w:tmpl w:val="BCBCE796"/>
@@ -49533,7 +50841,7 @@
       </w:pPr>
     </w:lvl>
   </w:abstractNum>
-  <w:abstractNum w:abstractNumId="48" w15:restartNumberingAfterBreak="0">
+  <w:abstractNum w:abstractNumId="50" w15:restartNumberingAfterBreak="0">
     <w:nsid w:val="42F31A3D"/>
     <w:multiLevelType w:val="hybridMultilevel"/>
     <w:tmpl w:val="E5E62C26"/>
@@ -49622,7 +50930,7 @@
       </w:pPr>
     </w:lvl>
   </w:abstractNum>
-  <w:abstractNum w:abstractNumId="49" w15:restartNumberingAfterBreak="0">
+  <w:abstractNum w:abstractNumId="51" w15:restartNumberingAfterBreak="0">
     <w:nsid w:val="43234944"/>
     <w:multiLevelType w:val="multilevel"/>
     <w:tmpl w:val="BCBCE796"/>
@@ -49708,7 +51016,7 @@
       </w:pPr>
     </w:lvl>
   </w:abstractNum>
-  <w:abstractNum w:abstractNumId="50" w15:restartNumberingAfterBreak="0">
+  <w:abstractNum w:abstractNumId="52" w15:restartNumberingAfterBreak="0">
     <w:nsid w:val="45337643"/>
     <w:multiLevelType w:val="multilevel"/>
     <w:tmpl w:val="BCBCE796"/>
@@ -49794,7 +51102,7 @@
       </w:pPr>
     </w:lvl>
   </w:abstractNum>
-  <w:abstractNum w:abstractNumId="51" w15:restartNumberingAfterBreak="0">
+  <w:abstractNum w:abstractNumId="53" w15:restartNumberingAfterBreak="0">
     <w:nsid w:val="476E7B9B"/>
     <w:multiLevelType w:val="hybridMultilevel"/>
     <w:tmpl w:val="A230BC2A"/>
@@ -49906,7 +51214,99 @@
       </w:rPr>
     </w:lvl>
   </w:abstractNum>
-  <w:abstractNum w:abstractNumId="52" w15:restartNumberingAfterBreak="0">
+  <w:abstractNum w:abstractNumId="54" w15:restartNumberingAfterBreak="0">
+    <w:nsid w:val="48122EEF"/>
+    <w:multiLevelType w:val="hybridMultilevel"/>
+    <w:tmpl w:val="5FF489AA"/>
+    <w:lvl w:ilvl="0" w:tplc="FFFFFFFF">
+      <w:start w:val="1"/>
+      <w:numFmt w:val="decimal"/>
+      <w:lvlText w:val="%1."/>
+      <w:lvlJc w:val="left"/>
+      <w:pPr>
+        <w:ind w:left="720" w:hanging="360"/>
+      </w:pPr>
+      <w:rPr>
+        <w:rFonts w:hint="default"/>
+      </w:rPr>
+    </w:lvl>
+    <w:lvl w:ilvl="1" w:tplc="FFFFFFFF">
+      <w:start w:val="1"/>
+      <w:numFmt w:val="bullet"/>
+      <w:lvlText w:val=""/>
+      <w:lvlJc w:val="left"/>
+      <w:pPr>
+        <w:ind w:left="1440" w:hanging="360"/>
+      </w:pPr>
+      <w:rPr>
+        <w:rFonts w:ascii="Symbol" w:hAnsi="Symbol" w:hint="default"/>
+      </w:rPr>
+    </w:lvl>
+    <w:lvl w:ilvl="2" w:tplc="FFFFFFFF">
+      <w:start w:val="1"/>
+      <w:numFmt w:val="lowerRoman"/>
+      <w:lvlText w:val="%3."/>
+      <w:lvlJc w:val="right"/>
+      <w:pPr>
+        <w:ind w:left="2160" w:hanging="180"/>
+      </w:pPr>
+    </w:lvl>
+    <w:lvl w:ilvl="3" w:tplc="FFFFFFFF" w:tentative="1">
+      <w:start w:val="1"/>
+      <w:numFmt w:val="decimal"/>
+      <w:lvlText w:val="%4."/>
+      <w:lvlJc w:val="left"/>
+      <w:pPr>
+        <w:ind w:left="2880" w:hanging="360"/>
+      </w:pPr>
+    </w:lvl>
+    <w:lvl w:ilvl="4" w:tplc="FFFFFFFF" w:tentative="1">
+      <w:start w:val="1"/>
+      <w:numFmt w:val="lowerLetter"/>
+      <w:lvlText w:val="%5."/>
+      <w:lvlJc w:val="left"/>
+      <w:pPr>
+        <w:ind w:left="3600" w:hanging="360"/>
+      </w:pPr>
+    </w:lvl>
+    <w:lvl w:ilvl="5" w:tplc="FFFFFFFF" w:tentative="1">
+      <w:start w:val="1"/>
+      <w:numFmt w:val="lowerRoman"/>
+      <w:lvlText w:val="%6."/>
+      <w:lvlJc w:val="right"/>
+      <w:pPr>
+        <w:ind w:left="4320" w:hanging="180"/>
+      </w:pPr>
+    </w:lvl>
+    <w:lvl w:ilvl="6" w:tplc="FFFFFFFF" w:tentative="1">
+      <w:start w:val="1"/>
+      <w:numFmt w:val="decimal"/>
+      <w:lvlText w:val="%7."/>
+      <w:lvlJc w:val="left"/>
+      <w:pPr>
+        <w:ind w:left="5040" w:hanging="360"/>
+      </w:pPr>
+    </w:lvl>
+    <w:lvl w:ilvl="7" w:tplc="FFFFFFFF" w:tentative="1">
+      <w:start w:val="1"/>
+      <w:numFmt w:val="lowerLetter"/>
+      <w:lvlText w:val="%8."/>
+      <w:lvlJc w:val="left"/>
+      <w:pPr>
+        <w:ind w:left="5760" w:hanging="360"/>
+      </w:pPr>
+    </w:lvl>
+    <w:lvl w:ilvl="8" w:tplc="FFFFFFFF" w:tentative="1">
+      <w:start w:val="1"/>
+      <w:numFmt w:val="lowerRoman"/>
+      <w:lvlText w:val="%9."/>
+      <w:lvlJc w:val="right"/>
+      <w:pPr>
+        <w:ind w:left="6480" w:hanging="180"/>
+      </w:pPr>
+    </w:lvl>
+  </w:abstractNum>
+  <w:abstractNum w:abstractNumId="55" w15:restartNumberingAfterBreak="0">
     <w:nsid w:val="486F7B71"/>
     <w:multiLevelType w:val="hybridMultilevel"/>
     <w:tmpl w:val="119E2AFA"/>
@@ -49995,7 +51395,7 @@
       </w:pPr>
     </w:lvl>
   </w:abstractNum>
-  <w:abstractNum w:abstractNumId="53" w15:restartNumberingAfterBreak="0">
+  <w:abstractNum w:abstractNumId="56" w15:restartNumberingAfterBreak="0">
     <w:nsid w:val="48C03565"/>
     <w:multiLevelType w:val="multilevel"/>
     <w:tmpl w:val="BCBCE796"/>
@@ -50081,7 +51481,7 @@
       </w:pPr>
     </w:lvl>
   </w:abstractNum>
-  <w:abstractNum w:abstractNumId="54" w15:restartNumberingAfterBreak="0">
+  <w:abstractNum w:abstractNumId="57" w15:restartNumberingAfterBreak="0">
     <w:nsid w:val="4C830503"/>
     <w:multiLevelType w:val="hybridMultilevel"/>
     <w:tmpl w:val="119E2AFA"/>
@@ -50170,7 +51570,7 @@
       </w:pPr>
     </w:lvl>
   </w:abstractNum>
-  <w:abstractNum w:abstractNumId="55" w15:restartNumberingAfterBreak="0">
+  <w:abstractNum w:abstractNumId="58" w15:restartNumberingAfterBreak="0">
     <w:nsid w:val="4E056422"/>
     <w:multiLevelType w:val="multilevel"/>
     <w:tmpl w:val="BCBCE796"/>
@@ -50256,7 +51656,7 @@
       </w:pPr>
     </w:lvl>
   </w:abstractNum>
-  <w:abstractNum w:abstractNumId="56" w15:restartNumberingAfterBreak="0">
+  <w:abstractNum w:abstractNumId="59" w15:restartNumberingAfterBreak="0">
     <w:nsid w:val="4E3F1F87"/>
     <w:multiLevelType w:val="multilevel"/>
     <w:tmpl w:val="A8929512"/>
@@ -50368,7 +51768,7 @@
       </w:rPr>
     </w:lvl>
   </w:abstractNum>
-  <w:abstractNum w:abstractNumId="57" w15:restartNumberingAfterBreak="0">
+  <w:abstractNum w:abstractNumId="60" w15:restartNumberingAfterBreak="0">
     <w:nsid w:val="4E6E1585"/>
     <w:multiLevelType w:val="multilevel"/>
     <w:tmpl w:val="BCBCE796"/>
@@ -50454,7 +51854,7 @@
       </w:pPr>
     </w:lvl>
   </w:abstractNum>
-  <w:abstractNum w:abstractNumId="58" w15:restartNumberingAfterBreak="0">
+  <w:abstractNum w:abstractNumId="61" w15:restartNumberingAfterBreak="0">
     <w:nsid w:val="52012DE0"/>
     <w:multiLevelType w:val="hybridMultilevel"/>
     <w:tmpl w:val="119E2AFA"/>
@@ -50543,7 +51943,7 @@
       </w:pPr>
     </w:lvl>
   </w:abstractNum>
-  <w:abstractNum w:abstractNumId="59" w15:restartNumberingAfterBreak="0">
+  <w:abstractNum w:abstractNumId="62" w15:restartNumberingAfterBreak="0">
     <w:nsid w:val="55FE429F"/>
     <w:multiLevelType w:val="multilevel"/>
     <w:tmpl w:val="BCBCE796"/>
@@ -50629,7 +52029,7 @@
       </w:pPr>
     </w:lvl>
   </w:abstractNum>
-  <w:abstractNum w:abstractNumId="60" w15:restartNumberingAfterBreak="0">
+  <w:abstractNum w:abstractNumId="63" w15:restartNumberingAfterBreak="0">
     <w:nsid w:val="56D870C4"/>
     <w:multiLevelType w:val="multilevel"/>
     <w:tmpl w:val="BCBCE796"/>
@@ -50715,7 +52115,7 @@
       </w:pPr>
     </w:lvl>
   </w:abstractNum>
-  <w:abstractNum w:abstractNumId="61" w15:restartNumberingAfterBreak="0">
+  <w:abstractNum w:abstractNumId="64" w15:restartNumberingAfterBreak="0">
     <w:nsid w:val="57CF6DC9"/>
     <w:multiLevelType w:val="multilevel"/>
     <w:tmpl w:val="BCBCE796"/>
@@ -50801,7 +52201,7 @@
       </w:pPr>
     </w:lvl>
   </w:abstractNum>
-  <w:abstractNum w:abstractNumId="62" w15:restartNumberingAfterBreak="0">
+  <w:abstractNum w:abstractNumId="65" w15:restartNumberingAfterBreak="0">
     <w:nsid w:val="58835672"/>
     <w:multiLevelType w:val="multilevel"/>
     <w:tmpl w:val="BCBCE796"/>
@@ -50887,7 +52287,7 @@
       </w:pPr>
     </w:lvl>
   </w:abstractNum>
-  <w:abstractNum w:abstractNumId="63" w15:restartNumberingAfterBreak="0">
+  <w:abstractNum w:abstractNumId="66" w15:restartNumberingAfterBreak="0">
     <w:nsid w:val="59A42BB6"/>
     <w:multiLevelType w:val="hybridMultilevel"/>
     <w:tmpl w:val="62E2E484"/>
@@ -50973,7 +52373,7 @@
       </w:pPr>
     </w:lvl>
   </w:abstractNum>
-  <w:abstractNum w:abstractNumId="64" w15:restartNumberingAfterBreak="0">
+  <w:abstractNum w:abstractNumId="67" w15:restartNumberingAfterBreak="0">
     <w:nsid w:val="5C057583"/>
     <w:multiLevelType w:val="multilevel"/>
     <w:tmpl w:val="BCBCE796"/>
@@ -51059,7 +52459,7 @@
       </w:pPr>
     </w:lvl>
   </w:abstractNum>
-  <w:abstractNum w:abstractNumId="65" w15:restartNumberingAfterBreak="0">
+  <w:abstractNum w:abstractNumId="68" w15:restartNumberingAfterBreak="0">
     <w:nsid w:val="5C365053"/>
     <w:multiLevelType w:val="multilevel"/>
     <w:tmpl w:val="BCBCE796"/>
@@ -51145,7 +52545,7 @@
       </w:pPr>
     </w:lvl>
   </w:abstractNum>
-  <w:abstractNum w:abstractNumId="66" w15:restartNumberingAfterBreak="0">
+  <w:abstractNum w:abstractNumId="69" w15:restartNumberingAfterBreak="0">
     <w:nsid w:val="5C5D19F9"/>
     <w:multiLevelType w:val="multilevel"/>
     <w:tmpl w:val="BCBCE796"/>
@@ -51231,7 +52631,7 @@
       </w:pPr>
     </w:lvl>
   </w:abstractNum>
-  <w:abstractNum w:abstractNumId="67" w15:restartNumberingAfterBreak="0">
+  <w:abstractNum w:abstractNumId="70" w15:restartNumberingAfterBreak="0">
     <w:nsid w:val="5FDE17AB"/>
     <w:multiLevelType w:val="hybridMultilevel"/>
     <w:tmpl w:val="119E2AFA"/>
@@ -51320,7 +52720,7 @@
       </w:pPr>
     </w:lvl>
   </w:abstractNum>
-  <w:abstractNum w:abstractNumId="68" w15:restartNumberingAfterBreak="0">
+  <w:abstractNum w:abstractNumId="71" w15:restartNumberingAfterBreak="0">
     <w:nsid w:val="622F7E77"/>
     <w:multiLevelType w:val="hybridMultilevel"/>
     <w:tmpl w:val="E35845CA"/>
@@ -51432,7 +52832,7 @@
       </w:rPr>
     </w:lvl>
   </w:abstractNum>
-  <w:abstractNum w:abstractNumId="69" w15:restartNumberingAfterBreak="0">
+  <w:abstractNum w:abstractNumId="72" w15:restartNumberingAfterBreak="0">
     <w:nsid w:val="62E70795"/>
     <w:multiLevelType w:val="multilevel"/>
     <w:tmpl w:val="BCBCE796"/>
@@ -51518,7 +52918,7 @@
       </w:pPr>
     </w:lvl>
   </w:abstractNum>
-  <w:abstractNum w:abstractNumId="70" w15:restartNumberingAfterBreak="0">
+  <w:abstractNum w:abstractNumId="73" w15:restartNumberingAfterBreak="0">
     <w:nsid w:val="645B313A"/>
     <w:multiLevelType w:val="hybridMultilevel"/>
     <w:tmpl w:val="119E2AFA"/>
@@ -51607,7 +53007,7 @@
       </w:pPr>
     </w:lvl>
   </w:abstractNum>
-  <w:abstractNum w:abstractNumId="71" w15:restartNumberingAfterBreak="0">
+  <w:abstractNum w:abstractNumId="74" w15:restartNumberingAfterBreak="0">
     <w:nsid w:val="67933679"/>
     <w:multiLevelType w:val="multilevel"/>
     <w:tmpl w:val="B6BA8AC6"/>
@@ -51719,7 +53119,7 @@
       </w:rPr>
     </w:lvl>
   </w:abstractNum>
-  <w:abstractNum w:abstractNumId="72" w15:restartNumberingAfterBreak="0">
+  <w:abstractNum w:abstractNumId="75" w15:restartNumberingAfterBreak="0">
     <w:nsid w:val="6AC0163E"/>
     <w:multiLevelType w:val="multilevel"/>
     <w:tmpl w:val="BCBCE796"/>
@@ -51805,7 +53205,7 @@
       </w:pPr>
     </w:lvl>
   </w:abstractNum>
-  <w:abstractNum w:abstractNumId="73" w15:restartNumberingAfterBreak="0">
+  <w:abstractNum w:abstractNumId="76" w15:restartNumberingAfterBreak="0">
     <w:nsid w:val="6AFF12DD"/>
     <w:multiLevelType w:val="hybridMultilevel"/>
     <w:tmpl w:val="119E2AFA"/>
@@ -51894,7 +53294,7 @@
       </w:pPr>
     </w:lvl>
   </w:abstractNum>
-  <w:abstractNum w:abstractNumId="74" w15:restartNumberingAfterBreak="0">
+  <w:abstractNum w:abstractNumId="77" w15:restartNumberingAfterBreak="0">
     <w:nsid w:val="6B416A28"/>
     <w:multiLevelType w:val="hybridMultilevel"/>
     <w:tmpl w:val="119E2AFA"/>
@@ -51983,7 +53383,7 @@
       </w:pPr>
     </w:lvl>
   </w:abstractNum>
-  <w:abstractNum w:abstractNumId="75" w15:restartNumberingAfterBreak="0">
+  <w:abstractNum w:abstractNumId="78" w15:restartNumberingAfterBreak="0">
     <w:nsid w:val="6F092528"/>
     <w:multiLevelType w:val="hybridMultilevel"/>
     <w:tmpl w:val="7438017E"/>
@@ -52096,7 +53496,7 @@
       </w:rPr>
     </w:lvl>
   </w:abstractNum>
-  <w:abstractNum w:abstractNumId="76" w15:restartNumberingAfterBreak="0">
+  <w:abstractNum w:abstractNumId="79" w15:restartNumberingAfterBreak="0">
     <w:nsid w:val="6F7D6889"/>
     <w:multiLevelType w:val="multilevel"/>
     <w:tmpl w:val="BCBCE796"/>
@@ -52182,7 +53582,7 @@
       </w:pPr>
     </w:lvl>
   </w:abstractNum>
-  <w:abstractNum w:abstractNumId="77" w15:restartNumberingAfterBreak="0">
+  <w:abstractNum w:abstractNumId="80" w15:restartNumberingAfterBreak="0">
     <w:nsid w:val="70374D1B"/>
     <w:multiLevelType w:val="multilevel"/>
     <w:tmpl w:val="BCBCE796"/>
@@ -52268,7 +53668,7 @@
       </w:pPr>
     </w:lvl>
   </w:abstractNum>
-  <w:abstractNum w:abstractNumId="78" w15:restartNumberingAfterBreak="0">
+  <w:abstractNum w:abstractNumId="81" w15:restartNumberingAfterBreak="0">
     <w:nsid w:val="70A82ADF"/>
     <w:multiLevelType w:val="multilevel"/>
     <w:tmpl w:val="BCBCE796"/>
@@ -52354,7 +53754,93 @@
       </w:pPr>
     </w:lvl>
   </w:abstractNum>
-  <w:abstractNum w:abstractNumId="79" w15:restartNumberingAfterBreak="0">
+  <w:abstractNum w:abstractNumId="82" w15:restartNumberingAfterBreak="0">
+    <w:nsid w:val="72F57C48"/>
+    <w:multiLevelType w:val="multilevel"/>
+    <w:tmpl w:val="BCBCE796"/>
+    <w:lvl w:ilvl="0">
+      <w:start w:val="1"/>
+      <w:numFmt w:val="decimal"/>
+      <w:lvlText w:val="%1."/>
+      <w:lvlJc w:val="left"/>
+      <w:pPr>
+        <w:ind w:left="709" w:hanging="360"/>
+      </w:pPr>
+    </w:lvl>
+    <w:lvl w:ilvl="1">
+      <w:start w:val="1"/>
+      <w:numFmt w:val="lowerLetter"/>
+      <w:lvlText w:val="%2."/>
+      <w:lvlJc w:val="left"/>
+      <w:pPr>
+        <w:ind w:left="1429" w:hanging="360"/>
+      </w:pPr>
+    </w:lvl>
+    <w:lvl w:ilvl="2">
+      <w:start w:val="1"/>
+      <w:numFmt w:val="lowerRoman"/>
+      <w:lvlText w:val="%3."/>
+      <w:lvlJc w:val="right"/>
+      <w:pPr>
+        <w:ind w:left="2149" w:hanging="180"/>
+      </w:pPr>
+    </w:lvl>
+    <w:lvl w:ilvl="3">
+      <w:start w:val="1"/>
+      <w:numFmt w:val="decimal"/>
+      <w:lvlText w:val="%4."/>
+      <w:lvlJc w:val="left"/>
+      <w:pPr>
+        <w:ind w:left="2869" w:hanging="360"/>
+      </w:pPr>
+    </w:lvl>
+    <w:lvl w:ilvl="4">
+      <w:start w:val="1"/>
+      <w:numFmt w:val="lowerLetter"/>
+      <w:lvlText w:val="%5."/>
+      <w:lvlJc w:val="left"/>
+      <w:pPr>
+        <w:ind w:left="3589" w:hanging="360"/>
+      </w:pPr>
+    </w:lvl>
+    <w:lvl w:ilvl="5">
+      <w:start w:val="1"/>
+      <w:numFmt w:val="lowerRoman"/>
+      <w:lvlText w:val="%6."/>
+      <w:lvlJc w:val="right"/>
+      <w:pPr>
+        <w:ind w:left="4309" w:hanging="180"/>
+      </w:pPr>
+    </w:lvl>
+    <w:lvl w:ilvl="6">
+      <w:start w:val="1"/>
+      <w:numFmt w:val="decimal"/>
+      <w:lvlText w:val="%7."/>
+      <w:lvlJc w:val="left"/>
+      <w:pPr>
+        <w:ind w:left="5029" w:hanging="360"/>
+      </w:pPr>
+    </w:lvl>
+    <w:lvl w:ilvl="7">
+      <w:start w:val="1"/>
+      <w:numFmt w:val="lowerLetter"/>
+      <w:lvlText w:val="%8."/>
+      <w:lvlJc w:val="left"/>
+      <w:pPr>
+        <w:ind w:left="5749" w:hanging="360"/>
+      </w:pPr>
+    </w:lvl>
+    <w:lvl w:ilvl="8">
+      <w:start w:val="1"/>
+      <w:numFmt w:val="lowerRoman"/>
+      <w:lvlText w:val="%9."/>
+      <w:lvlJc w:val="right"/>
+      <w:pPr>
+        <w:ind w:left="6469" w:hanging="180"/>
+      </w:pPr>
+    </w:lvl>
+  </w:abstractNum>
+  <w:abstractNum w:abstractNumId="83" w15:restartNumberingAfterBreak="0">
     <w:nsid w:val="74314063"/>
     <w:multiLevelType w:val="multilevel"/>
     <w:tmpl w:val="BCBCE796"/>
@@ -52440,7 +53926,7 @@
       </w:pPr>
     </w:lvl>
   </w:abstractNum>
-  <w:abstractNum w:abstractNumId="80" w15:restartNumberingAfterBreak="0">
+  <w:abstractNum w:abstractNumId="84" w15:restartNumberingAfterBreak="0">
     <w:nsid w:val="79405FEA"/>
     <w:multiLevelType w:val="multilevel"/>
     <w:tmpl w:val="37589D72"/>
@@ -52553,7 +54039,7 @@
       </w:rPr>
     </w:lvl>
   </w:abstractNum>
-  <w:abstractNum w:abstractNumId="81" w15:restartNumberingAfterBreak="0">
+  <w:abstractNum w:abstractNumId="85" w15:restartNumberingAfterBreak="0">
     <w:nsid w:val="7EF00DEA"/>
     <w:multiLevelType w:val="multilevel"/>
     <w:tmpl w:val="BCBCE796"/>
@@ -52640,25 +54126,25 @@
     </w:lvl>
   </w:abstractNum>
   <w:num w:numId="1" w16cid:durableId="1735929182">
-    <w:abstractNumId w:val="26"/>
+    <w:abstractNumId w:val="27"/>
   </w:num>
   <w:num w:numId="2" w16cid:durableId="941641874">
-    <w:abstractNumId w:val="46"/>
+    <w:abstractNumId w:val="48"/>
   </w:num>
   <w:num w:numId="3" w16cid:durableId="1327005597">
-    <w:abstractNumId w:val="30"/>
+    <w:abstractNumId w:val="31"/>
   </w:num>
   <w:num w:numId="4" w16cid:durableId="1176534514">
-    <w:abstractNumId w:val="75"/>
+    <w:abstractNumId w:val="78"/>
   </w:num>
   <w:num w:numId="5" w16cid:durableId="644049740">
-    <w:abstractNumId w:val="48"/>
+    <w:abstractNumId w:val="50"/>
   </w:num>
   <w:num w:numId="6" w16cid:durableId="1000691270">
-    <w:abstractNumId w:val="31"/>
+    <w:abstractNumId w:val="32"/>
   </w:num>
   <w:num w:numId="7" w16cid:durableId="1016999726">
-    <w:abstractNumId w:val="31"/>
+    <w:abstractNumId w:val="32"/>
     <w:lvlOverride w:ilvl="0">
       <w:startOverride w:val="1"/>
     </w:lvlOverride>
@@ -52688,220 +54174,232 @@
     </w:lvlOverride>
   </w:num>
   <w:num w:numId="8" w16cid:durableId="1748529093">
-    <w:abstractNumId w:val="68"/>
+    <w:abstractNumId w:val="71"/>
   </w:num>
   <w:num w:numId="9" w16cid:durableId="13771043">
+    <w:abstractNumId w:val="38"/>
+  </w:num>
+  <w:num w:numId="10" w16cid:durableId="1222715115">
+    <w:abstractNumId w:val="40"/>
+  </w:num>
+  <w:num w:numId="11" w16cid:durableId="659772123">
+    <w:abstractNumId w:val="21"/>
+  </w:num>
+  <w:num w:numId="12" w16cid:durableId="994068644">
     <w:abstractNumId w:val="36"/>
   </w:num>
-  <w:num w:numId="10" w16cid:durableId="1222715115">
-    <w:abstractNumId w:val="38"/>
-  </w:num>
-  <w:num w:numId="11" w16cid:durableId="659772123">
-    <w:abstractNumId w:val="20"/>
-  </w:num>
-  <w:num w:numId="12" w16cid:durableId="994068644">
-    <w:abstractNumId w:val="34"/>
-  </w:num>
   <w:num w:numId="13" w16cid:durableId="722170864">
-    <w:abstractNumId w:val="9"/>
+    <w:abstractNumId w:val="10"/>
   </w:num>
   <w:num w:numId="14" w16cid:durableId="1063065823">
-    <w:abstractNumId w:val="59"/>
+    <w:abstractNumId w:val="62"/>
   </w:num>
   <w:num w:numId="15" w16cid:durableId="1892186575">
-    <w:abstractNumId w:val="49"/>
+    <w:abstractNumId w:val="51"/>
   </w:num>
   <w:num w:numId="16" w16cid:durableId="1775709375">
-    <w:abstractNumId w:val="81"/>
+    <w:abstractNumId w:val="85"/>
   </w:num>
   <w:num w:numId="17" w16cid:durableId="1294870951">
-    <w:abstractNumId w:val="33"/>
+    <w:abstractNumId w:val="35"/>
   </w:num>
   <w:num w:numId="18" w16cid:durableId="1582979918">
-    <w:abstractNumId w:val="28"/>
+    <w:abstractNumId w:val="29"/>
   </w:num>
   <w:num w:numId="19" w16cid:durableId="677318461">
-    <w:abstractNumId w:val="12"/>
+    <w:abstractNumId w:val="13"/>
   </w:num>
   <w:num w:numId="20" w16cid:durableId="1121727194">
     <w:abstractNumId w:val="4"/>
   </w:num>
   <w:num w:numId="21" w16cid:durableId="782111121">
-    <w:abstractNumId w:val="32"/>
+    <w:abstractNumId w:val="34"/>
   </w:num>
   <w:num w:numId="22" w16cid:durableId="1185825051">
-    <w:abstractNumId w:val="63"/>
+    <w:abstractNumId w:val="66"/>
   </w:num>
   <w:num w:numId="23" w16cid:durableId="918830947">
-    <w:abstractNumId w:val="65"/>
+    <w:abstractNumId w:val="68"/>
   </w:num>
   <w:num w:numId="24" w16cid:durableId="914898703">
-    <w:abstractNumId w:val="15"/>
+    <w:abstractNumId w:val="16"/>
   </w:num>
   <w:num w:numId="25" w16cid:durableId="1501504133">
+    <w:abstractNumId w:val="84"/>
+  </w:num>
+  <w:num w:numId="26" w16cid:durableId="1407996080">
+    <w:abstractNumId w:val="53"/>
+  </w:num>
+  <w:num w:numId="27" w16cid:durableId="2118913935">
+    <w:abstractNumId w:val="30"/>
+  </w:num>
+  <w:num w:numId="28" w16cid:durableId="1309284589">
+    <w:abstractNumId w:val="83"/>
+  </w:num>
+  <w:num w:numId="29" w16cid:durableId="2076273062">
+    <w:abstractNumId w:val="25"/>
+  </w:num>
+  <w:num w:numId="30" w16cid:durableId="1487939723">
+    <w:abstractNumId w:val="26"/>
+  </w:num>
+  <w:num w:numId="31" w16cid:durableId="864441712">
+    <w:abstractNumId w:val="22"/>
+  </w:num>
+  <w:num w:numId="32" w16cid:durableId="548341859">
+    <w:abstractNumId w:val="74"/>
+  </w:num>
+  <w:num w:numId="33" w16cid:durableId="622342311">
+    <w:abstractNumId w:val="79"/>
+  </w:num>
+  <w:num w:numId="34" w16cid:durableId="1886289631">
+    <w:abstractNumId w:val="44"/>
+  </w:num>
+  <w:num w:numId="35" w16cid:durableId="1993556631">
+    <w:abstractNumId w:val="81"/>
+  </w:num>
+  <w:num w:numId="36" w16cid:durableId="257715126">
+    <w:abstractNumId w:val="56"/>
+  </w:num>
+  <w:num w:numId="37" w16cid:durableId="1426149257">
     <w:abstractNumId w:val="80"/>
   </w:num>
-  <w:num w:numId="26" w16cid:durableId="1407996080">
-    <w:abstractNumId w:val="51"/>
-  </w:num>
-  <w:num w:numId="27" w16cid:durableId="2118913935">
-    <w:abstractNumId w:val="29"/>
-  </w:num>
-  <w:num w:numId="28" w16cid:durableId="1309284589">
-    <w:abstractNumId w:val="79"/>
-  </w:num>
-  <w:num w:numId="29" w16cid:durableId="2076273062">
-    <w:abstractNumId w:val="24"/>
-  </w:num>
-  <w:num w:numId="30" w16cid:durableId="1487939723">
-    <w:abstractNumId w:val="25"/>
-  </w:num>
-  <w:num w:numId="31" w16cid:durableId="864441712">
-    <w:abstractNumId w:val="21"/>
-  </w:num>
-  <w:num w:numId="32" w16cid:durableId="548341859">
-    <w:abstractNumId w:val="71"/>
-  </w:num>
-  <w:num w:numId="33" w16cid:durableId="622342311">
-    <w:abstractNumId w:val="76"/>
-  </w:num>
-  <w:num w:numId="34" w16cid:durableId="1886289631">
-    <w:abstractNumId w:val="42"/>
-  </w:num>
-  <w:num w:numId="35" w16cid:durableId="1993556631">
-    <w:abstractNumId w:val="78"/>
-  </w:num>
-  <w:num w:numId="36" w16cid:durableId="257715126">
-    <w:abstractNumId w:val="53"/>
-  </w:num>
-  <w:num w:numId="37" w16cid:durableId="1426149257">
-    <w:abstractNumId w:val="77"/>
-  </w:num>
   <w:num w:numId="38" w16cid:durableId="491796650">
-    <w:abstractNumId w:val="66"/>
+    <w:abstractNumId w:val="69"/>
   </w:num>
   <w:num w:numId="39" w16cid:durableId="115485265">
-    <w:abstractNumId w:val="64"/>
+    <w:abstractNumId w:val="67"/>
   </w:num>
   <w:num w:numId="40" w16cid:durableId="1861121929">
     <w:abstractNumId w:val="5"/>
   </w:num>
   <w:num w:numId="41" w16cid:durableId="1173256708">
-    <w:abstractNumId w:val="47"/>
+    <w:abstractNumId w:val="49"/>
   </w:num>
   <w:num w:numId="42" w16cid:durableId="1450002811">
-    <w:abstractNumId w:val="16"/>
+    <w:abstractNumId w:val="17"/>
   </w:num>
   <w:num w:numId="43" w16cid:durableId="664776">
+    <w:abstractNumId w:val="64"/>
+  </w:num>
+  <w:num w:numId="44" w16cid:durableId="1287155047">
+    <w:abstractNumId w:val="37"/>
+  </w:num>
+  <w:num w:numId="45" w16cid:durableId="2053534155">
+    <w:abstractNumId w:val="43"/>
+  </w:num>
+  <w:num w:numId="46" w16cid:durableId="809592266">
+    <w:abstractNumId w:val="59"/>
+  </w:num>
+  <w:num w:numId="47" w16cid:durableId="329916628">
+    <w:abstractNumId w:val="42"/>
+  </w:num>
+  <w:num w:numId="48" w16cid:durableId="1061901349">
+    <w:abstractNumId w:val="23"/>
+  </w:num>
+  <w:num w:numId="49" w16cid:durableId="823858952">
     <w:abstractNumId w:val="61"/>
   </w:num>
-  <w:num w:numId="44" w16cid:durableId="1287155047">
-    <w:abstractNumId w:val="35"/>
-  </w:num>
-  <w:num w:numId="45" w16cid:durableId="2053534155">
+  <w:num w:numId="50" w16cid:durableId="352878034">
     <w:abstractNumId w:val="41"/>
   </w:num>
-  <w:num w:numId="46" w16cid:durableId="809592266">
-    <w:abstractNumId w:val="56"/>
-  </w:num>
-  <w:num w:numId="47" w16cid:durableId="329916628">
-    <w:abstractNumId w:val="40"/>
-  </w:num>
-  <w:num w:numId="48" w16cid:durableId="1061901349">
-    <w:abstractNumId w:val="22"/>
-  </w:num>
-  <w:num w:numId="49" w16cid:durableId="823858952">
-    <w:abstractNumId w:val="58"/>
-  </w:num>
-  <w:num w:numId="50" w16cid:durableId="352878034">
-    <w:abstractNumId w:val="39"/>
-  </w:num>
   <w:num w:numId="51" w16cid:durableId="1664315735">
-    <w:abstractNumId w:val="73"/>
+    <w:abstractNumId w:val="76"/>
   </w:num>
   <w:num w:numId="52" w16cid:durableId="851183525">
-    <w:abstractNumId w:val="67"/>
+    <w:abstractNumId w:val="70"/>
   </w:num>
   <w:num w:numId="53" w16cid:durableId="1854882212">
-    <w:abstractNumId w:val="17"/>
+    <w:abstractNumId w:val="18"/>
   </w:num>
   <w:num w:numId="54" w16cid:durableId="1849366423">
-    <w:abstractNumId w:val="54"/>
+    <w:abstractNumId w:val="57"/>
   </w:num>
   <w:num w:numId="55" w16cid:durableId="1696075619">
-    <w:abstractNumId w:val="52"/>
+    <w:abstractNumId w:val="55"/>
   </w:num>
   <w:num w:numId="56" w16cid:durableId="1020476724">
-    <w:abstractNumId w:val="10"/>
+    <w:abstractNumId w:val="11"/>
   </w:num>
   <w:num w:numId="57" w16cid:durableId="595138230">
     <w:abstractNumId w:val="7"/>
   </w:num>
   <w:num w:numId="58" w16cid:durableId="381944635">
-    <w:abstractNumId w:val="62"/>
+    <w:abstractNumId w:val="65"/>
   </w:num>
   <w:num w:numId="59" w16cid:durableId="179901981">
     <w:abstractNumId w:val="8"/>
   </w:num>
   <w:num w:numId="60" w16cid:durableId="774792174">
-    <w:abstractNumId w:val="45"/>
+    <w:abstractNumId w:val="47"/>
   </w:num>
   <w:num w:numId="61" w16cid:durableId="1747874773">
     <w:abstractNumId w:val="6"/>
   </w:num>
   <w:num w:numId="62" w16cid:durableId="993991772">
+    <w:abstractNumId w:val="20"/>
+  </w:num>
+  <w:num w:numId="63" w16cid:durableId="4554285">
+    <w:abstractNumId w:val="75"/>
+  </w:num>
+  <w:num w:numId="64" w16cid:durableId="875436079">
+    <w:abstractNumId w:val="73"/>
+  </w:num>
+  <w:num w:numId="65" w16cid:durableId="1446922817">
+    <w:abstractNumId w:val="77"/>
+  </w:num>
+  <w:num w:numId="66" w16cid:durableId="1997300366">
+    <w:abstractNumId w:val="15"/>
+  </w:num>
+  <w:num w:numId="67" w16cid:durableId="2023436685">
     <w:abstractNumId w:val="19"/>
   </w:num>
-  <w:num w:numId="63" w16cid:durableId="4554285">
+  <w:num w:numId="68" w16cid:durableId="447436517">
+    <w:abstractNumId w:val="28"/>
+  </w:num>
+  <w:num w:numId="69" w16cid:durableId="1216157020">
+    <w:abstractNumId w:val="58"/>
+  </w:num>
+  <w:num w:numId="70" w16cid:durableId="527066423">
+    <w:abstractNumId w:val="24"/>
+  </w:num>
+  <w:num w:numId="71" w16cid:durableId="1976569088">
+    <w:abstractNumId w:val="14"/>
+  </w:num>
+  <w:num w:numId="72" w16cid:durableId="1707413795">
+    <w:abstractNumId w:val="12"/>
+  </w:num>
+  <w:num w:numId="73" w16cid:durableId="57752014">
+    <w:abstractNumId w:val="45"/>
+  </w:num>
+  <w:num w:numId="74" w16cid:durableId="1756390221">
+    <w:abstractNumId w:val="63"/>
+  </w:num>
+  <w:num w:numId="75" w16cid:durableId="51081546">
     <w:abstractNumId w:val="72"/>
   </w:num>
-  <w:num w:numId="64" w16cid:durableId="875436079">
-    <w:abstractNumId w:val="70"/>
+  <w:num w:numId="76" w16cid:durableId="696780458">
+    <w:abstractNumId w:val="52"/>
   </w:num>
-  <w:num w:numId="65" w16cid:durableId="1446922817">
-    <w:abstractNumId w:val="74"/>
-  </w:num>
-  <w:num w:numId="66" w16cid:durableId="1997300366">
-    <w:abstractNumId w:val="14"/>
-  </w:num>
-  <w:num w:numId="67" w16cid:durableId="2023436685">
-    <w:abstractNumId w:val="18"/>
-  </w:num>
-  <w:num w:numId="68" w16cid:durableId="447436517">
-    <w:abstractNumId w:val="27"/>
-  </w:num>
-  <w:num w:numId="69" w16cid:durableId="1216157020">
-    <w:abstractNumId w:val="55"/>
-  </w:num>
-  <w:num w:numId="70" w16cid:durableId="527066423">
-    <w:abstractNumId w:val="23"/>
-  </w:num>
-  <w:num w:numId="71" w16cid:durableId="1976569088">
-    <w:abstractNumId w:val="13"/>
-  </w:num>
-  <w:num w:numId="72" w16cid:durableId="1707413795">
-    <w:abstractNumId w:val="11"/>
-  </w:num>
-  <w:num w:numId="73" w16cid:durableId="57752014">
-    <w:abstractNumId w:val="43"/>
-  </w:num>
-  <w:num w:numId="74" w16cid:durableId="1756390221">
+  <w:num w:numId="77" w16cid:durableId="950748160">
     <w:abstractNumId w:val="60"/>
   </w:num>
-  <w:num w:numId="75" w16cid:durableId="51081546">
-    <w:abstractNumId w:val="69"/>
-  </w:num>
-  <w:num w:numId="76" w16cid:durableId="696780458">
-    <w:abstractNumId w:val="50"/>
-  </w:num>
-  <w:num w:numId="77" w16cid:durableId="950748160">
-    <w:abstractNumId w:val="57"/>
-  </w:num>
   <w:num w:numId="78" w16cid:durableId="254829206">
-    <w:abstractNumId w:val="44"/>
+    <w:abstractNumId w:val="46"/>
   </w:num>
   <w:num w:numId="79" w16cid:durableId="622736909">
-    <w:abstractNumId w:val="37"/>
+    <w:abstractNumId w:val="39"/>
+  </w:num>
+  <w:num w:numId="80" w16cid:durableId="1202093336">
+    <w:abstractNumId w:val="54"/>
+  </w:num>
+  <w:num w:numId="81" w16cid:durableId="1974292193">
+    <w:abstractNumId w:val="9"/>
+  </w:num>
+  <w:num w:numId="82" w16cid:durableId="1011641840">
+    <w:abstractNumId w:val="82"/>
+  </w:num>
+  <w:num w:numId="83" w16cid:durableId="352347399">
+    <w:abstractNumId w:val="33"/>
   </w:num>
   <w:numIdMacAtCleanup w:val="79"/>
 </w:numbering>

</xml_diff>